<commit_message>
CR-021 phase 4: the Getting Started guide on markup compatibility - what Word writes twice, what docx4j keeps and draws, the property, and a traversal's one branch; the CR closed
The "Specification versions" paragraph that said a saved docx loses Word
2010 content is rewritten; a "Markup compatibility (mc:AlternateContent)"
paragraph follows it; "Traversing a document" closes with the READ default
and McMode.ALL for a callback that edits; "Text extraction" gains its
sentence. The canonical docx was edited with docx4j and the derived md,
html and pdf regenerated with etc/GenGettingStartedDocs.java (the md also
shows the markdown exporter's recent changes - TOC entries dropped, code
fenced - for the first time on this document).

CR-021 is done: §8.10 and the status line; what it leaves for other CRs is
listed in §8.6.

Co-Authored-By: Claude Fable 5.1 <noreply@anthropic.com>
</commit_message>
<xml_diff>
--- a/docs/Docx4j_GettingStarted.docx
+++ b/docs/Docx4j_GettingStarted.docx
@@ -1,8 +1,8 @@
 
 <file path=word/document.xml><?xml version="1.0" encoding="utf-8"?>
-<w:document xmlns:w="http://schemas.openxmlformats.org/wordprocessingml/2006/main" xmlns:w14="http://schemas.microsoft.com/office/word/2010/wordml" xmlns:w15="http://schemas.microsoft.com/office/word/2012/wordml" xmlns:r="http://schemas.openxmlformats.org/officeDocument/2006/relationships" xmlns:m="http://schemas.openxmlformats.org/officeDocument/2006/math" xmlns:wp="http://schemas.openxmlformats.org/drawingml/2006/wordprocessingDrawing" xmlns:a="http://schemas.openxmlformats.org/drawingml/2006/main" xmlns:wp14="http://schemas.microsoft.com/office/word/2010/wordprocessingDrawing" xmlns:mc="http://schemas.openxmlformats.org/markup-compatibility/2006" xmlns:a14="http://schemas.microsoft.com/office/drawing/2010/main" xmlns:sl="http://schemas.openxmlformats.org/schemaLibrary/2006/main" xmlns:wne="http://schemas.microsoft.com/office/word/2006/wordml" xmlns:c="http://schemas.openxmlformats.org/drawingml/2006/chart" xmlns:cdr="http://schemas.openxmlformats.org/drawingml/2006/chartDrawing" xmlns:c14="http://schemas.microsoft.com/office/drawing/2007/8/2/chart" xmlns:dgm="http://schemas.openxmlformats.org/drawingml/2006/diagram" xmlns:pic="http://schemas.openxmlformats.org/drawingml/2006/picture" xmlns:xdr="http://schemas.openxmlformats.org/drawingml/2006/spreadsheetDrawing" xmlns:dsp="http://schemas.microsoft.com/office/drawing/2008/diagram" xmlns:o="urn:schemas-microsoft-com:office:office" xmlns:v="urn:schemas-microsoft-com:vml" xmlns:w10="urn:schemas-microsoft-com:office:word" xmlns:xvml="urn:schemas-microsoft-com:office:excel" xmlns:pvml="urn:schemas-microsoft-com:office:powerpoint" xmlns:ns25="urn:docx4j:vml:root" xmlns:cppr="http://schemas.microsoft.com/office/2006/coverPageProps" xmlns:odx="http://opendope.org/xpaths" xmlns:odc="http://opendope.org/conditions" xmlns:odq="http://opendope.org/questions" xmlns:oda="http://opendope.org/answers" xmlns:odi="http://opendope.org/components" xmlns:odgm="http://opendope.org/SmartArt/DataHierarchy" xmlns:b="http://schemas.openxmlformats.org/officeDocument/2006/bibliography" xmlns:msink="http://schemas.microsoft.com/ink/2010/main" xmlns:cdr14="http://schemas.microsoft.com/office/drawing/2010/chartDrawing" xmlns:c15="http://schemas.microsoft.com/office/drawing/2012/chart" xmlns:cs="http://schemas.microsoft.com/office/drawing/2012/chartStyle" xmlns:ns38="http://www.w3.org/1998/Math/MathML" xmlns:ns39="http://www.w3.org/2003/InkML" xmlns:a13cmd="http://schemas.microsoft.com/office/drawing/2013/main/command" xmlns:cx="http://schemas.microsoft.com/office/drawing/2014/chartex" xmlns:c16="http://schemas.microsoft.com/office/drawing/2014/chart" xmlns:dgm1611="http://schemas.microsoft.com/office/drawing/2016/11/diagram" xmlns:c173="http://schemas.microsoft.com/office/drawing/2017/03/chart" xmlns:am3d="http://schemas.microsoft.com/office/drawing/2017/model3d" xmlns:an18="http://schemas.microsoft.com/office/drawing/2018/animation" xmlns:anam3d="http://schemas.microsoft.com/office/drawing/2018/animation/model3d" xmlns:iact="http://schemas.microsoft.com/office/powerpoint/2014/inkAction" xmlns:thm15="http://schemas.microsoft.com/office/thememl/2012/main" xmlns:wps="http://schemas.microsoft.com/office/word/2010/wordprocessingShape" xmlns:wpc="http://schemas.microsoft.com/office/word/2010/wordprocessingCanvas" xmlns:wpg="http://schemas.microsoft.com/office/word/2010/wordprocessingGroup" xmlns:w16se="http://schemas.microsoft.com/office/word/2015/wordml/symex" xmlns:w16cid="http://schemas.microsoft.com/office/word/2016/wordml/cid" xmlns:wetp="http://schemas.microsoft.com/office/webextensions/taskpanes/2010/11" xmlns:we="http://schemas.microsoft.com/office/webextensions/webextension/2010/11" xmlns:comp="http://schemas.openxmlformats.org/drawingml/2006/compatibility" xmlns:lc="http://schemas.openxmlformats.org/drawingml/2006/lockedCanvas" xmlns:dgm14="http://schemas.microsoft.com/office/drawing/2010/diagram" xmlns:a15="http://schemas.microsoft.com/office/drawing/2012/main" xmlns:pic14="http://schemas.microsoft.com/office/drawing/2010/picture" xmlns:c16ac="http://schemas.microsoft.com/office/drawing/2014/chart/ac" xmlns:a16="http://schemas.microsoft.com/office/drawing/2014/main" xmlns:a1611="http://schemas.microsoft.com/office/drawing/2016/11/main" xmlns:dgm1612="http://schemas.microsoft.com/office/drawing/2016/12/diagram" xmlns:a16svg="http://schemas.microsoft.com/office/drawing/2016/SVG/main" xmlns:adec="http://schemas.microsoft.com/office/drawing/2017/decorative" xmlns:a18hc="http://schemas.microsoft.com/office/drawing/2018/hyperlinkcolor" xmlns:wp15="http://schemas.microsoft.com/office/word/2012/wordprocessingDrawing" xmlns:w16cex="http://schemas.microsoft.com/office/word/2018/wordml/cex" xmlns:w16sdtfl="http://schemas.microsoft.com/office/word/2024/wordml/sdtformatlock" xmlns:w16sdtdh="http://schemas.microsoft.com/office/word/2020/wordml/sdtdatahash" xmlns:w16="http://schemas.microsoft.com/office/word/2018/wordml" xmlns:w16du="http://schemas.microsoft.com/office/word/2023/wordml/word16du" mc:Ignorable="w14 w15 w16se w16cid w16 w16cex w16sdtdh w16sdtfl w16du wp14">
+<w:document xmlns:m="http://schemas.openxmlformats.org/officeDocument/2006/math" xmlns:w="http://schemas.openxmlformats.org/wordprocessingml/2006/main" xmlns:w14="http://schemas.microsoft.com/office/word/2010/wordml" xmlns:r="http://schemas.openxmlformats.org/officeDocument/2006/relationships" xmlns:wp="http://schemas.openxmlformats.org/drawingml/2006/wordprocessingDrawing" xmlns:a="http://schemas.openxmlformats.org/drawingml/2006/main" xmlns:wp14="http://schemas.microsoft.com/office/word/2010/wordprocessingDrawing" xmlns:mc="http://schemas.openxmlformats.org/markup-compatibility/2006" xmlns:w15="http://schemas.microsoft.com/office/word/2012/wordml" xmlns:a14="http://schemas.microsoft.com/office/drawing/2010/main" xmlns:sl="http://schemas.openxmlformats.org/schemaLibrary/2006/main" xmlns:wne="http://schemas.microsoft.com/office/word/2006/wordml" xmlns:c="http://schemas.openxmlformats.org/drawingml/2006/chart" xmlns:cdr="http://schemas.openxmlformats.org/drawingml/2006/chartDrawing" xmlns:c14="http://schemas.microsoft.com/office/drawing/2007/8/2/chart" xmlns:dgm="http://schemas.openxmlformats.org/drawingml/2006/diagram" xmlns:pic="http://schemas.openxmlformats.org/drawingml/2006/picture" xmlns:xdr="http://schemas.openxmlformats.org/drawingml/2006/spreadsheetDrawing" xmlns:dsp="http://schemas.microsoft.com/office/drawing/2008/diagram" xmlns:o="urn:schemas-microsoft-com:office:office" xmlns:v="urn:schemas-microsoft-com:vml" xmlns:w10="urn:schemas-microsoft-com:office:word" xmlns:xvml="urn:schemas-microsoft-com:office:excel" xmlns:pvml="urn:schemas-microsoft-com:office:powerpoint" xmlns:ns25="urn:docx4j:vml:root" xmlns:cppr="http://schemas.microsoft.com/office/2006/coverPageProps" xmlns:odx="http://opendope.org/xpaths" xmlns:odc="http://opendope.org/conditions" xmlns:odq="http://opendope.org/questions" xmlns:oda="http://opendope.org/answers" xmlns:odi="http://opendope.org/components" xmlns:odgm="http://opendope.org/SmartArt/DataHierarchy" xmlns:b="http://schemas.openxmlformats.org/officeDocument/2006/bibliography" xmlns:msink="http://schemas.microsoft.com/ink/2010/main" xmlns:cdr14="http://schemas.microsoft.com/office/drawing/2010/chartDrawing" xmlns:c15="http://schemas.microsoft.com/office/drawing/2012/chart" xmlns:cs="http://schemas.microsoft.com/office/drawing/2012/chartStyle" xmlns:ns38="http://www.w3.org/1998/Math/MathML" xmlns:ns39="http://www.w3.org/2003/InkML" xmlns:a13cmd="http://schemas.microsoft.com/office/drawing/2013/main/command" xmlns:cx="http://schemas.microsoft.com/office/drawing/2014/chartex" xmlns:c16="http://schemas.microsoft.com/office/drawing/2014/chart" xmlns:dgm1611="http://schemas.microsoft.com/office/drawing/2016/11/diagram" xmlns:c173="http://schemas.microsoft.com/office/drawing/2017/03/chart" xmlns:am3d="http://schemas.microsoft.com/office/drawing/2017/model3d" xmlns:an18="http://schemas.microsoft.com/office/drawing/2018/animation" xmlns:anam3d="http://schemas.microsoft.com/office/drawing/2018/animation/model3d" xmlns:iact="http://schemas.microsoft.com/office/powerpoint/2014/inkAction" xmlns:thm15="http://schemas.microsoft.com/office/thememl/2012/main" xmlns:wps="http://schemas.microsoft.com/office/word/2010/wordprocessingShape" xmlns:wpc="http://schemas.microsoft.com/office/word/2010/wordprocessingCanvas" xmlns:wpg="http://schemas.microsoft.com/office/word/2010/wordprocessingGroup" xmlns:w16se="http://schemas.microsoft.com/office/word/2015/wordml/symex" xmlns:w16cid="http://schemas.microsoft.com/office/word/2016/wordml/cid" xmlns:w16="http://schemas.microsoft.com/office/word/2018/wordml" xmlns:w16cex="http://schemas.microsoft.com/office/word/2018/wordml/cex" xmlns:wetp="http://schemas.microsoft.com/office/webextensions/taskpanes/2010/11" xmlns:we="http://schemas.microsoft.com/office/webextensions/webextension/2010/11" xmlns:comp="http://schemas.openxmlformats.org/drawingml/2006/compatibility" xmlns:lc="http://schemas.openxmlformats.org/drawingml/2006/lockedCanvas" xmlns:dgm14="http://schemas.microsoft.com/office/drawing/2010/diagram" xmlns:a15="http://schemas.microsoft.com/office/drawing/2012/main" xmlns:pic14="http://schemas.microsoft.com/office/drawing/2010/picture" xmlns:c16ac="http://schemas.microsoft.com/office/drawing/2014/chart/ac" xmlns:a16="http://schemas.microsoft.com/office/drawing/2014/main" xmlns:a1611="http://schemas.microsoft.com/office/drawing/2016/11/main" xmlns:dgm1612="http://schemas.microsoft.com/office/drawing/2016/12/diagram" xmlns:a16svg="http://schemas.microsoft.com/office/drawing/2016/SVG/main" xmlns:adec="http://schemas.microsoft.com/office/drawing/2017/decorative" xmlns:a18hc="http://schemas.microsoft.com/office/drawing/2018/hyperlinkcolor" xmlns:wp15="http://schemas.microsoft.com/office/word/2012/wordprocessingDrawing" xmlns:w16sdtfl="http://schemas.microsoft.com/office/word/2024/wordml/sdtformatlock" xmlns:w16sdtdh="http://schemas.microsoft.com/office/word/2020/wordml/sdtdatahash" xmlns:w16du="http://schemas.microsoft.com/office/word/2023/wordml/word16du" mc:Ignorable="w14 w15 w16se w16cid w16 w16cex w16sdtdh w16sdtfl w16du wp14">
   <w:body>
-    <!-- Modified by docx4j 17.1.0-SNAPSHOT (Apache licensed) using REFERENCE JAXB in Arch Linux Java 21.0.12 on Linux -->
+    <!-- Modified by docx4j 17.1.1-SNAPSHOT (Apache licensed) using REFERENCE JAXB in Arch Linux Java 21.0.12 on Linux -->
     <w:p>
       <w:pPr>
         <w:pStyle w:val="Title"/>
@@ -9491,31 +9491,18 @@
     </w:p>
     <w:p>
       <w:r>
-        <w:t>Docx4j can open documents which contain Word 2010</w:t>
-      </w:r>
-      <w:r>
-        <w:t>, 2013</w:t>
-      </w:r>
-      <w:r>
-        <w:t xml:space="preserve"> </w:t>
-      </w:r>
-      <w:r>
-        <w:t xml:space="preserve">specific </w:t>
-      </w:r>
-      <w:r>
-        <w:t>content.</w:t>
-      </w:r>
-      <w:r>
-        <w:t xml:space="preserve"> </w:t>
-      </w:r>
-      <w:r>
-        <w:t xml:space="preserve"> The key extensions are supported.  For other stuff</w:t>
-      </w:r>
-      <w:r>
-        <w:t>, for example,  &lt;w14:glow w14:rad="101600"&gt;  it will look for and try to use mc:AlternateContent contained in the document.</w:t>
-      </w:r>
-      <w:r>
-        <w:t xml:space="preserve">  If you use docx4j to save the document, the w14:glow won’t be there any more (ie the docx will effectively be a Word 2007 docx).</w:t>
+        <w:t xml:space="preserve">docx4j can open documents which contain Word 2010 and later content.  The key extensions are bound (the w14, w15 and w16 namespaces, wps and wpg shapes, a14 drawing), and what it does not bind is preserved wherever the schema admits it.</w:t>
+      </w:r>
+    </w:p>
+    <w:p>
+      <w:r>
+        <w:rPr>
+          <w:b/>
+        </w:rPr>
+        <w:t xml:space="preserve">Markup compatibility (mc:AlternateContent).  </w:t>
+      </w:r>
+      <w:r>
+        <w:t xml:space="preserve">Word writes some content twice: an mc:Choice for a reader which understands the newer namespace, and an mc:Fallback for one which does not.  A text box is a wps shape with a VML fallback; an equation on a PowerPoint slide is an a14 shape with a picture fallback.  Since docx4j 17.1.1 the whole element is kept at load wherever Word writes it, and written back with both branches, so a document you save says the same thing to every reader.  When docx4j draws, walks or extracts text, it takes one branch: the first mc:Choice whose Requires prefixes are all named in the docx4j.jaxb.mc.preferChoice property, otherwise the mc:Fallback.  The property is empty by default, so docx4j draws the fallback (what the producer wrote for a reader which understands nothing extra); set it, for example to wps, or to a14 for PowerPoint equations, to draw the choice instead.  The rule lives in org.docx4j.jaxb.McSelection.</w:t>
       </w:r>
     </w:p>
     <w:p>
@@ -23893,6 +23880,17 @@
           <w:szCs w:val="20"/>
         </w:rPr>
         <w:t xml:space="preserve"> CompoundTraversalUtilVisitorCallback </w:t>
+      </w:r>
+    </w:p>
+    <w:p>
+      <w:r>
+        <w:rPr>
+          <w:b/>
+        </w:rPr>
+        <w:t xml:space="preserve">mc:AlternateContent in a traversal.  </w:t>
+      </w:r>
+      <w:r>
+        <w:t xml:space="preserve">Since docx4j 17.1.1 a TraversalUtil walk visits one branch of each mc:AlternateContent by default, the branch docx4j draws (McMode.READ), so a text box's paragraphs are visited once, not once as the wps shape and again as its VML fallback.  A callback which edits the document (find and replace, field update, anything whose result must reach every reader) should ask for every branch with McMode.ALL, through the TraversalUtil constructor or visit overload which takes a mode, or CallbackImpl.setMcMode; docx4j's own binding, field, merge and TOC code does so.  Before 17.1.1 every walk saw every branch.</w:t>
       </w:r>
     </w:p>
     <w:p/>
@@ -34495,6 +34493,11 @@
       </w:pPr>
       <w:r>
         <w:t>which marshals the object it is passed via a SAX ContentHandler, in order to output the text to the Writer.</w:t>
+      </w:r>
+    </w:p>
+    <w:p>
+      <w:r>
+        <w:t xml:space="preserve">Since docx4j 17.1.1 the text of one branch of each mc:AlternateContent is written, the branch docx4j draws, so a text box's text appears once; before that, both branches' text was written.</w:t>
       </w:r>
     </w:p>
     <w:p>
@@ -48760,7 +48763,7 @@
 </file>
 
 <file path=customXml/item2.xml><?xml version="1.0" encoding="utf-8"?>
-<b:Sources xmlns:w="http://schemas.openxmlformats.org/wordprocessingml/2006/main" xmlns:w14="http://schemas.microsoft.com/office/word/2010/wordml" xmlns:w15="http://schemas.microsoft.com/office/word/2012/wordml" xmlns:r="http://schemas.openxmlformats.org/officeDocument/2006/relationships" xmlns:m="http://schemas.openxmlformats.org/officeDocument/2006/math" xmlns:wp="http://schemas.openxmlformats.org/drawingml/2006/wordprocessingDrawing" xmlns:a="http://schemas.openxmlformats.org/drawingml/2006/main" xmlns:wp14="http://schemas.microsoft.com/office/word/2010/wordprocessingDrawing" xmlns:mc="http://schemas.openxmlformats.org/markup-compatibility/2006" xmlns:a14="http://schemas.microsoft.com/office/drawing/2010/main" xmlns:sl="http://schemas.openxmlformats.org/schemaLibrary/2006/main" xmlns:wne="http://schemas.microsoft.com/office/word/2006/wordml" xmlns:c="http://schemas.openxmlformats.org/drawingml/2006/chart" xmlns:cdr="http://schemas.openxmlformats.org/drawingml/2006/chartDrawing" xmlns:c14="http://schemas.microsoft.com/office/drawing/2007/8/2/chart" xmlns:dgm="http://schemas.openxmlformats.org/drawingml/2006/diagram" xmlns:pic="http://schemas.openxmlformats.org/drawingml/2006/picture" xmlns:xdr="http://schemas.openxmlformats.org/drawingml/2006/spreadsheetDrawing" xmlns:dsp="http://schemas.microsoft.com/office/drawing/2008/diagram" xmlns:o="urn:schemas-microsoft-com:office:office" xmlns:v="urn:schemas-microsoft-com:vml" xmlns:w10="urn:schemas-microsoft-com:office:word" xmlns:xvml="urn:schemas-microsoft-com:office:excel" xmlns:pvml="urn:schemas-microsoft-com:office:powerpoint" xmlns:ns25="urn:docx4j:vml:root" xmlns:cppr="http://schemas.microsoft.com/office/2006/coverPageProps" xmlns:odx="http://opendope.org/xpaths" xmlns:odc="http://opendope.org/conditions" xmlns:odq="http://opendope.org/questions" xmlns:oda="http://opendope.org/answers" xmlns:odi="http://opendope.org/components" xmlns:odgm="http://opendope.org/SmartArt/DataHierarchy" xmlns:b="http://schemas.openxmlformats.org/officeDocument/2006/bibliography" xmlns:msink="http://schemas.microsoft.com/ink/2010/main" xmlns:cdr14="http://schemas.microsoft.com/office/drawing/2010/chartDrawing" xmlns:c15="http://schemas.microsoft.com/office/drawing/2012/chart" xmlns:cs="http://schemas.microsoft.com/office/drawing/2012/chartStyle" xmlns:ns38="http://www.w3.org/1998/Math/MathML" xmlns:ns39="http://www.w3.org/2003/InkML" xmlns:a13cmd="http://schemas.microsoft.com/office/drawing/2013/main/command" xmlns:cx="http://schemas.microsoft.com/office/drawing/2014/chartex" xmlns:c16="http://schemas.microsoft.com/office/drawing/2014/chart" xmlns:dgm1611="http://schemas.microsoft.com/office/drawing/2016/11/diagram" xmlns:c173="http://schemas.microsoft.com/office/drawing/2017/03/chart" xmlns:am3d="http://schemas.microsoft.com/office/drawing/2017/model3d" xmlns:an18="http://schemas.microsoft.com/office/drawing/2018/animation" xmlns:anam3d="http://schemas.microsoft.com/office/drawing/2018/animation/model3d" xmlns:iact="http://schemas.microsoft.com/office/powerpoint/2014/inkAction" xmlns:thm15="http://schemas.microsoft.com/office/thememl/2012/main" xmlns:wps="http://schemas.microsoft.com/office/word/2010/wordprocessingShape" xmlns:wpc="http://schemas.microsoft.com/office/word/2010/wordprocessingCanvas" xmlns:wpg="http://schemas.microsoft.com/office/word/2010/wordprocessingGroup" xmlns:w16se="http://schemas.microsoft.com/office/word/2015/wordml/symex" xmlns:w16cid="http://schemas.microsoft.com/office/word/2016/wordml/cid" xmlns:wetp="http://schemas.microsoft.com/office/webextensions/taskpanes/2010/11" xmlns:we="http://schemas.microsoft.com/office/webextensions/webextension/2010/11" xmlns:comp="http://schemas.openxmlformats.org/drawingml/2006/compatibility" xmlns:lc="http://schemas.openxmlformats.org/drawingml/2006/lockedCanvas" xmlns:dgm14="http://schemas.microsoft.com/office/drawing/2010/diagram" xmlns:a15="http://schemas.microsoft.com/office/drawing/2012/main" xmlns:pic14="http://schemas.microsoft.com/office/drawing/2010/picture" xmlns:c16ac="http://schemas.microsoft.com/office/drawing/2014/chart/ac" xmlns:a16="http://schemas.microsoft.com/office/drawing/2014/main" xmlns:a1611="http://schemas.microsoft.com/office/drawing/2016/11/main" xmlns:dgm1612="http://schemas.microsoft.com/office/drawing/2016/12/diagram" xmlns:a16svg="http://schemas.microsoft.com/office/drawing/2016/SVG/main" xmlns:adec="http://schemas.microsoft.com/office/drawing/2017/decorative" xmlns:a18hc="http://schemas.microsoft.com/office/drawing/2018/hyperlinkcolor" xmlns:wp15="http://schemas.microsoft.com/office/word/2012/wordprocessingDrawing" SelectedStyle="\APA.XSL" StyleName="APA"/>
+<b:Sources xmlns:m="http://schemas.openxmlformats.org/officeDocument/2006/math" xmlns:w="http://schemas.openxmlformats.org/wordprocessingml/2006/main" xmlns:w14="http://schemas.microsoft.com/office/word/2010/wordml" xmlns:r="http://schemas.openxmlformats.org/officeDocument/2006/relationships" xmlns:wp="http://schemas.openxmlformats.org/drawingml/2006/wordprocessingDrawing" xmlns:a="http://schemas.openxmlformats.org/drawingml/2006/main" xmlns:wp14="http://schemas.microsoft.com/office/word/2010/wordprocessingDrawing" xmlns:mc="http://schemas.openxmlformats.org/markup-compatibility/2006" xmlns:w15="http://schemas.microsoft.com/office/word/2012/wordml" xmlns:a14="http://schemas.microsoft.com/office/drawing/2010/main" xmlns:sl="http://schemas.openxmlformats.org/schemaLibrary/2006/main" xmlns:wne="http://schemas.microsoft.com/office/word/2006/wordml" xmlns:c="http://schemas.openxmlformats.org/drawingml/2006/chart" xmlns:cdr="http://schemas.openxmlformats.org/drawingml/2006/chartDrawing" xmlns:c14="http://schemas.microsoft.com/office/drawing/2007/8/2/chart" xmlns:dgm="http://schemas.openxmlformats.org/drawingml/2006/diagram" xmlns:pic="http://schemas.openxmlformats.org/drawingml/2006/picture" xmlns:xdr="http://schemas.openxmlformats.org/drawingml/2006/spreadsheetDrawing" xmlns:dsp="http://schemas.microsoft.com/office/drawing/2008/diagram" xmlns:o="urn:schemas-microsoft-com:office:office" xmlns:v="urn:schemas-microsoft-com:vml" xmlns:w10="urn:schemas-microsoft-com:office:word" xmlns:xvml="urn:schemas-microsoft-com:office:excel" xmlns:pvml="urn:schemas-microsoft-com:office:powerpoint" xmlns:ns25="urn:docx4j:vml:root" xmlns:cppr="http://schemas.microsoft.com/office/2006/coverPageProps" xmlns:odx="http://opendope.org/xpaths" xmlns:odc="http://opendope.org/conditions" xmlns:odq="http://opendope.org/questions" xmlns:oda="http://opendope.org/answers" xmlns:odi="http://opendope.org/components" xmlns:odgm="http://opendope.org/SmartArt/DataHierarchy" xmlns:b="http://schemas.openxmlformats.org/officeDocument/2006/bibliography" xmlns:msink="http://schemas.microsoft.com/ink/2010/main" xmlns:cdr14="http://schemas.microsoft.com/office/drawing/2010/chartDrawing" xmlns:c15="http://schemas.microsoft.com/office/drawing/2012/chart" xmlns:cs="http://schemas.microsoft.com/office/drawing/2012/chartStyle" xmlns:ns38="http://www.w3.org/1998/Math/MathML" xmlns:ns39="http://www.w3.org/2003/InkML" xmlns:a13cmd="http://schemas.microsoft.com/office/drawing/2013/main/command" xmlns:cx="http://schemas.microsoft.com/office/drawing/2014/chartex" xmlns:c16="http://schemas.microsoft.com/office/drawing/2014/chart" xmlns:dgm1611="http://schemas.microsoft.com/office/drawing/2016/11/diagram" xmlns:c173="http://schemas.microsoft.com/office/drawing/2017/03/chart" xmlns:am3d="http://schemas.microsoft.com/office/drawing/2017/model3d" xmlns:an18="http://schemas.microsoft.com/office/drawing/2018/animation" xmlns:anam3d="http://schemas.microsoft.com/office/drawing/2018/animation/model3d" xmlns:iact="http://schemas.microsoft.com/office/powerpoint/2014/inkAction" xmlns:thm15="http://schemas.microsoft.com/office/thememl/2012/main" xmlns:wps="http://schemas.microsoft.com/office/word/2010/wordprocessingShape" xmlns:wpc="http://schemas.microsoft.com/office/word/2010/wordprocessingCanvas" xmlns:wpg="http://schemas.microsoft.com/office/word/2010/wordprocessingGroup" xmlns:w16se="http://schemas.microsoft.com/office/word/2015/wordml/symex" xmlns:w16cid="http://schemas.microsoft.com/office/word/2016/wordml/cid" xmlns:w16="http://schemas.microsoft.com/office/word/2018/wordml" xmlns:w16cex="http://schemas.microsoft.com/office/word/2018/wordml/cex" xmlns:wetp="http://schemas.microsoft.com/office/webextensions/taskpanes/2010/11" xmlns:we="http://schemas.microsoft.com/office/webextensions/webextension/2010/11" xmlns:comp="http://schemas.openxmlformats.org/drawingml/2006/compatibility" xmlns:lc="http://schemas.openxmlformats.org/drawingml/2006/lockedCanvas" xmlns:dgm14="http://schemas.microsoft.com/office/drawing/2010/diagram" xmlns:a15="http://schemas.microsoft.com/office/drawing/2012/main" xmlns:pic14="http://schemas.microsoft.com/office/drawing/2010/picture" xmlns:c16ac="http://schemas.microsoft.com/office/drawing/2014/chart/ac" xmlns:a16="http://schemas.microsoft.com/office/drawing/2014/main" xmlns:a1611="http://schemas.microsoft.com/office/drawing/2016/11/main" xmlns:dgm1612="http://schemas.microsoft.com/office/drawing/2016/12/diagram" xmlns:a16svg="http://schemas.microsoft.com/office/drawing/2016/SVG/main" xmlns:adec="http://schemas.microsoft.com/office/drawing/2017/decorative" xmlns:a18hc="http://schemas.microsoft.com/office/drawing/2018/hyperlinkcolor" xmlns:wp15="http://schemas.microsoft.com/office/word/2012/wordprocessingDrawing" SelectedStyle="\APA.XSL" StyleName="APA"/>
 </file>
 
 <file path=customXml/item3.xml><?xml version="1.0" encoding="utf-8"?>
@@ -48768,7 +48771,7 @@
 </file>
 
 <file path=customXml/item4.xml><?xml version="1.0" encoding="utf-8"?>
-<b:Sources xmlns:w="http://schemas.openxmlformats.org/wordprocessingml/2006/main" xmlns:w14="http://schemas.microsoft.com/office/word/2010/wordml" xmlns:w15="http://schemas.microsoft.com/office/word/2012/wordml" xmlns:r="http://schemas.openxmlformats.org/officeDocument/2006/relationships" xmlns:m="http://schemas.openxmlformats.org/officeDocument/2006/math" xmlns:wp="http://schemas.openxmlformats.org/drawingml/2006/wordprocessingDrawing" xmlns:a="http://schemas.openxmlformats.org/drawingml/2006/main" xmlns:wp14="http://schemas.microsoft.com/office/word/2010/wordprocessingDrawing" xmlns:mc="http://schemas.openxmlformats.org/markup-compatibility/2006" xmlns:a14="http://schemas.microsoft.com/office/drawing/2010/main" xmlns:sl="http://schemas.openxmlformats.org/schemaLibrary/2006/main" xmlns:wne="http://schemas.microsoft.com/office/word/2006/wordml" xmlns:c="http://schemas.openxmlformats.org/drawingml/2006/chart" xmlns:cdr="http://schemas.openxmlformats.org/drawingml/2006/chartDrawing" xmlns:c14="http://schemas.microsoft.com/office/drawing/2007/8/2/chart" xmlns:dgm="http://schemas.openxmlformats.org/drawingml/2006/diagram" xmlns:pic="http://schemas.openxmlformats.org/drawingml/2006/picture" xmlns:xdr="http://schemas.openxmlformats.org/drawingml/2006/spreadsheetDrawing" xmlns:dsp="http://schemas.microsoft.com/office/drawing/2008/diagram" xmlns:o="urn:schemas-microsoft-com:office:office" xmlns:v="urn:schemas-microsoft-com:vml" xmlns:w10="urn:schemas-microsoft-com:office:word" xmlns:xvml="urn:schemas-microsoft-com:office:excel" xmlns:pvml="urn:schemas-microsoft-com:office:powerpoint" xmlns:ns25="urn:docx4j:vml:root" xmlns:cppr="http://schemas.microsoft.com/office/2006/coverPageProps" xmlns:odx="http://opendope.org/xpaths" xmlns:odc="http://opendope.org/conditions" xmlns:odq="http://opendope.org/questions" xmlns:oda="http://opendope.org/answers" xmlns:odi="http://opendope.org/components" xmlns:odgm="http://opendope.org/SmartArt/DataHierarchy" xmlns:b="http://schemas.openxmlformats.org/officeDocument/2006/bibliography" xmlns:msink="http://schemas.microsoft.com/ink/2010/main" xmlns:cdr14="http://schemas.microsoft.com/office/drawing/2010/chartDrawing" xmlns:c15="http://schemas.microsoft.com/office/drawing/2012/chart" xmlns:cs="http://schemas.microsoft.com/office/drawing/2012/chartStyle" xmlns:ns38="http://www.w3.org/1998/Math/MathML" xmlns:ns39="http://www.w3.org/2003/InkML" xmlns:a13cmd="http://schemas.microsoft.com/office/drawing/2013/main/command" xmlns:cx="http://schemas.microsoft.com/office/drawing/2014/chartex" xmlns:c16="http://schemas.microsoft.com/office/drawing/2014/chart" xmlns:dgm1611="http://schemas.microsoft.com/office/drawing/2016/11/diagram" xmlns:c173="http://schemas.microsoft.com/office/drawing/2017/03/chart" xmlns:am3d="http://schemas.microsoft.com/office/drawing/2017/model3d" xmlns:an18="http://schemas.microsoft.com/office/drawing/2018/animation" xmlns:anam3d="http://schemas.microsoft.com/office/drawing/2018/animation/model3d" xmlns:iact="http://schemas.microsoft.com/office/powerpoint/2014/inkAction" xmlns:thm15="http://schemas.microsoft.com/office/thememl/2012/main" xmlns:wps="http://schemas.microsoft.com/office/word/2010/wordprocessingShape" xmlns:wpc="http://schemas.microsoft.com/office/word/2010/wordprocessingCanvas" xmlns:wpg="http://schemas.microsoft.com/office/word/2010/wordprocessingGroup" xmlns:w16se="http://schemas.microsoft.com/office/word/2015/wordml/symex" xmlns:w16cid="http://schemas.microsoft.com/office/word/2016/wordml/cid" xmlns:wetp="http://schemas.microsoft.com/office/webextensions/taskpanes/2010/11" xmlns:we="http://schemas.microsoft.com/office/webextensions/webextension/2010/11" xmlns:comp="http://schemas.openxmlformats.org/drawingml/2006/compatibility" xmlns:lc="http://schemas.openxmlformats.org/drawingml/2006/lockedCanvas" xmlns:dgm14="http://schemas.microsoft.com/office/drawing/2010/diagram" xmlns:a15="http://schemas.microsoft.com/office/drawing/2012/main" xmlns:pic14="http://schemas.microsoft.com/office/drawing/2010/picture" xmlns:c16ac="http://schemas.microsoft.com/office/drawing/2014/chart/ac" xmlns:a16="http://schemas.microsoft.com/office/drawing/2014/main" xmlns:a1611="http://schemas.microsoft.com/office/drawing/2016/11/main" xmlns:dgm1612="http://schemas.microsoft.com/office/drawing/2016/12/diagram" xmlns:a16svg="http://schemas.microsoft.com/office/drawing/2016/SVG/main" xmlns:adec="http://schemas.microsoft.com/office/drawing/2017/decorative" xmlns:a18hc="http://schemas.microsoft.com/office/drawing/2018/hyperlinkcolor" xmlns:wp15="http://schemas.microsoft.com/office/word/2012/wordprocessingDrawing" SelectedStyle="\APA.XSL" StyleName="APA"/>
+<b:Sources xmlns:m="http://schemas.openxmlformats.org/officeDocument/2006/math" xmlns:w="http://schemas.openxmlformats.org/wordprocessingml/2006/main" xmlns:w14="http://schemas.microsoft.com/office/word/2010/wordml" xmlns:r="http://schemas.openxmlformats.org/officeDocument/2006/relationships" xmlns:wp="http://schemas.openxmlformats.org/drawingml/2006/wordprocessingDrawing" xmlns:a="http://schemas.openxmlformats.org/drawingml/2006/main" xmlns:wp14="http://schemas.microsoft.com/office/word/2010/wordprocessingDrawing" xmlns:mc="http://schemas.openxmlformats.org/markup-compatibility/2006" xmlns:w15="http://schemas.microsoft.com/office/word/2012/wordml" xmlns:a14="http://schemas.microsoft.com/office/drawing/2010/main" xmlns:sl="http://schemas.openxmlformats.org/schemaLibrary/2006/main" xmlns:wne="http://schemas.microsoft.com/office/word/2006/wordml" xmlns:c="http://schemas.openxmlformats.org/drawingml/2006/chart" xmlns:cdr="http://schemas.openxmlformats.org/drawingml/2006/chartDrawing" xmlns:c14="http://schemas.microsoft.com/office/drawing/2007/8/2/chart" xmlns:dgm="http://schemas.openxmlformats.org/drawingml/2006/diagram" xmlns:pic="http://schemas.openxmlformats.org/drawingml/2006/picture" xmlns:xdr="http://schemas.openxmlformats.org/drawingml/2006/spreadsheetDrawing" xmlns:dsp="http://schemas.microsoft.com/office/drawing/2008/diagram" xmlns:o="urn:schemas-microsoft-com:office:office" xmlns:v="urn:schemas-microsoft-com:vml" xmlns:w10="urn:schemas-microsoft-com:office:word" xmlns:xvml="urn:schemas-microsoft-com:office:excel" xmlns:pvml="urn:schemas-microsoft-com:office:powerpoint" xmlns:ns25="urn:docx4j:vml:root" xmlns:cppr="http://schemas.microsoft.com/office/2006/coverPageProps" xmlns:odx="http://opendope.org/xpaths" xmlns:odc="http://opendope.org/conditions" xmlns:odq="http://opendope.org/questions" xmlns:oda="http://opendope.org/answers" xmlns:odi="http://opendope.org/components" xmlns:odgm="http://opendope.org/SmartArt/DataHierarchy" xmlns:b="http://schemas.openxmlformats.org/officeDocument/2006/bibliography" xmlns:msink="http://schemas.microsoft.com/ink/2010/main" xmlns:cdr14="http://schemas.microsoft.com/office/drawing/2010/chartDrawing" xmlns:c15="http://schemas.microsoft.com/office/drawing/2012/chart" xmlns:cs="http://schemas.microsoft.com/office/drawing/2012/chartStyle" xmlns:ns38="http://www.w3.org/1998/Math/MathML" xmlns:ns39="http://www.w3.org/2003/InkML" xmlns:a13cmd="http://schemas.microsoft.com/office/drawing/2013/main/command" xmlns:cx="http://schemas.microsoft.com/office/drawing/2014/chartex" xmlns:c16="http://schemas.microsoft.com/office/drawing/2014/chart" xmlns:dgm1611="http://schemas.microsoft.com/office/drawing/2016/11/diagram" xmlns:c173="http://schemas.microsoft.com/office/drawing/2017/03/chart" xmlns:am3d="http://schemas.microsoft.com/office/drawing/2017/model3d" xmlns:an18="http://schemas.microsoft.com/office/drawing/2018/animation" xmlns:anam3d="http://schemas.microsoft.com/office/drawing/2018/animation/model3d" xmlns:iact="http://schemas.microsoft.com/office/powerpoint/2014/inkAction" xmlns:thm15="http://schemas.microsoft.com/office/thememl/2012/main" xmlns:wps="http://schemas.microsoft.com/office/word/2010/wordprocessingShape" xmlns:wpc="http://schemas.microsoft.com/office/word/2010/wordprocessingCanvas" xmlns:wpg="http://schemas.microsoft.com/office/word/2010/wordprocessingGroup" xmlns:w16se="http://schemas.microsoft.com/office/word/2015/wordml/symex" xmlns:w16cid="http://schemas.microsoft.com/office/word/2016/wordml/cid" xmlns:w16="http://schemas.microsoft.com/office/word/2018/wordml" xmlns:w16cex="http://schemas.microsoft.com/office/word/2018/wordml/cex" xmlns:wetp="http://schemas.microsoft.com/office/webextensions/taskpanes/2010/11" xmlns:we="http://schemas.microsoft.com/office/webextensions/webextension/2010/11" xmlns:comp="http://schemas.openxmlformats.org/drawingml/2006/compatibility" xmlns:lc="http://schemas.openxmlformats.org/drawingml/2006/lockedCanvas" xmlns:dgm14="http://schemas.microsoft.com/office/drawing/2010/diagram" xmlns:a15="http://schemas.microsoft.com/office/drawing/2012/main" xmlns:pic14="http://schemas.microsoft.com/office/drawing/2010/picture" xmlns:c16ac="http://schemas.microsoft.com/office/drawing/2014/chart/ac" xmlns:a16="http://schemas.microsoft.com/office/drawing/2014/main" xmlns:a1611="http://schemas.microsoft.com/office/drawing/2016/11/main" xmlns:dgm1612="http://schemas.microsoft.com/office/drawing/2016/12/diagram" xmlns:a16svg="http://schemas.microsoft.com/office/drawing/2016/SVG/main" xmlns:adec="http://schemas.microsoft.com/office/drawing/2017/decorative" xmlns:a18hc="http://schemas.microsoft.com/office/drawing/2018/hyperlinkcolor" xmlns:wp15="http://schemas.microsoft.com/office/word/2012/wordprocessingDrawing" SelectedStyle="\APA.XSL" StyleName="APA"/>
 </file>
 
 <file path=customXml/item5.xml><?xml version="1.0" encoding="utf-8"?>

</xml_diff>

<commit_message>
17.2.0: the release renamed from 17.1.1 - revision, scm tag, CHANGELOG heading, every "17.1.1" in comments, @since tags, xsd notes, properties and the CRs; the branch is VERSION_17_2_0
Labelled a minor release, not a patch, because the cycle carries default
behaviour changes (createPackage writes a Word 365 document; the 2023
theme; the mc:AlternateContent policy; HTML font-family; numId 0), new
public surfaces (new schemas, parts and packages; the numbering, resolver
and font accessors), deprecations, a new optional jar and a selectable
renderer - the same tests 17.1.0 was labelled by. Nothing was published
under 17.1.1.

The Getting Started docx's ten mentions are renamed in place; its derived
.md and .html are renamed by the same replace, and the .pdf is regenerated
at release (etc/GenGettingStartedDocs.java, run per release).
docx4j-ImportXHTML's own VERSION_17_1_1 branch (CR-013) is not renamed
here.

Co-Authored-By: Claude Opus 5 (1M context) <noreply@anthropic.com>
</commit_message>
<xml_diff>
--- a/docs/Docx4j_GettingStarted.docx
+++ b/docs/Docx4j_GettingStarted.docx
@@ -2,7 +2,7 @@
 <file path=word/document.xml><?xml version="1.0" encoding="utf-8"?>
 <w:document xmlns:m="http://schemas.openxmlformats.org/officeDocument/2006/math" xmlns:w="http://schemas.openxmlformats.org/wordprocessingml/2006/main" xmlns:w14="http://schemas.microsoft.com/office/word/2010/wordml" xmlns:r="http://schemas.openxmlformats.org/officeDocument/2006/relationships" xmlns:wp="http://schemas.openxmlformats.org/drawingml/2006/wordprocessingDrawing" xmlns:a="http://schemas.openxmlformats.org/drawingml/2006/main" xmlns:wp14="http://schemas.microsoft.com/office/word/2010/wordprocessingDrawing" xmlns:mc="http://schemas.openxmlformats.org/markup-compatibility/2006" xmlns:w15="http://schemas.microsoft.com/office/word/2012/wordml" xmlns:a14="http://schemas.microsoft.com/office/drawing/2010/main" xmlns:sl="http://schemas.openxmlformats.org/schemaLibrary/2006/main" xmlns:wne="http://schemas.microsoft.com/office/word/2006/wordml" xmlns:c="http://schemas.openxmlformats.org/drawingml/2006/chart" xmlns:cdr="http://schemas.openxmlformats.org/drawingml/2006/chartDrawing" xmlns:c14="http://schemas.microsoft.com/office/drawing/2007/8/2/chart" xmlns:dgm="http://schemas.openxmlformats.org/drawingml/2006/diagram" xmlns:pic="http://schemas.openxmlformats.org/drawingml/2006/picture" xmlns:xdr="http://schemas.openxmlformats.org/drawingml/2006/spreadsheetDrawing" xmlns:dsp="http://schemas.microsoft.com/office/drawing/2008/diagram" xmlns:o="urn:schemas-microsoft-com:office:office" xmlns:v="urn:schemas-microsoft-com:vml" xmlns:w10="urn:schemas-microsoft-com:office:word" xmlns:xvml="urn:schemas-microsoft-com:office:excel" xmlns:pvml="urn:schemas-microsoft-com:office:powerpoint" xmlns:ns25="urn:docx4j:vml:root" xmlns:cppr="http://schemas.microsoft.com/office/2006/coverPageProps" xmlns:odx="http://opendope.org/xpaths" xmlns:odc="http://opendope.org/conditions" xmlns:odq="http://opendope.org/questions" xmlns:oda="http://opendope.org/answers" xmlns:odi="http://opendope.org/components" xmlns:odgm="http://opendope.org/SmartArt/DataHierarchy" xmlns:b="http://schemas.openxmlformats.org/officeDocument/2006/bibliography" xmlns:msink="http://schemas.microsoft.com/ink/2010/main" xmlns:cdr14="http://schemas.microsoft.com/office/drawing/2010/chartDrawing" xmlns:c15="http://schemas.microsoft.com/office/drawing/2012/chart" xmlns:cs="http://schemas.microsoft.com/office/drawing/2012/chartStyle" xmlns:ns38="http://www.w3.org/1998/Math/MathML" xmlns:ns39="http://www.w3.org/2003/InkML" xmlns:a13cmd="http://schemas.microsoft.com/office/drawing/2013/main/command" xmlns:cx="http://schemas.microsoft.com/office/drawing/2014/chartex" xmlns:c16="http://schemas.microsoft.com/office/drawing/2014/chart" xmlns:dgm1611="http://schemas.microsoft.com/office/drawing/2016/11/diagram" xmlns:c173="http://schemas.microsoft.com/office/drawing/2017/03/chart" xmlns:am3d="http://schemas.microsoft.com/office/drawing/2017/model3d" xmlns:an18="http://schemas.microsoft.com/office/drawing/2018/animation" xmlns:anam3d="http://schemas.microsoft.com/office/drawing/2018/animation/model3d" xmlns:iact="http://schemas.microsoft.com/office/powerpoint/2014/inkAction" xmlns:thm15="http://schemas.microsoft.com/office/thememl/2012/main" xmlns:wps="http://schemas.microsoft.com/office/word/2010/wordprocessingShape" xmlns:wpc="http://schemas.microsoft.com/office/word/2010/wordprocessingCanvas" xmlns:wpg="http://schemas.microsoft.com/office/word/2010/wordprocessingGroup" xmlns:w16se="http://schemas.microsoft.com/office/word/2015/wordml/symex" xmlns:w16cid="http://schemas.microsoft.com/office/word/2016/wordml/cid" xmlns:w16="http://schemas.microsoft.com/office/word/2018/wordml" xmlns:w16cex="http://schemas.microsoft.com/office/word/2018/wordml/cex" xmlns:wetp="http://schemas.microsoft.com/office/webextensions/taskpanes/2010/11" xmlns:we="http://schemas.microsoft.com/office/webextensions/webextension/2010/11" xmlns:comp="http://schemas.openxmlformats.org/drawingml/2006/compatibility" xmlns:lc="http://schemas.openxmlformats.org/drawingml/2006/lockedCanvas" xmlns:dgm14="http://schemas.microsoft.com/office/drawing/2010/diagram" xmlns:a15="http://schemas.microsoft.com/office/drawing/2012/main" xmlns:pic14="http://schemas.microsoft.com/office/drawing/2010/picture" xmlns:c16ac="http://schemas.microsoft.com/office/drawing/2014/chart/ac" xmlns:a16="http://schemas.microsoft.com/office/drawing/2014/main" xmlns:a1611="http://schemas.microsoft.com/office/drawing/2016/11/main" xmlns:dgm1612="http://schemas.microsoft.com/office/drawing/2016/12/diagram" xmlns:a16svg="http://schemas.microsoft.com/office/drawing/2016/SVG/main" xmlns:adec="http://schemas.microsoft.com/office/drawing/2017/decorative" xmlns:a18hc="http://schemas.microsoft.com/office/drawing/2018/hyperlinkcolor" xmlns:wp15="http://schemas.microsoft.com/office/word/2012/wordprocessingDrawing" xmlns:w16sdtfl="http://schemas.microsoft.com/office/word/2024/wordml/sdtformatlock" xmlns:w16sdtdh="http://schemas.microsoft.com/office/word/2020/wordml/sdtdatahash" xmlns:w16du="http://schemas.microsoft.com/office/word/2023/wordml/word16du" mc:Ignorable="w14 w15 w16se w16cid w16 w16cex w16sdtdh w16sdtfl w16du wp14">
   <w:body>
-    <!-- Modified by docx4j 17.1.1-SNAPSHOT (Apache licensed) using REFERENCE JAXB in Arch Linux Java 21.0.12 on Linux -->
+    <!-- Modified by docx4j 17.2.0-SNAPSHOT (Apache licensed) using REFERENCE JAXB in Arch Linux Java 21.0.12 on Linux -->
     <w:p>
       <w:pPr>
         <w:pStyle w:val="Title"/>
@@ -9502,7 +9502,7 @@
         <w:t xml:space="preserve">Markup compatibility (mc:AlternateContent).  </w:t>
       </w:r>
       <w:r>
-        <w:t xml:space="preserve">Word writes some content twice: an mc:Choice for a reader which understands the newer namespace, and an mc:Fallback for one which does not.  A text box is a wps shape with a VML fallback; an equation on a PowerPoint slide is an a14 shape with a picture fallback.  Since docx4j 17.1.1 the whole element is kept at load wherever Word writes it, and written back with both branches, so a document you save says the same thing to every reader.  When docx4j draws, walks or extracts text, it takes one branch: the first mc:Choice whose Requires prefixes are all named in the docx4j.jaxb.mc.preferChoice property, otherwise the mc:Fallback.  The property is empty by default, so docx4j draws the fallback (what the producer wrote for a reader which understands nothing extra); set it, for example to wps, or to a14 for PowerPoint equations, to draw the choice instead.  The rule lives in org.docx4j.jaxb.McSelection.</w:t>
+        <w:t xml:space="preserve">Word writes some content twice: an mc:Choice for a reader which understands the newer namespace, and an mc:Fallback for one which does not.  A text box is a wps shape with a VML fallback; an equation on a PowerPoint slide is an a14 shape with a picture fallback.  Since docx4j 17.2.0 the whole element is kept at load wherever Word writes it, and written back with both branches, so a document you save says the same thing to every reader.  When docx4j draws, walks or extracts text, it takes one branch: the first mc:Choice whose Requires prefixes are all named in the docx4j.jaxb.mc.preferChoice property, otherwise the mc:Fallback.  The property is empty by default, so docx4j draws the fallback (what the producer wrote for a reader which understands nothing extra); set it, for example to wps, or to a14 for PowerPoint equations, to draw the choice instead.  The rule lives in org.docx4j.jaxb.McSelection.</w:t>
       </w:r>
     </w:p>
     <w:p>
@@ -23890,7 +23890,7 @@
         <w:t xml:space="preserve">mc:AlternateContent in a traversal.  </w:t>
       </w:r>
       <w:r>
-        <w:t xml:space="preserve">Since docx4j 17.1.1 a TraversalUtil walk visits one branch of each mc:AlternateContent by default, the branch docx4j draws (McMode.READ), so a text box's paragraphs are visited once, not once as the wps shape and again as its VML fallback.  A callback which edits the document (find and replace, field update, anything whose result must reach every reader) should ask for every branch with McMode.ALL, through the TraversalUtil constructor or visit overload which takes a mode, or CallbackImpl.setMcMode; docx4j's own binding, field, merge and TOC code does so.  Before 17.1.1 every walk saw every branch.</w:t>
+        <w:t xml:space="preserve">Since docx4j 17.2.0 a TraversalUtil walk visits one branch of each mc:AlternateContent by default, the branch docx4j draws (McMode.READ), so a text box's paragraphs are visited once, not once as the wps shape and again as its VML fallback.  A callback which edits the document (find and replace, field update, anything whose result must reach every reader) should ask for every branch with McMode.ALL, through the TraversalUtil constructor or visit overload which takes a mode, or CallbackImpl.setMcMode; docx4j's own binding, field, merge and TOC code does so.  Before 17.2.0 every walk saw every branch.</w:t>
       </w:r>
     </w:p>
     <w:p/>
@@ -34497,7 +34497,7 @@
     </w:p>
     <w:p>
       <w:r>
-        <w:t xml:space="preserve">Since docx4j 17.1.1 the text of one branch of each mc:AlternateContent is written, the branch docx4j draws, so a text box's text appears once; before that, both branches' text was written.</w:t>
+        <w:t xml:space="preserve">Since docx4j 17.2.0 the text of one branch of each mc:AlternateContent is written, the branch docx4j draws, so a text box's text appears once; before that, both branches' text was written.</w:t>
       </w:r>
     </w:p>
     <w:p>
@@ -39183,7 +39183,7 @@
         <w:t xml:space="preserve"> jar </w:t>
       </w:r>
       <w:r>
-        <w:t xml:space="preserve"> for Aptos and Aptos Display substitutes (Akasia, Intos Display; from 17.1.1)</w:t>
+        <w:t xml:space="preserve"> for Aptos and Aptos Display substitutes (Akasia, Intos Display; from 17.2.0)</w:t>
       </w:r>
     </w:p>
     <w:p>
@@ -41958,7 +41958,7 @@
         <w:t>font packages.</w:t>
       </w:r>
       <w:r>
-        <w:t xml:space="preserve"> For the 2023 theme, Akasia (for Aptos) and Intos Display (for Aptos Display) are metrically compatible and are packaged in docx4j-export-fo-fonts-theme2023 (from docx4j 17.1.1).</w:t>
+        <w:t xml:space="preserve"> For the 2023 theme, Akasia (for Aptos) and Intos Display (for Aptos Display) are metrically compatible and are packaged in docx4j-export-fo-fonts-theme2023 (from docx4j 17.2.0).</w:t>
       </w:r>
     </w:p>
     <w:p>
@@ -42545,7 +42545,7 @@
         </w:numPr>
       </w:pPr>
       <w:r>
-        <w:t xml:space="preserve">docx4j-export-fo-fonts-theme2023 // Akasia and Intos Display for Aptos and Aptos Display (from 17.1.1)</w:t>
+        <w:t xml:space="preserve">docx4j-export-fo-fonts-theme2023 // Akasia and Intos Display for Aptos and Aptos Display (from 17.2.0)</w:t>
       </w:r>
     </w:p>
     <w:p>
@@ -42587,12 +42587,12 @@
     </w:p>
     <w:p>
       <w:r>
-        <w:t xml:space="preserve">Since late 2023 the default theme of Microsoft 365 sets headings in Aptos Display and body text in Aptos. A document that has no theme part of its own (docx4j-created documents before 17.1.1 had none) is set by Word in the fonts of Word’s current default theme, which for Microsoft 365 means Aptos.</w:t>
-      </w:r>
-    </w:p>
-    <w:p>
-      <w:r>
-        <w:t xml:space="preserve">From docx4j 17.1.1 the property docx4j.fonts.defaultTheme says which default theme docx4j assumes: 2023 (the default: Aptos Display / Aptos), 2013 (Calibri Light / Calibri, Office 2013 to 2022) or 2007 (Cambria / Calibri). It decides two things: the theme fonts docx4j resolves for a document with no theme part, and the theme part WordprocessingMLPackage.createPackage adds to a new document, so that a document docx4j creates asks for the same fonts wherever it is opened.</w:t>
+        <w:t xml:space="preserve">Since late 2023 the default theme of Microsoft 365 sets headings in Aptos Display and body text in Aptos. A document that has no theme part of its own (docx4j-created documents before 17.2.0 had none) is set by Word in the fonts of Word’s current default theme, which for Microsoft 365 means Aptos.</w:t>
+      </w:r>
+    </w:p>
+    <w:p>
+      <w:r>
+        <w:t xml:space="preserve">From docx4j 17.2.0 the property docx4j.fonts.defaultTheme says which default theme docx4j assumes: 2023 (the default: Aptos Display / Aptos), 2013 (Calibri Light / Calibri, Office 2013 to 2022) or 2007 (Cambria / Calibri). It decides two things: the theme fonts docx4j resolves for a document with no theme part, and the theme part WordprocessingMLPackage.createPackage adds to a new document, so that a document docx4j creates asks for the same fonts wherever it is opened.</w:t>
       </w:r>
     </w:p>
     <w:p>

</xml_diff>

<commit_message>
Getting Started: the six GitHub links point at VERSION_17_2_1 (they named VERSION_11_5_7, 11_5_8, 11_5_14 and 17_2_0)
The five old-branch links (logback.xml, the export-fo samples directory,
ManyThreads.java, FontsUsed.java, MicrosoftFonts.xml) and the docs link on
the previous release branch; each target checked to exist on this branch.
Hyperlink relationships and their visible text both rewritten with docx4j;
md, html and pdf regenerated. No other text change; 56 pages.

Co-Authored-By: Claude Fable 5.1 <noreply@anthropic.com>
</commit_message>
<xml_diff>
--- a/docs/Docx4j_GettingStarted.docx
+++ b/docs/Docx4j_GettingStarted.docx
@@ -8348,7 +8348,7 @@
           <w:rPr>
             <w:rStyle w:val="Hyperlink"/>
           </w:rPr>
-          <w:t>https://github.com/plutext/docx4j/blob/VERSION_11_5_7/docx4j-samples-resources/src/main/resources/logback.xml</w:t>
+          <w:t>https://github.com/plutext/docx4j/blob/VERSION_17_2_1/docx4j-samples-resources/src/main/resources/logback.xml</w:t>
         </w:r>
       </w:hyperlink>
       <w:r>
@@ -25638,7 +25638,7 @@
           <w:rPr>
             <w:rStyle w:val="Hyperlink"/>
           </w:rPr>
-          <w:t>https://github.com/plutext/docx4j/tree/VERSION_11_5_14/docx4j-samples-docx-export-fo/src/main/java/org/docx4j/samples</w:t>
+          <w:t>https://github.com/plutext/docx4j/tree/VERSION_17_2_1/docx4j-samples-docx-export-fo/src/main/java/org/docx4j/samples</w:t>
         </w:r>
       </w:hyperlink>
       <w:r>
@@ -26345,7 +26345,7 @@
           <w:rPr>
             <w:rStyle w:val="Hyperlink"/>
           </w:rPr>
-          <w:t>https://github.com/plutext/docx4j/blob/VERSION_11_5_14/docx4j-samples-docx-export-fo/src/main/java/org/docx4j/samples/ManyThreads.java</w:t>
+          <w:t>https://github.com/plutext/docx4j/blob/VERSION_17_2_1/docx4j-samples-docx-export-fo/src/main/java/org/docx4j/samples/ManyThreads.java</w:t>
         </w:r>
       </w:hyperlink>
       <w:r>
@@ -37441,7 +37441,7 @@
           <w:rPr>
             <w:rStyle w:val="Hyperlink"/>
           </w:rPr>
-          <w:t>github.com/plutext/docx4j/tree/VERSION_17_2_0/docs</w:t>
+          <w:t>github.com/plutext/docx4j/tree/VERSION_17_2_1/docs</w:t>
         </w:r>
       </w:hyperlink>
       <w:r>
@@ -41487,7 +41487,7 @@
           <w:rPr>
             <w:rStyle w:val="Hyperlink"/>
           </w:rPr>
-          <w:t>https://github.com/plutext/docx4j/blob/VERSION_11_5_8/docx4j-core/src/main/resources/org/docx4j/fonts/microsoft/MicrosoftFonts.xml</w:t>
+          <w:t>https://github.com/plutext/docx4j/blob/VERSION_17_2_1/docx4j-core/src/main/resources/org/docx4j/fonts/microsoft/MicrosoftFonts.xml</w:t>
         </w:r>
       </w:hyperlink>
       <w:r>
@@ -41503,7 +41503,7 @@
           <w:rPr>
             <w:rStyle w:val="Hyperlink"/>
           </w:rPr>
-          <w:t>https://github.com/plutext/docx4j/blob/VERSION_11_5_8/docx4j-samples-docx4j/src/main/java/org/docx4j/samples/FontsUsed.java</w:t>
+          <w:t>https://github.com/plutext/docx4j/blob/VERSION_17_2_1/docx4j-samples-docx4j/src/main/java/org/docx4j/samples/FontsUsed.java</w:t>
         </w:r>
       </w:hyperlink>
       <w:r>

</xml_diff>

<commit_message>
Getting Started and README: charts drawn in PDF and HTML output
Getting Started: a "Drawing charts" section in the Charts chapter (what PDF and HTML output draw,
docx4j-chart-render through docx4j-export-fo, docx4j.chart.render.textAsShapes and
docx4j.convert.out.html.chartAsPng, pptx's SVG-in-HTML, ChartImages with an example, check, the
ChartsAsImages sample); the limitation "PDF and HTML output don't draw charts yet" replaced by the
charts they don't draw; a "Charts." paragraph in the PDF via XSL FO section; the feature lists and
the HTML output section mention charts. The example compiled and run against the current code.
Edited with docx4j, its TOC updated with Docx4J.updateToc, and the md, html and pdf regenerated by
etc/GenGettingStartedDocs.java against freshly installed 17.3.3-SNAPSHOT jars (59 pages), without
docx4j.properties on the classpath. README: export as HTML and as PDF "including charts".

Co-Authored-By: Claude Opus 5.5 <noreply@anthropic.com>
</commit_message>
<xml_diff>
--- a/docs/Docx4j_GettingStarted.docx
+++ b/docs/Docx4j_GettingStarted.docx
@@ -1,6 +1,6 @@
 
 <file path=word/document.xml><?xml version="1.0" encoding="utf-8"?>
-<w:document xmlns:w="http://schemas.openxmlformats.org/wordprocessingml/2006/main" xmlns:w14="http://schemas.microsoft.com/office/word/2010/wordml" xmlns:w16du="http://schemas.microsoft.com/office/word/2023/wordml/word16du" xmlns:w16sdtdh="http://schemas.microsoft.com/office/word/2020/wordml/sdtdatahash" xmlns:w15="http://schemas.microsoft.com/office/word/2012/wordml" xmlns:w16sdtfl="http://schemas.microsoft.com/office/word/2024/wordml/sdtformatlock" xmlns:r="http://schemas.openxmlformats.org/officeDocument/2006/relationships" xmlns:w16se="http://schemas.microsoft.com/office/word/2015/wordml/symex" xmlns:m="http://schemas.openxmlformats.org/officeDocument/2006/math" xmlns:a="http://schemas.openxmlformats.org/drawingml/2006/main" xmlns:wp="http://schemas.openxmlformats.org/drawingml/2006/wordprocessingDrawing" xmlns:wp14="http://schemas.microsoft.com/office/word/2010/wordprocessingDrawing" xmlns:mc="http://schemas.openxmlformats.org/markup-compatibility/2006" xmlns:a14="http://schemas.microsoft.com/office/drawing/2010/main" xmlns:w16cid="http://schemas.microsoft.com/office/word/2016/wordml/cid" xmlns:sl="http://schemas.openxmlformats.org/schemaLibrary/2006/main" xmlns:wne="http://schemas.microsoft.com/office/word/2006/wordml" xmlns:c="http://schemas.openxmlformats.org/drawingml/2006/chart" xmlns:cdr="http://schemas.openxmlformats.org/drawingml/2006/chartDrawing" xmlns:c14="http://schemas.microsoft.com/office/drawing/2007/8/2/chart" xmlns:dgm="http://schemas.openxmlformats.org/drawingml/2006/diagram" xmlns:pic="http://schemas.openxmlformats.org/drawingml/2006/picture" xmlns:xdr="http://schemas.openxmlformats.org/drawingml/2006/spreadsheetDrawing" xmlns:dsp="http://schemas.microsoft.com/office/drawing/2008/diagram" xmlns:o="urn:schemas-microsoft-com:office:office" xmlns:v="urn:schemas-microsoft-com:vml" xmlns:w10="urn:schemas-microsoft-com:office:word" xmlns:xvml="urn:schemas-microsoft-com:office:excel" xmlns:pvml="urn:schemas-microsoft-com:office:powerpoint" xmlns:cppr="http://schemas.microsoft.com/office/2006/coverPageProps" xmlns:odx="http://opendope.org/xpaths" xmlns:odc="http://opendope.org/conditions" xmlns:odq="http://opendope.org/questions" xmlns:oda="http://opendope.org/answers" xmlns:odi="http://opendope.org/components" xmlns:odgm="http://opendope.org/SmartArt/DataHierarchy" xmlns:b="http://schemas.openxmlformats.org/officeDocument/2006/bibliography" xmlns:msink="http://schemas.microsoft.com/ink/2010/main" xmlns:cdr14="http://schemas.microsoft.com/office/drawing/2010/chartDrawing" xmlns:c15="http://schemas.microsoft.com/office/drawing/2012/chart" xmlns:cs="http://schemas.microsoft.com/office/drawing/2012/chartStyle" xmlns:ns43="http://www.w3.org/1998/Math/MathML" xmlns:ns44="http://www.w3.org/2003/InkML" xmlns:a13cmd="http://schemas.microsoft.com/office/drawing/2013/main/command" xmlns:cx="http://schemas.microsoft.com/office/drawing/2014/chartex" xmlns:c16="http://schemas.microsoft.com/office/drawing/2014/chart" xmlns:dgm1611="http://schemas.microsoft.com/office/drawing/2016/11/diagram" xmlns:c16r3="http://schemas.microsoft.com/office/drawing/2017/03/chart" xmlns:am3d="http://schemas.microsoft.com/office/drawing/2017/model3d" xmlns:an18="http://schemas.microsoft.com/office/drawing/2018/animation" xmlns:anam3d="http://schemas.microsoft.com/office/drawing/2018/animation/model3d" xmlns:iact="http://schemas.microsoft.com/office/powerpoint/2014/inkAction" xmlns:thm15="http://schemas.microsoft.com/office/thememl/2012/main" xmlns:wps="http://schemas.microsoft.com/office/word/2010/wordprocessingShape" xmlns:wpc="http://schemas.microsoft.com/office/word/2010/wordprocessingCanvas" xmlns:wpg="http://schemas.microsoft.com/office/word/2010/wordprocessingGroup" xmlns:w16="http://schemas.microsoft.com/office/word/2018/wordml" xmlns:w16cex="http://schemas.microsoft.com/office/word/2018/wordml/cex" xmlns:cei="http://schemas.microsoft.com/office/word/2026/wordml/cei" xmlns:wetp="http://schemas.microsoft.com/office/webextensions/taskpanes/2010/11" xmlns:we="http://schemas.microsoft.com/office/webextensions/webextension/2010/11" xmlns:comp="http://schemas.openxmlformats.org/drawingml/2006/compatibility" xmlns:lc="http://schemas.openxmlformats.org/drawingml/2006/lockedCanvas" xmlns:dgm14="http://schemas.microsoft.com/office/drawing/2010/diagram" xmlns:a15="http://schemas.microsoft.com/office/drawing/2012/main" xmlns:pic14="http://schemas.microsoft.com/office/drawing/2010/picture" xmlns:c16ac="http://schemas.microsoft.com/office/drawing/2014/chart/ac" xmlns:a16="http://schemas.microsoft.com/office/drawing/2014/main" xmlns:a1611="http://schemas.microsoft.com/office/drawing/2016/11/main" xmlns:dgm1612="http://schemas.microsoft.com/office/drawing/2016/12/diagram" xmlns:a16svg="http://schemas.microsoft.com/office/drawing/2016/SVG/main" xmlns:adec="http://schemas.microsoft.com/office/drawing/2017/decorative" xmlns:a18hc="http://schemas.microsoft.com/office/drawing/2018/hyperlinkcolor" xmlns:wp15="http://schemas.microsoft.com/office/word/2012/wordprocessingDrawing" mc:Ignorable="w14 w15 w16se w16cid w16 w16cex w16sdtdh w16sdtfl w16du wp14">
+<w:document xmlns:w="http://schemas.openxmlformats.org/wordprocessingml/2006/main" xmlns:w14="http://schemas.microsoft.com/office/word/2010/wordml" xmlns:w16du="http://schemas.microsoft.com/office/word/2023/wordml/word16du" xmlns:w16se="http://schemas.microsoft.com/office/word/2015/wordml/symex" xmlns:r="http://schemas.openxmlformats.org/officeDocument/2006/relationships" xmlns:w16sdtdh="http://schemas.microsoft.com/office/word/2020/wordml/sdtdatahash" xmlns:w15="http://schemas.microsoft.com/office/word/2012/wordml" xmlns:w16sdtfl="http://schemas.microsoft.com/office/word/2024/wordml/sdtformatlock" xmlns:m="http://schemas.openxmlformats.org/officeDocument/2006/math" xmlns:a="http://schemas.openxmlformats.org/drawingml/2006/main" xmlns:wp="http://schemas.openxmlformats.org/drawingml/2006/wordprocessingDrawing" xmlns:wp14="http://schemas.microsoft.com/office/word/2010/wordprocessingDrawing" xmlns:mc="http://schemas.openxmlformats.org/markup-compatibility/2006" xmlns:a14="http://schemas.microsoft.com/office/drawing/2010/main" xmlns:w16cid="http://schemas.microsoft.com/office/word/2016/wordml/cid" xmlns:sl="http://schemas.openxmlformats.org/schemaLibrary/2006/main" xmlns:wne="http://schemas.microsoft.com/office/word/2006/wordml" xmlns:c="http://schemas.openxmlformats.org/drawingml/2006/chart" xmlns:cdr="http://schemas.openxmlformats.org/drawingml/2006/chartDrawing" xmlns:c14="http://schemas.microsoft.com/office/drawing/2007/8/2/chart" xmlns:dgm="http://schemas.openxmlformats.org/drawingml/2006/diagram" xmlns:pic="http://schemas.openxmlformats.org/drawingml/2006/picture" xmlns:xdr="http://schemas.openxmlformats.org/drawingml/2006/spreadsheetDrawing" xmlns:dsp="http://schemas.microsoft.com/office/drawing/2008/diagram" xmlns:o="urn:schemas-microsoft-com:office:office" xmlns:v="urn:schemas-microsoft-com:vml" xmlns:w10="urn:schemas-microsoft-com:office:word" xmlns:xvml="urn:schemas-microsoft-com:office:excel" xmlns:pvml="urn:schemas-microsoft-com:office:powerpoint" xmlns:cppr="http://schemas.microsoft.com/office/2006/coverPageProps" xmlns:odx="http://opendope.org/xpaths" xmlns:odc="http://opendope.org/conditions" xmlns:odq="http://opendope.org/questions" xmlns:oda="http://opendope.org/answers" xmlns:odi="http://opendope.org/components" xmlns:odgm="http://opendope.org/SmartArt/DataHierarchy" xmlns:b="http://schemas.openxmlformats.org/officeDocument/2006/bibliography" xmlns:msink="http://schemas.microsoft.com/ink/2010/main" xmlns:cdr14="http://schemas.microsoft.com/office/drawing/2010/chartDrawing" xmlns:c15="http://schemas.microsoft.com/office/drawing/2012/chart" xmlns:cs="http://schemas.microsoft.com/office/drawing/2012/chartStyle" xmlns:ns43="http://www.w3.org/1998/Math/MathML" xmlns:ns44="http://www.w3.org/2003/InkML" xmlns:a13cmd="http://schemas.microsoft.com/office/drawing/2013/main/command" xmlns:cx="http://schemas.microsoft.com/office/drawing/2014/chartex" xmlns:c16="http://schemas.microsoft.com/office/drawing/2014/chart" xmlns:dgm1611="http://schemas.microsoft.com/office/drawing/2016/11/diagram" xmlns:c16r3="http://schemas.microsoft.com/office/drawing/2017/03/chart" xmlns:am3d="http://schemas.microsoft.com/office/drawing/2017/model3d" xmlns:an18="http://schemas.microsoft.com/office/drawing/2018/animation" xmlns:anam3d="http://schemas.microsoft.com/office/drawing/2018/animation/model3d" xmlns:iact="http://schemas.microsoft.com/office/powerpoint/2014/inkAction" xmlns:thm15="http://schemas.microsoft.com/office/thememl/2012/main" xmlns:wps="http://schemas.microsoft.com/office/word/2010/wordprocessingShape" xmlns:wpc="http://schemas.microsoft.com/office/word/2010/wordprocessingCanvas" xmlns:wpg="http://schemas.microsoft.com/office/word/2010/wordprocessingGroup" xmlns:w16="http://schemas.microsoft.com/office/word/2018/wordml" xmlns:w16cex="http://schemas.microsoft.com/office/word/2018/wordml/cex" xmlns:cei="http://schemas.microsoft.com/office/word/2026/wordml/cei" xmlns:wetp="http://schemas.microsoft.com/office/webextensions/taskpanes/2010/11" xmlns:we="http://schemas.microsoft.com/office/webextensions/webextension/2010/11" xmlns:comp="http://schemas.openxmlformats.org/drawingml/2006/compatibility" xmlns:lc="http://schemas.openxmlformats.org/drawingml/2006/lockedCanvas" xmlns:dgm14="http://schemas.microsoft.com/office/drawing/2010/diagram" xmlns:a15="http://schemas.microsoft.com/office/drawing/2012/main" xmlns:pic14="http://schemas.microsoft.com/office/drawing/2010/picture" xmlns:c16ac="http://schemas.microsoft.com/office/drawing/2014/chart/ac" xmlns:a16="http://schemas.microsoft.com/office/drawing/2014/main" xmlns:a1611="http://schemas.microsoft.com/office/drawing/2016/11/main" xmlns:dgm1612="http://schemas.microsoft.com/office/drawing/2016/12/diagram" xmlns:a16svg="http://schemas.microsoft.com/office/drawing/2016/SVG/main" xmlns:adec="http://schemas.microsoft.com/office/drawing/2017/decorative" xmlns:a18hc="http://schemas.microsoft.com/office/drawing/2018/hyperlinkcolor" xmlns:wp15="http://schemas.microsoft.com/office/word/2012/wordprocessingDrawing" mc:Ignorable="w14 w15 w16se w16cid w16 w16cex w16sdtdh w16sdtfl w16du wp14">
   <w:body>
     <!-- Modified by docx4j 17.3.3-SNAPSHOT (Apache licensed) using REFERENCE JAXB in Arch Linux Java 21.0.12 on Linux -->
     <w:p>
@@ -61,7 +61,7 @@
           <w:r>
             <w:fldChar w:fldCharType="separate"/>
           </w:r>
-          <w:hyperlink w:anchor="_Toc877617319">
+          <w:hyperlink w:anchor="_Toc440435403">
             <w:r>
               <w:rPr>
                 <w:rStyle w:val="Hyperlink"/>
@@ -87,7 +87,7 @@
                 <w:noProof/>
                 <w:webHidden/>
               </w:rPr>
-              <w:instrText xml:space="preserve">PAGEREF _Toc877617319 \h</w:instrText>
+              <w:instrText xml:space="preserve">PAGEREF _Toc440435403 \h</w:instrText>
             </w:r>
             <w:r>
               <w:rPr>
@@ -128,7 +128,7 @@
               <w:noProof/>
             </w:rPr>
           </w:pPr>
-          <w:hyperlink w:anchor="_Toc877617320">
+          <w:hyperlink w:anchor="_Toc440435404">
             <w:r>
               <w:rPr>
                 <w:rStyle w:val="Hyperlink"/>
@@ -154,7 +154,7 @@
                 <w:noProof/>
                 <w:webHidden/>
               </w:rPr>
-              <w:instrText xml:space="preserve">PAGEREF _Toc877617320 \h</w:instrText>
+              <w:instrText xml:space="preserve">PAGEREF _Toc440435404 \h</w:instrText>
             </w:r>
             <w:r>
               <w:rPr>
@@ -195,7 +195,7 @@
               <w:noProof/>
             </w:rPr>
           </w:pPr>
-          <w:hyperlink w:anchor="_Toc877617321">
+          <w:hyperlink w:anchor="_Toc440435405">
             <w:r>
               <w:rPr>
                 <w:rStyle w:val="Hyperlink"/>
@@ -221,7 +221,7 @@
                 <w:noProof/>
                 <w:webHidden/>
               </w:rPr>
-              <w:instrText xml:space="preserve">PAGEREF _Toc877617321 \h</w:instrText>
+              <w:instrText xml:space="preserve">PAGEREF _Toc440435405 \h</w:instrText>
             </w:r>
             <w:r>
               <w:rPr>
@@ -262,7 +262,7 @@
               <w:noProof/>
             </w:rPr>
           </w:pPr>
-          <w:hyperlink w:anchor="_Toc877617322">
+          <w:hyperlink w:anchor="_Toc440435406">
             <w:r>
               <w:rPr>
                 <w:rStyle w:val="Hyperlink"/>
@@ -288,7 +288,7 @@
                 <w:noProof/>
                 <w:webHidden/>
               </w:rPr>
-              <w:instrText xml:space="preserve">PAGEREF _Toc877617322 \h</w:instrText>
+              <w:instrText xml:space="preserve">PAGEREF _Toc440435406 \h</w:instrText>
             </w:r>
             <w:r>
               <w:rPr>
@@ -329,7 +329,7 @@
               <w:noProof/>
             </w:rPr>
           </w:pPr>
-          <w:hyperlink w:anchor="_Toc877617323">
+          <w:hyperlink w:anchor="_Toc440435407">
             <w:r>
               <w:rPr>
                 <w:rStyle w:val="Hyperlink"/>
@@ -355,7 +355,7 @@
                 <w:noProof/>
                 <w:webHidden/>
               </w:rPr>
-              <w:instrText xml:space="preserve">PAGEREF _Toc877617323 \h</w:instrText>
+              <w:instrText xml:space="preserve">PAGEREF _Toc440435407 \h</w:instrText>
             </w:r>
             <w:r>
               <w:rPr>
@@ -396,7 +396,7 @@
               <w:noProof/>
             </w:rPr>
           </w:pPr>
-          <w:hyperlink w:anchor="_Toc877617324">
+          <w:hyperlink w:anchor="_Toc440435408">
             <w:r>
               <w:rPr>
                 <w:rStyle w:val="Hyperlink"/>
@@ -422,7 +422,7 @@
                 <w:noProof/>
                 <w:webHidden/>
               </w:rPr>
-              <w:instrText xml:space="preserve">PAGEREF _Toc877617324 \h</w:instrText>
+              <w:instrText xml:space="preserve">PAGEREF _Toc440435408 \h</w:instrText>
             </w:r>
             <w:r>
               <w:rPr>
@@ -463,7 +463,7 @@
               <w:noProof/>
             </w:rPr>
           </w:pPr>
-          <w:hyperlink w:anchor="_Toc877617325">
+          <w:hyperlink w:anchor="_Toc440435409">
             <w:r>
               <w:rPr>
                 <w:rStyle w:val="Hyperlink"/>
@@ -489,7 +489,7 @@
                 <w:noProof/>
                 <w:webHidden/>
               </w:rPr>
-              <w:instrText xml:space="preserve">PAGEREF _Toc877617325 \h</w:instrText>
+              <w:instrText xml:space="preserve">PAGEREF _Toc440435409 \h</w:instrText>
             </w:r>
             <w:r>
               <w:rPr>
@@ -530,7 +530,7 @@
               <w:noProof/>
             </w:rPr>
           </w:pPr>
-          <w:hyperlink w:anchor="_Toc877617326">
+          <w:hyperlink w:anchor="_Toc440435410">
             <w:r>
               <w:rPr>
                 <w:rStyle w:val="Hyperlink"/>
@@ -556,7 +556,7 @@
                 <w:noProof/>
                 <w:webHidden/>
               </w:rPr>
-              <w:instrText xml:space="preserve">PAGEREF _Toc877617326 \h</w:instrText>
+              <w:instrText xml:space="preserve">PAGEREF _Toc440435410 \h</w:instrText>
             </w:r>
             <w:r>
               <w:rPr>
@@ -597,7 +597,7 @@
               <w:noProof/>
             </w:rPr>
           </w:pPr>
-          <w:hyperlink w:anchor="_Toc877617327">
+          <w:hyperlink w:anchor="_Toc440435411">
             <w:r>
               <w:rPr>
                 <w:rStyle w:val="Hyperlink"/>
@@ -623,7 +623,7 @@
                 <w:noProof/>
                 <w:webHidden/>
               </w:rPr>
-              <w:instrText xml:space="preserve">PAGEREF _Toc877617327 \h</w:instrText>
+              <w:instrText xml:space="preserve">PAGEREF _Toc440435411 \h</w:instrText>
             </w:r>
             <w:r>
               <w:rPr>
@@ -664,7 +664,7 @@
               <w:noProof/>
             </w:rPr>
           </w:pPr>
-          <w:hyperlink w:anchor="_Toc877617328">
+          <w:hyperlink w:anchor="_Toc440435412">
             <w:r>
               <w:rPr>
                 <w:rStyle w:val="Hyperlink"/>
@@ -690,7 +690,7 @@
                 <w:noProof/>
                 <w:webHidden/>
               </w:rPr>
-              <w:instrText xml:space="preserve">PAGEREF _Toc877617328 \h</w:instrText>
+              <w:instrText xml:space="preserve">PAGEREF _Toc440435412 \h</w:instrText>
             </w:r>
             <w:r>
               <w:rPr>
@@ -731,7 +731,7 @@
               <w:noProof/>
             </w:rPr>
           </w:pPr>
-          <w:hyperlink w:anchor="_Toc877617329">
+          <w:hyperlink w:anchor="_Toc440435413">
             <w:r>
               <w:rPr>
                 <w:rStyle w:val="Hyperlink"/>
@@ -757,7 +757,7 @@
                 <w:noProof/>
                 <w:webHidden/>
               </w:rPr>
-              <w:instrText xml:space="preserve">PAGEREF _Toc877617329 \h</w:instrText>
+              <w:instrText xml:space="preserve">PAGEREF _Toc440435413 \h</w:instrText>
             </w:r>
             <w:r>
               <w:rPr>
@@ -798,7 +798,7 @@
               <w:noProof/>
             </w:rPr>
           </w:pPr>
-          <w:hyperlink w:anchor="_Toc877617330">
+          <w:hyperlink w:anchor="_Toc440435414">
             <w:r>
               <w:rPr>
                 <w:rStyle w:val="Hyperlink"/>
@@ -830,7 +830,7 @@
                 <w:noProof/>
                 <w:webHidden/>
               </w:rPr>
-              <w:instrText xml:space="preserve">PAGEREF _Toc877617330 \h</w:instrText>
+              <w:instrText xml:space="preserve">PAGEREF _Toc440435414 \h</w:instrText>
             </w:r>
             <w:r>
               <w:rPr>
@@ -871,7 +871,7 @@
               <w:noProof/>
             </w:rPr>
           </w:pPr>
-          <w:hyperlink w:anchor="_Toc877617331">
+          <w:hyperlink w:anchor="_Toc440435415">
             <w:r>
               <w:rPr>
                 <w:rStyle w:val="Hyperlink"/>
@@ -903,7 +903,7 @@
                 <w:noProof/>
                 <w:webHidden/>
               </w:rPr>
-              <w:instrText xml:space="preserve">PAGEREF _Toc877617331 \h</w:instrText>
+              <w:instrText xml:space="preserve">PAGEREF _Toc440435415 \h</w:instrText>
             </w:r>
             <w:r>
               <w:rPr>
@@ -944,7 +944,7 @@
               <w:noProof/>
             </w:rPr>
           </w:pPr>
-          <w:hyperlink w:anchor="_Toc877617332">
+          <w:hyperlink w:anchor="_Toc440435416">
             <w:r>
               <w:rPr>
                 <w:rStyle w:val="Hyperlink"/>
@@ -970,7 +970,7 @@
                 <w:noProof/>
                 <w:webHidden/>
               </w:rPr>
-              <w:instrText xml:space="preserve">PAGEREF _Toc877617332 \h</w:instrText>
+              <w:instrText xml:space="preserve">PAGEREF _Toc440435416 \h</w:instrText>
             </w:r>
             <w:r>
               <w:rPr>
@@ -1011,7 +1011,7 @@
               <w:noProof/>
             </w:rPr>
           </w:pPr>
-          <w:hyperlink w:anchor="_Toc877617333">
+          <w:hyperlink w:anchor="_Toc440435417">
             <w:r>
               <w:rPr>
                 <w:rStyle w:val="Hyperlink"/>
@@ -1037,7 +1037,7 @@
                 <w:noProof/>
                 <w:webHidden/>
               </w:rPr>
-              <w:instrText xml:space="preserve">PAGEREF _Toc877617333 \h</w:instrText>
+              <w:instrText xml:space="preserve">PAGEREF _Toc440435417 \h</w:instrText>
             </w:r>
             <w:r>
               <w:rPr>
@@ -1078,7 +1078,7 @@
               <w:noProof/>
             </w:rPr>
           </w:pPr>
-          <w:hyperlink w:anchor="_Toc877617334">
+          <w:hyperlink w:anchor="_Toc440435418">
             <w:r>
               <w:rPr>
                 <w:rStyle w:val="Hyperlink"/>
@@ -1110,7 +1110,7 @@
                 <w:noProof/>
                 <w:webHidden/>
               </w:rPr>
-              <w:instrText xml:space="preserve">PAGEREF _Toc877617334 \h</w:instrText>
+              <w:instrText xml:space="preserve">PAGEREF _Toc440435418 \h</w:instrText>
             </w:r>
             <w:r>
               <w:rPr>
@@ -1151,7 +1151,7 @@
               <w:noProof/>
             </w:rPr>
           </w:pPr>
-          <w:hyperlink w:anchor="_Toc877617335">
+          <w:hyperlink w:anchor="_Toc440435419">
             <w:r>
               <w:rPr>
                 <w:rStyle w:val="Hyperlink"/>
@@ -1177,7 +1177,7 @@
                 <w:noProof/>
                 <w:webHidden/>
               </w:rPr>
-              <w:instrText xml:space="preserve">PAGEREF _Toc877617335 \h</w:instrText>
+              <w:instrText xml:space="preserve">PAGEREF _Toc440435419 \h</w:instrText>
             </w:r>
             <w:r>
               <w:rPr>
@@ -1218,7 +1218,7 @@
               <w:noProof/>
             </w:rPr>
           </w:pPr>
-          <w:hyperlink w:anchor="_Toc877617336">
+          <w:hyperlink w:anchor="_Toc440435420">
             <w:r>
               <w:rPr>
                 <w:rStyle w:val="Hyperlink"/>
@@ -1244,7 +1244,7 @@
                 <w:noProof/>
                 <w:webHidden/>
               </w:rPr>
-              <w:instrText xml:space="preserve">PAGEREF _Toc877617336 \h</w:instrText>
+              <w:instrText xml:space="preserve">PAGEREF _Toc440435420 \h</w:instrText>
             </w:r>
             <w:r>
               <w:rPr>
@@ -1285,7 +1285,7 @@
               <w:noProof/>
             </w:rPr>
           </w:pPr>
-          <w:hyperlink w:anchor="_Toc877617337">
+          <w:hyperlink w:anchor="_Toc440435421">
             <w:r>
               <w:rPr>
                 <w:rStyle w:val="Hyperlink"/>
@@ -1311,7 +1311,7 @@
                 <w:noProof/>
                 <w:webHidden/>
               </w:rPr>
-              <w:instrText xml:space="preserve">PAGEREF _Toc877617337 \h</w:instrText>
+              <w:instrText xml:space="preserve">PAGEREF _Toc440435421 \h</w:instrText>
             </w:r>
             <w:r>
               <w:rPr>
@@ -1352,7 +1352,7 @@
               <w:noProof/>
             </w:rPr>
           </w:pPr>
-          <w:hyperlink w:anchor="_Toc877617338">
+          <w:hyperlink w:anchor="_Toc440435422">
             <w:r>
               <w:rPr>
                 <w:rStyle w:val="Hyperlink"/>
@@ -1379,7 +1379,7 @@
                 <w:noProof/>
                 <w:webHidden/>
               </w:rPr>
-              <w:instrText xml:space="preserve">PAGEREF _Toc877617338 \h</w:instrText>
+              <w:instrText xml:space="preserve">PAGEREF _Toc440435422 \h</w:instrText>
             </w:r>
             <w:r>
               <w:rPr>
@@ -1420,7 +1420,7 @@
               <w:noProof/>
             </w:rPr>
           </w:pPr>
-          <w:hyperlink w:anchor="_Toc877617339">
+          <w:hyperlink w:anchor="_Toc440435423">
             <w:r>
               <w:rPr>
                 <w:rStyle w:val="Hyperlink"/>
@@ -1452,7 +1452,7 @@
                 <w:noProof/>
                 <w:webHidden/>
               </w:rPr>
-              <w:instrText xml:space="preserve">PAGEREF _Toc877617339 \h</w:instrText>
+              <w:instrText xml:space="preserve">PAGEREF _Toc440435423 \h</w:instrText>
             </w:r>
             <w:r>
               <w:rPr>
@@ -1493,7 +1493,7 @@
               <w:noProof/>
             </w:rPr>
           </w:pPr>
-          <w:hyperlink w:anchor="_Toc877617340">
+          <w:hyperlink w:anchor="_Toc440435424">
             <w:r>
               <w:rPr>
                 <w:rStyle w:val="Hyperlink"/>
@@ -1527,7 +1527,7 @@
                 <w:noProof/>
                 <w:webHidden/>
               </w:rPr>
-              <w:instrText xml:space="preserve">PAGEREF _Toc877617340 \h</w:instrText>
+              <w:instrText xml:space="preserve">PAGEREF _Toc440435424 \h</w:instrText>
             </w:r>
             <w:r>
               <w:rPr>
@@ -1568,7 +1568,7 @@
               <w:noProof/>
             </w:rPr>
           </w:pPr>
-          <w:hyperlink w:anchor="_Toc877617341">
+          <w:hyperlink w:anchor="_Toc440435425">
             <w:r>
               <w:rPr>
                 <w:rStyle w:val="Hyperlink"/>
@@ -1595,7 +1595,7 @@
                 <w:noProof/>
                 <w:webHidden/>
               </w:rPr>
-              <w:instrText xml:space="preserve">PAGEREF _Toc877617341 \h</w:instrText>
+              <w:instrText xml:space="preserve">PAGEREF _Toc440435425 \h</w:instrText>
             </w:r>
             <w:r>
               <w:rPr>
@@ -1636,7 +1636,7 @@
               <w:noProof/>
             </w:rPr>
           </w:pPr>
-          <w:hyperlink w:anchor="_Toc877617342">
+          <w:hyperlink w:anchor="_Toc440435426">
             <w:r>
               <w:rPr>
                 <w:rStyle w:val="Hyperlink"/>
@@ -1670,7 +1670,7 @@
                 <w:noProof/>
                 <w:webHidden/>
               </w:rPr>
-              <w:instrText xml:space="preserve">PAGEREF _Toc877617342 \h</w:instrText>
+              <w:instrText xml:space="preserve">PAGEREF _Toc440435426 \h</w:instrText>
             </w:r>
             <w:r>
               <w:rPr>
@@ -1711,7 +1711,7 @@
               <w:noProof/>
             </w:rPr>
           </w:pPr>
-          <w:hyperlink w:anchor="_Toc877617343">
+          <w:hyperlink w:anchor="_Toc440435427">
             <w:r>
               <w:rPr>
                 <w:rStyle w:val="Hyperlink"/>
@@ -1738,7 +1738,7 @@
                 <w:noProof/>
                 <w:webHidden/>
               </w:rPr>
-              <w:instrText xml:space="preserve">PAGEREF _Toc877617343 \h</w:instrText>
+              <w:instrText xml:space="preserve">PAGEREF _Toc440435427 \h</w:instrText>
             </w:r>
             <w:r>
               <w:rPr>
@@ -1779,7 +1779,7 @@
               <w:noProof/>
             </w:rPr>
           </w:pPr>
-          <w:hyperlink w:anchor="_Toc877617344">
+          <w:hyperlink w:anchor="_Toc440435428">
             <w:r>
               <w:rPr>
                 <w:rStyle w:val="Hyperlink"/>
@@ -1806,7 +1806,7 @@
                 <w:noProof/>
                 <w:webHidden/>
               </w:rPr>
-              <w:instrText xml:space="preserve">PAGEREF _Toc877617344 \h</w:instrText>
+              <w:instrText xml:space="preserve">PAGEREF _Toc440435428 \h</w:instrText>
             </w:r>
             <w:r>
               <w:rPr>
@@ -1847,7 +1847,7 @@
               <w:noProof/>
             </w:rPr>
           </w:pPr>
-          <w:hyperlink w:anchor="_Toc877617345">
+          <w:hyperlink w:anchor="_Toc440435429">
             <w:r>
               <w:rPr>
                 <w:rStyle w:val="Hyperlink"/>
@@ -1874,7 +1874,7 @@
                 <w:noProof/>
                 <w:webHidden/>
               </w:rPr>
-              <w:instrText xml:space="preserve">PAGEREF _Toc877617345 \h</w:instrText>
+              <w:instrText xml:space="preserve">PAGEREF _Toc440435429 \h</w:instrText>
             </w:r>
             <w:r>
               <w:rPr>
@@ -1915,7 +1915,7 @@
               <w:noProof/>
             </w:rPr>
           </w:pPr>
-          <w:hyperlink w:anchor="_Toc877617346">
+          <w:hyperlink w:anchor="_Toc440435430">
             <w:r>
               <w:rPr>
                 <w:rStyle w:val="Hyperlink"/>
@@ -1942,7 +1942,7 @@
                 <w:noProof/>
                 <w:webHidden/>
               </w:rPr>
-              <w:instrText xml:space="preserve">PAGEREF _Toc877617346 \h</w:instrText>
+              <w:instrText xml:space="preserve">PAGEREF _Toc440435430 \h</w:instrText>
             </w:r>
             <w:r>
               <w:rPr>
@@ -1983,7 +1983,7 @@
               <w:noProof/>
             </w:rPr>
           </w:pPr>
-          <w:hyperlink w:anchor="_Toc877617347">
+          <w:hyperlink w:anchor="_Toc440435431">
             <w:r>
               <w:rPr>
                 <w:rStyle w:val="Hyperlink"/>
@@ -2009,7 +2009,7 @@
                 <w:noProof/>
                 <w:webHidden/>
               </w:rPr>
-              <w:instrText xml:space="preserve">PAGEREF _Toc877617347 \h</w:instrText>
+              <w:instrText xml:space="preserve">PAGEREF _Toc440435431 \h</w:instrText>
             </w:r>
             <w:r>
               <w:rPr>
@@ -2050,7 +2050,7 @@
               <w:noProof/>
             </w:rPr>
           </w:pPr>
-          <w:hyperlink w:anchor="_Toc877617348">
+          <w:hyperlink w:anchor="_Toc440435432">
             <w:r>
               <w:rPr>
                 <w:rStyle w:val="Hyperlink"/>
@@ -2076,7 +2076,7 @@
                 <w:noProof/>
                 <w:webHidden/>
               </w:rPr>
-              <w:instrText xml:space="preserve">PAGEREF _Toc877617348 \h</w:instrText>
+              <w:instrText xml:space="preserve">PAGEREF _Toc440435432 \h</w:instrText>
             </w:r>
             <w:r>
               <w:rPr>
@@ -2117,7 +2117,7 @@
               <w:noProof/>
             </w:rPr>
           </w:pPr>
-          <w:hyperlink w:anchor="_Toc877617349">
+          <w:hyperlink w:anchor="_Toc440435433">
             <w:r>
               <w:rPr>
                 <w:rStyle w:val="Hyperlink"/>
@@ -2144,7 +2144,7 @@
                 <w:noProof/>
                 <w:webHidden/>
               </w:rPr>
-              <w:instrText xml:space="preserve">PAGEREF _Toc877617349 \h</w:instrText>
+              <w:instrText xml:space="preserve">PAGEREF _Toc440435433 \h</w:instrText>
             </w:r>
             <w:r>
               <w:rPr>
@@ -2185,7 +2185,7 @@
               <w:noProof/>
             </w:rPr>
           </w:pPr>
-          <w:hyperlink w:anchor="_Toc877617350">
+          <w:hyperlink w:anchor="_Toc440435434">
             <w:r>
               <w:rPr>
                 <w:rStyle w:val="Hyperlink"/>
@@ -2212,7 +2212,7 @@
                 <w:noProof/>
                 <w:webHidden/>
               </w:rPr>
-              <w:instrText xml:space="preserve">PAGEREF _Toc877617350 \h</w:instrText>
+              <w:instrText xml:space="preserve">PAGEREF _Toc440435434 \h</w:instrText>
             </w:r>
             <w:r>
               <w:rPr>
@@ -2253,7 +2253,7 @@
               <w:noProof/>
             </w:rPr>
           </w:pPr>
-          <w:hyperlink w:anchor="_Toc877617351">
+          <w:hyperlink w:anchor="_Toc440435435">
             <w:r>
               <w:rPr>
                 <w:rStyle w:val="Hyperlink"/>
@@ -2280,7 +2280,7 @@
                 <w:noProof/>
                 <w:webHidden/>
               </w:rPr>
-              <w:instrText xml:space="preserve">PAGEREF _Toc877617351 \h</w:instrText>
+              <w:instrText xml:space="preserve">PAGEREF _Toc440435435 \h</w:instrText>
             </w:r>
             <w:r>
               <w:rPr>
@@ -2321,7 +2321,7 @@
               <w:noProof/>
             </w:rPr>
           </w:pPr>
-          <w:hyperlink w:anchor="_Toc877617352">
+          <w:hyperlink w:anchor="_Toc440435436">
             <w:r>
               <w:rPr>
                 <w:rStyle w:val="Hyperlink"/>
@@ -2355,7 +2355,7 @@
                 <w:noProof/>
                 <w:webHidden/>
               </w:rPr>
-              <w:instrText xml:space="preserve">PAGEREF _Toc877617352 \h</w:instrText>
+              <w:instrText xml:space="preserve">PAGEREF _Toc440435436 \h</w:instrText>
             </w:r>
             <w:r>
               <w:rPr>
@@ -2396,7 +2396,7 @@
               <w:noProof/>
             </w:rPr>
           </w:pPr>
-          <w:hyperlink w:anchor="_Toc877617353">
+          <w:hyperlink w:anchor="_Toc440435437">
             <w:r>
               <w:rPr>
                 <w:rStyle w:val="Hyperlink"/>
@@ -2423,7 +2423,7 @@
                 <w:noProof/>
                 <w:webHidden/>
               </w:rPr>
-              <w:instrText xml:space="preserve">PAGEREF _Toc877617353 \h</w:instrText>
+              <w:instrText xml:space="preserve">PAGEREF _Toc440435437 \h</w:instrText>
             </w:r>
             <w:r>
               <w:rPr>
@@ -2464,7 +2464,7 @@
               <w:noProof/>
             </w:rPr>
           </w:pPr>
-          <w:hyperlink w:anchor="_Toc877617354">
+          <w:hyperlink w:anchor="_Toc440435438">
             <w:r>
               <w:rPr>
                 <w:rStyle w:val="Hyperlink"/>
@@ -2490,7 +2490,7 @@
                 <w:noProof/>
                 <w:webHidden/>
               </w:rPr>
-              <w:instrText xml:space="preserve">PAGEREF _Toc877617354 \h</w:instrText>
+              <w:instrText xml:space="preserve">PAGEREF _Toc440435438 \h</w:instrText>
             </w:r>
             <w:r>
               <w:rPr>
@@ -2531,7 +2531,7 @@
               <w:noProof/>
             </w:rPr>
           </w:pPr>
-          <w:hyperlink w:anchor="_Toc877617355">
+          <w:hyperlink w:anchor="_Toc440435439">
             <w:r>
               <w:rPr>
                 <w:rStyle w:val="Hyperlink"/>
@@ -2558,7 +2558,7 @@
                 <w:noProof/>
                 <w:webHidden/>
               </w:rPr>
-              <w:instrText xml:space="preserve">PAGEREF _Toc877617355 \h</w:instrText>
+              <w:instrText xml:space="preserve">PAGEREF _Toc440435439 \h</w:instrText>
             </w:r>
             <w:r>
               <w:rPr>
@@ -2599,7 +2599,7 @@
               <w:noProof/>
             </w:rPr>
           </w:pPr>
-          <w:hyperlink w:anchor="_Toc877617356">
+          <w:hyperlink w:anchor="_Toc440435440">
             <w:r>
               <w:rPr>
                 <w:rStyle w:val="Hyperlink"/>
@@ -2625,7 +2625,7 @@
                 <w:noProof/>
                 <w:webHidden/>
               </w:rPr>
-              <w:instrText xml:space="preserve">PAGEREF _Toc877617356 \h</w:instrText>
+              <w:instrText xml:space="preserve">PAGEREF _Toc440435440 \h</w:instrText>
             </w:r>
             <w:r>
               <w:rPr>
@@ -2666,7 +2666,7 @@
               <w:noProof/>
             </w:rPr>
           </w:pPr>
-          <w:hyperlink w:anchor="_Toc877617357">
+          <w:hyperlink w:anchor="_Toc440435441">
             <w:r>
               <w:rPr>
                 <w:rStyle w:val="Hyperlink"/>
@@ -2692,7 +2692,7 @@
                 <w:noProof/>
                 <w:webHidden/>
               </w:rPr>
-              <w:instrText xml:space="preserve">PAGEREF _Toc877617357 \h</w:instrText>
+              <w:instrText xml:space="preserve">PAGEREF _Toc440435441 \h</w:instrText>
             </w:r>
             <w:r>
               <w:rPr>
@@ -2733,7 +2733,7 @@
               <w:noProof/>
             </w:rPr>
           </w:pPr>
-          <w:hyperlink w:anchor="_Toc877617358">
+          <w:hyperlink w:anchor="_Toc440435442">
             <w:r>
               <w:rPr>
                 <w:rStyle w:val="Hyperlink"/>
@@ -2759,7 +2759,7 @@
                 <w:noProof/>
                 <w:webHidden/>
               </w:rPr>
-              <w:instrText xml:space="preserve">PAGEREF _Toc877617358 \h</w:instrText>
+              <w:instrText xml:space="preserve">PAGEREF _Toc440435442 \h</w:instrText>
             </w:r>
             <w:r>
               <w:rPr>
@@ -2800,7 +2800,7 @@
               <w:noProof/>
             </w:rPr>
           </w:pPr>
-          <w:hyperlink w:anchor="_Toc877617359">
+          <w:hyperlink w:anchor="_Toc440435443">
             <w:r>
               <w:rPr>
                 <w:rStyle w:val="Hyperlink"/>
@@ -2826,7 +2826,7 @@
                 <w:noProof/>
                 <w:webHidden/>
               </w:rPr>
-              <w:instrText xml:space="preserve">PAGEREF _Toc877617359 \h</w:instrText>
+              <w:instrText xml:space="preserve">PAGEREF _Toc440435443 \h</w:instrText>
             </w:r>
             <w:r>
               <w:rPr>
@@ -2867,7 +2867,7 @@
               <w:noProof/>
             </w:rPr>
           </w:pPr>
-          <w:hyperlink w:anchor="_Toc877617360">
+          <w:hyperlink w:anchor="_Toc440435444">
             <w:r>
               <w:rPr>
                 <w:rStyle w:val="Hyperlink"/>
@@ -2894,7 +2894,7 @@
                 <w:noProof/>
                 <w:webHidden/>
               </w:rPr>
-              <w:instrText xml:space="preserve">PAGEREF _Toc877617360 \h</w:instrText>
+              <w:instrText xml:space="preserve">PAGEREF _Toc440435444 \h</w:instrText>
             </w:r>
             <w:r>
               <w:rPr>
@@ -2935,7 +2935,7 @@
               <w:noProof/>
             </w:rPr>
           </w:pPr>
-          <w:hyperlink w:anchor="_Toc877617361">
+          <w:hyperlink w:anchor="_Toc440435445">
             <w:r>
               <w:rPr>
                 <w:rStyle w:val="Hyperlink"/>
@@ -2962,7 +2962,7 @@
                 <w:noProof/>
                 <w:webHidden/>
               </w:rPr>
-              <w:instrText xml:space="preserve">PAGEREF _Toc877617361 \h</w:instrText>
+              <w:instrText xml:space="preserve">PAGEREF _Toc440435445 \h</w:instrText>
             </w:r>
             <w:r>
               <w:rPr>
@@ -3003,7 +3003,7 @@
               <w:noProof/>
             </w:rPr>
           </w:pPr>
-          <w:hyperlink w:anchor="_Toc877617362">
+          <w:hyperlink w:anchor="_Toc440435446">
             <w:r>
               <w:rPr>
                 <w:rStyle w:val="Hyperlink"/>
@@ -3029,7 +3029,7 @@
                 <w:noProof/>
                 <w:webHidden/>
               </w:rPr>
-              <w:instrText xml:space="preserve">PAGEREF _Toc877617362 \h</w:instrText>
+              <w:instrText xml:space="preserve">PAGEREF _Toc440435446 \h</w:instrText>
             </w:r>
             <w:r>
               <w:rPr>
@@ -3070,7 +3070,7 @@
               <w:noProof/>
             </w:rPr>
           </w:pPr>
-          <w:hyperlink w:anchor="_Toc877617363">
+          <w:hyperlink w:anchor="_Toc440435447">
             <w:r>
               <w:rPr>
                 <w:rStyle w:val="Hyperlink"/>
@@ -3096,7 +3096,7 @@
                 <w:noProof/>
                 <w:webHidden/>
               </w:rPr>
-              <w:instrText xml:space="preserve">PAGEREF _Toc877617363 \h</w:instrText>
+              <w:instrText xml:space="preserve">PAGEREF _Toc440435447 \h</w:instrText>
             </w:r>
             <w:r>
               <w:rPr>
@@ -3137,7 +3137,7 @@
               <w:noProof/>
             </w:rPr>
           </w:pPr>
-          <w:hyperlink w:anchor="_Toc877617364">
+          <w:hyperlink w:anchor="_Toc440435448">
             <w:r>
               <w:rPr>
                 <w:rStyle w:val="Hyperlink"/>
@@ -3163,7 +3163,7 @@
                 <w:noProof/>
                 <w:webHidden/>
               </w:rPr>
-              <w:instrText xml:space="preserve">PAGEREF _Toc877617364 \h</w:instrText>
+              <w:instrText xml:space="preserve">PAGEREF _Toc440435448 \h</w:instrText>
             </w:r>
             <w:r>
               <w:rPr>
@@ -3204,7 +3204,7 @@
               <w:noProof/>
             </w:rPr>
           </w:pPr>
-          <w:hyperlink w:anchor="_Toc877617365">
+          <w:hyperlink w:anchor="_Toc440435449">
             <w:r>
               <w:rPr>
                 <w:rStyle w:val="Hyperlink"/>
@@ -3238,7 +3238,7 @@
                 <w:noProof/>
                 <w:webHidden/>
               </w:rPr>
-              <w:instrText xml:space="preserve">PAGEREF _Toc877617365 \h</w:instrText>
+              <w:instrText xml:space="preserve">PAGEREF _Toc440435449 \h</w:instrText>
             </w:r>
             <w:r>
               <w:rPr>
@@ -3279,7 +3279,7 @@
               <w:noProof/>
             </w:rPr>
           </w:pPr>
-          <w:hyperlink w:anchor="_Toc877617366">
+          <w:hyperlink w:anchor="_Toc440435450">
             <w:r>
               <w:rPr>
                 <w:rStyle w:val="Hyperlink"/>
@@ -3305,7 +3305,7 @@
                 <w:noProof/>
                 <w:webHidden/>
               </w:rPr>
-              <w:instrText xml:space="preserve">PAGEREF _Toc877617366 \h</w:instrText>
+              <w:instrText xml:space="preserve">PAGEREF _Toc440435450 \h</w:instrText>
             </w:r>
             <w:r>
               <w:rPr>
@@ -3346,7 +3346,7 @@
               <w:noProof/>
             </w:rPr>
           </w:pPr>
-          <w:hyperlink w:anchor="_Toc877617367">
+          <w:hyperlink w:anchor="_Toc440435451">
             <w:r>
               <w:rPr>
                 <w:rStyle w:val="Hyperlink"/>
@@ -3373,7 +3373,7 @@
                 <w:noProof/>
                 <w:webHidden/>
               </w:rPr>
-              <w:instrText xml:space="preserve">PAGEREF _Toc877617367 \h</w:instrText>
+              <w:instrText xml:space="preserve">PAGEREF _Toc440435451 \h</w:instrText>
             </w:r>
             <w:r>
               <w:rPr>
@@ -3414,7 +3414,7 @@
               <w:noProof/>
             </w:rPr>
           </w:pPr>
-          <w:hyperlink w:anchor="_Toc877617368">
+          <w:hyperlink w:anchor="_Toc440435452">
             <w:r>
               <w:rPr>
                 <w:rStyle w:val="Hyperlink"/>
@@ -3441,7 +3441,7 @@
                 <w:noProof/>
                 <w:webHidden/>
               </w:rPr>
-              <w:instrText xml:space="preserve">PAGEREF _Toc877617368 \h</w:instrText>
+              <w:instrText xml:space="preserve">PAGEREF _Toc440435452 \h</w:instrText>
             </w:r>
             <w:r>
               <w:rPr>
@@ -3482,7 +3482,7 @@
               <w:noProof/>
             </w:rPr>
           </w:pPr>
-          <w:hyperlink w:anchor="_Toc877617369">
+          <w:hyperlink w:anchor="_Toc440435453">
             <w:r>
               <w:rPr>
                 <w:rStyle w:val="Hyperlink"/>
@@ -3509,7 +3509,7 @@
                 <w:noProof/>
                 <w:webHidden/>
               </w:rPr>
-              <w:instrText xml:space="preserve">PAGEREF _Toc877617369 \h</w:instrText>
+              <w:instrText xml:space="preserve">PAGEREF _Toc440435453 \h</w:instrText>
             </w:r>
             <w:r>
               <w:rPr>
@@ -3550,7 +3550,7 @@
               <w:noProof/>
             </w:rPr>
           </w:pPr>
-          <w:hyperlink w:anchor="_Toc877617370">
+          <w:hyperlink w:anchor="_Toc440435454">
             <w:r>
               <w:rPr>
                 <w:rStyle w:val="Hyperlink"/>
@@ -3577,7 +3577,7 @@
                 <w:noProof/>
                 <w:webHidden/>
               </w:rPr>
-              <w:instrText xml:space="preserve">PAGEREF _Toc877617370 \h</w:instrText>
+              <w:instrText xml:space="preserve">PAGEREF _Toc440435454 \h</w:instrText>
             </w:r>
             <w:r>
               <w:rPr>
@@ -3618,7 +3618,7 @@
               <w:noProof/>
             </w:rPr>
           </w:pPr>
-          <w:hyperlink w:anchor="_Toc877617371">
+          <w:hyperlink w:anchor="_Toc440435455">
             <w:r>
               <w:rPr>
                 <w:rStyle w:val="Hyperlink"/>
@@ -3652,7 +3652,7 @@
                 <w:noProof/>
                 <w:webHidden/>
               </w:rPr>
-              <w:instrText xml:space="preserve">PAGEREF _Toc877617371 \h</w:instrText>
+              <w:instrText xml:space="preserve">PAGEREF _Toc440435455 \h</w:instrText>
             </w:r>
             <w:r>
               <w:rPr>
@@ -3693,7 +3693,7 @@
               <w:noProof/>
             </w:rPr>
           </w:pPr>
-          <w:hyperlink w:anchor="_Toc877617372">
+          <w:hyperlink w:anchor="_Toc440435456">
             <w:r>
               <w:rPr>
                 <w:rStyle w:val="Hyperlink"/>
@@ -3719,7 +3719,7 @@
                 <w:noProof/>
                 <w:webHidden/>
               </w:rPr>
-              <w:instrText xml:space="preserve">PAGEREF _Toc877617372 \h</w:instrText>
+              <w:instrText xml:space="preserve">PAGEREF _Toc440435456 \h</w:instrText>
             </w:r>
             <w:r>
               <w:rPr>
@@ -3760,7 +3760,7 @@
               <w:noProof/>
             </w:rPr>
           </w:pPr>
-          <w:hyperlink w:anchor="_Toc877617373">
+          <w:hyperlink w:anchor="_Toc440435457">
             <w:r>
               <w:rPr>
                 <w:rStyle w:val="Hyperlink"/>
@@ -3786,7 +3786,7 @@
                 <w:noProof/>
                 <w:webHidden/>
               </w:rPr>
-              <w:instrText xml:space="preserve">PAGEREF _Toc877617373 \h</w:instrText>
+              <w:instrText xml:space="preserve">PAGEREF _Toc440435457 \h</w:instrText>
             </w:r>
             <w:r>
               <w:rPr>
@@ -3827,7 +3827,7 @@
               <w:noProof/>
             </w:rPr>
           </w:pPr>
-          <w:hyperlink w:anchor="_Toc877617374">
+          <w:hyperlink w:anchor="_Toc440435458">
             <w:r>
               <w:rPr>
                 <w:rStyle w:val="Hyperlink"/>
@@ -3853,7 +3853,7 @@
                 <w:noProof/>
                 <w:webHidden/>
               </w:rPr>
-              <w:instrText xml:space="preserve">PAGEREF _Toc877617374 \h</w:instrText>
+              <w:instrText xml:space="preserve">PAGEREF _Toc440435458 \h</w:instrText>
             </w:r>
             <w:r>
               <w:rPr>
@@ -3894,7 +3894,7 @@
               <w:noProof/>
             </w:rPr>
           </w:pPr>
-          <w:hyperlink w:anchor="_Toc877617375">
+          <w:hyperlink w:anchor="_Toc440435459">
             <w:r>
               <w:rPr>
                 <w:rStyle w:val="Hyperlink"/>
@@ -3920,7 +3920,7 @@
                 <w:noProof/>
                 <w:webHidden/>
               </w:rPr>
-              <w:instrText xml:space="preserve">PAGEREF _Toc877617375 \h</w:instrText>
+              <w:instrText xml:space="preserve">PAGEREF _Toc440435459 \h</w:instrText>
             </w:r>
             <w:r>
               <w:rPr>
@@ -3961,7 +3961,7 @@
               <w:noProof/>
             </w:rPr>
           </w:pPr>
-          <w:hyperlink w:anchor="_Toc877617376">
+          <w:hyperlink w:anchor="_Toc440435460">
             <w:r>
               <w:rPr>
                 <w:rStyle w:val="Hyperlink"/>
@@ -3993,7 +3993,7 @@
                 <w:noProof/>
                 <w:webHidden/>
               </w:rPr>
-              <w:instrText xml:space="preserve">PAGEREF _Toc877617376 \h</w:instrText>
+              <w:instrText xml:space="preserve">PAGEREF _Toc440435460 \h</w:instrText>
             </w:r>
             <w:r>
               <w:rPr>
@@ -4034,7 +4034,7 @@
               <w:noProof/>
             </w:rPr>
           </w:pPr>
-          <w:hyperlink w:anchor="_Toc877617377">
+          <w:hyperlink w:anchor="_Toc440435461">
             <w:r>
               <w:rPr>
                 <w:rStyle w:val="Hyperlink"/>
@@ -4060,7 +4060,7 @@
                 <w:noProof/>
                 <w:webHidden/>
               </w:rPr>
-              <w:instrText xml:space="preserve">PAGEREF _Toc877617377 \h</w:instrText>
+              <w:instrText xml:space="preserve">PAGEREF _Toc440435461 \h</w:instrText>
             </w:r>
             <w:r>
               <w:rPr>
@@ -4101,7 +4101,7 @@
               <w:noProof/>
             </w:rPr>
           </w:pPr>
-          <w:hyperlink w:anchor="_Toc877617378">
+          <w:hyperlink w:anchor="_Toc440435462">
             <w:r>
               <w:rPr>
                 <w:rStyle w:val="Hyperlink"/>
@@ -4128,7 +4128,7 @@
                 <w:noProof/>
                 <w:webHidden/>
               </w:rPr>
-              <w:instrText xml:space="preserve">PAGEREF _Toc877617378 \h</w:instrText>
+              <w:instrText xml:space="preserve">PAGEREF _Toc440435462 \h</w:instrText>
             </w:r>
             <w:r>
               <w:rPr>
@@ -4169,7 +4169,7 @@
               <w:noProof/>
             </w:rPr>
           </w:pPr>
-          <w:hyperlink w:anchor="_Toc877617379">
+          <w:hyperlink w:anchor="_Toc440435463">
             <w:r>
               <w:rPr>
                 <w:rStyle w:val="Hyperlink"/>
@@ -4203,7 +4203,7 @@
                 <w:noProof/>
                 <w:webHidden/>
               </w:rPr>
-              <w:instrText xml:space="preserve">PAGEREF _Toc877617379 \h</w:instrText>
+              <w:instrText xml:space="preserve">PAGEREF _Toc440435463 \h</w:instrText>
             </w:r>
             <w:r>
               <w:rPr>
@@ -4244,7 +4244,7 @@
               <w:noProof/>
             </w:rPr>
           </w:pPr>
-          <w:hyperlink w:anchor="_Toc877617380">
+          <w:hyperlink w:anchor="_Toc440435464">
             <w:r>
               <w:rPr>
                 <w:rStyle w:val="Hyperlink"/>
@@ -4270,7 +4270,7 @@
                 <w:noProof/>
                 <w:webHidden/>
               </w:rPr>
-              <w:instrText xml:space="preserve">PAGEREF _Toc877617380 \h</w:instrText>
+              <w:instrText xml:space="preserve">PAGEREF _Toc440435464 \h</w:instrText>
             </w:r>
             <w:r>
               <w:rPr>
@@ -4311,7 +4311,7 @@
               <w:noProof/>
             </w:rPr>
           </w:pPr>
-          <w:hyperlink w:anchor="_Toc877617381">
+          <w:hyperlink w:anchor="_Toc440435465">
             <w:r>
               <w:rPr>
                 <w:rStyle w:val="Hyperlink"/>
@@ -4337,7 +4337,7 @@
                 <w:noProof/>
                 <w:webHidden/>
               </w:rPr>
-              <w:instrText xml:space="preserve">PAGEREF _Toc877617381 \h</w:instrText>
+              <w:instrText xml:space="preserve">PAGEREF _Toc440435465 \h</w:instrText>
             </w:r>
             <w:r>
               <w:rPr>
@@ -4378,7 +4378,7 @@
               <w:noProof/>
             </w:rPr>
           </w:pPr>
-          <w:hyperlink w:anchor="_Toc877617382">
+          <w:hyperlink w:anchor="_Toc440435466">
             <w:r>
               <w:rPr>
                 <w:rStyle w:val="Hyperlink"/>
@@ -4404,7 +4404,7 @@
                 <w:noProof/>
                 <w:webHidden/>
               </w:rPr>
-              <w:instrText xml:space="preserve">PAGEREF _Toc877617382 \h</w:instrText>
+              <w:instrText xml:space="preserve">PAGEREF _Toc440435466 \h</w:instrText>
             </w:r>
             <w:r>
               <w:rPr>
@@ -4445,7 +4445,7 @@
               <w:noProof/>
             </w:rPr>
           </w:pPr>
-          <w:hyperlink w:anchor="_Toc877617383">
+          <w:hyperlink w:anchor="_Toc440435467">
             <w:r>
               <w:rPr>
                 <w:rStyle w:val="Hyperlink"/>
@@ -4471,7 +4471,7 @@
                 <w:noProof/>
                 <w:webHidden/>
               </w:rPr>
-              <w:instrText xml:space="preserve">PAGEREF _Toc877617383 \h</w:instrText>
+              <w:instrText xml:space="preserve">PAGEREF _Toc440435467 \h</w:instrText>
             </w:r>
             <w:r>
               <w:rPr>
@@ -4512,7 +4512,7 @@
               <w:noProof/>
             </w:rPr>
           </w:pPr>
-          <w:hyperlink w:anchor="_Toc877617384">
+          <w:hyperlink w:anchor="_Toc440435468">
             <w:r>
               <w:rPr>
                 <w:rStyle w:val="Hyperlink"/>
@@ -4538,7 +4538,7 @@
                 <w:noProof/>
                 <w:webHidden/>
               </w:rPr>
-              <w:instrText xml:space="preserve">PAGEREF _Toc877617384 \h</w:instrText>
+              <w:instrText xml:space="preserve">PAGEREF _Toc440435468 \h</w:instrText>
             </w:r>
             <w:r>
               <w:rPr>
@@ -4579,7 +4579,7 @@
               <w:noProof/>
             </w:rPr>
           </w:pPr>
-          <w:hyperlink w:anchor="_Toc877617385">
+          <w:hyperlink w:anchor="_Toc440435469">
             <w:r>
               <w:rPr>
                 <w:rStyle w:val="Hyperlink"/>
@@ -4605,7 +4605,7 @@
                 <w:noProof/>
                 <w:webHidden/>
               </w:rPr>
-              <w:instrText xml:space="preserve">PAGEREF _Toc877617385 \h</w:instrText>
+              <w:instrText xml:space="preserve">PAGEREF _Toc440435469 \h</w:instrText>
             </w:r>
             <w:r>
               <w:rPr>
@@ -4646,7 +4646,7 @@
               <w:noProof/>
             </w:rPr>
           </w:pPr>
-          <w:hyperlink w:anchor="_Toc877617386">
+          <w:hyperlink w:anchor="_Toc440435470">
             <w:r>
               <w:rPr>
                 <w:rStyle w:val="Hyperlink"/>
@@ -4673,7 +4673,7 @@
                 <w:noProof/>
                 <w:webHidden/>
               </w:rPr>
-              <w:instrText xml:space="preserve">PAGEREF _Toc877617386 \h</w:instrText>
+              <w:instrText xml:space="preserve">PAGEREF _Toc440435470 \h</w:instrText>
             </w:r>
             <w:r>
               <w:rPr>
@@ -4714,7 +4714,7 @@
               <w:noProof/>
             </w:rPr>
           </w:pPr>
-          <w:hyperlink w:anchor="_Toc877617387">
+          <w:hyperlink w:anchor="_Toc440435471">
             <w:r>
               <w:rPr>
                 <w:rStyle w:val="Hyperlink"/>
@@ -4740,7 +4740,7 @@
                 <w:noProof/>
                 <w:webHidden/>
               </w:rPr>
-              <w:instrText xml:space="preserve">PAGEREF _Toc877617387 \h</w:instrText>
+              <w:instrText xml:space="preserve">PAGEREF _Toc440435471 \h</w:instrText>
             </w:r>
             <w:r>
               <w:rPr>
@@ -4781,7 +4781,7 @@
               <w:noProof/>
             </w:rPr>
           </w:pPr>
-          <w:hyperlink w:anchor="_Toc877617388">
+          <w:hyperlink w:anchor="_Toc440435472">
             <w:r>
               <w:rPr>
                 <w:rStyle w:val="Hyperlink"/>
@@ -4807,7 +4807,7 @@
                 <w:noProof/>
                 <w:webHidden/>
               </w:rPr>
-              <w:instrText xml:space="preserve">PAGEREF _Toc877617388 \h</w:instrText>
+              <w:instrText xml:space="preserve">PAGEREF _Toc440435472 \h</w:instrText>
             </w:r>
             <w:r>
               <w:rPr>
@@ -4848,7 +4848,7 @@
               <w:noProof/>
             </w:rPr>
           </w:pPr>
-          <w:hyperlink w:anchor="_Toc877617389">
+          <w:hyperlink w:anchor="_Toc440435473">
             <w:r>
               <w:rPr>
                 <w:rStyle w:val="Hyperlink"/>
@@ -4874,7 +4874,7 @@
                 <w:noProof/>
                 <w:webHidden/>
               </w:rPr>
-              <w:instrText xml:space="preserve">PAGEREF _Toc877617389 \h</w:instrText>
+              <w:instrText xml:space="preserve">PAGEREF _Toc440435473 \h</w:instrText>
             </w:r>
             <w:r>
               <w:rPr>
@@ -4915,7 +4915,7 @@
               <w:noProof/>
             </w:rPr>
           </w:pPr>
-          <w:hyperlink w:anchor="_Toc877617390">
+          <w:hyperlink w:anchor="_Toc440435474">
             <w:r>
               <w:rPr>
                 <w:rStyle w:val="Hyperlink"/>
@@ -4941,7 +4941,7 @@
                 <w:noProof/>
                 <w:webHidden/>
               </w:rPr>
-              <w:instrText xml:space="preserve">PAGEREF _Toc877617390 \h</w:instrText>
+              <w:instrText xml:space="preserve">PAGEREF _Toc440435474 \h</w:instrText>
             </w:r>
             <w:r>
               <w:rPr>
@@ -4961,7 +4961,7 @@
                 <w:noProof/>
                 <w:webHidden/>
               </w:rPr>
-              <w:t>49</w:t>
+              <w:t>50</w:t>
             </w:r>
             <w:r>
               <w:rPr>
@@ -4982,7 +4982,7 @@
               <w:noProof/>
             </w:rPr>
           </w:pPr>
-          <w:hyperlink w:anchor="_Toc877617391">
+          <w:hyperlink w:anchor="_Toc440435475">
             <w:r>
               <w:rPr>
                 <w:rStyle w:val="Hyperlink"/>
@@ -5008,7 +5008,7 @@
                 <w:noProof/>
                 <w:webHidden/>
               </w:rPr>
-              <w:instrText xml:space="preserve">PAGEREF _Toc877617391 \h</w:instrText>
+              <w:instrText xml:space="preserve">PAGEREF _Toc440435475 \h</w:instrText>
             </w:r>
             <w:r>
               <w:rPr>
@@ -5049,11 +5049,78 @@
               <w:noProof/>
             </w:rPr>
           </w:pPr>
-          <w:hyperlink w:anchor="_Toc877617392">
+          <w:hyperlink w:anchor="_Toc440435476">
             <w:r>
               <w:rPr>
                 <w:rStyle w:val="Hyperlink"/>
               </w:rPr>
+              <w:t xml:space="preserve">Drawing charts</w:t>
+            </w:r>
+            <w:r>
+              <w:rPr>
+                <w:noProof/>
+                <w:webHidden/>
+              </w:rPr>
+              <w:tab/>
+            </w:r>
+            <w:r>
+              <w:rPr>
+                <w:noProof/>
+                <w:webHidden/>
+              </w:rPr>
+              <w:fldChar w:fldCharType="begin"/>
+            </w:r>
+            <w:r>
+              <w:rPr>
+                <w:noProof/>
+                <w:webHidden/>
+              </w:rPr>
+              <w:instrText xml:space="preserve">PAGEREF _Toc440435476 \h</w:instrText>
+            </w:r>
+            <w:r>
+              <w:rPr>
+                <w:noProof/>
+                <w:webHidden/>
+              </w:rPr>
+            </w:r>
+            <w:r>
+              <w:rPr>
+                <w:noProof/>
+                <w:webHidden/>
+              </w:rPr>
+              <w:fldChar w:fldCharType="separate"/>
+            </w:r>
+            <w:r>
+              <w:rPr>
+                <w:noProof/>
+                <w:webHidden/>
+              </w:rPr>
+              <w:t>50</w:t>
+            </w:r>
+            <w:r>
+              <w:rPr>
+                <w:noProof/>
+                <w:webHidden/>
+              </w:rPr>
+              <w:fldChar w:fldCharType="end"/>
+            </w:r>
+          </w:hyperlink>
+        </w:p>
+        <w:p>
+          <w:pPr>
+            <w:pStyle w:val="TOC2"/>
+            <w:tabs>
+              <w:tab w:val="right" w:leader="dot" w:pos="9360"/>
+            </w:tabs>
+            <w:rPr>
+              <w:noProof/>
+            </w:rPr>
+          </w:pPr>
+          <w:hyperlink w:anchor="_Toc440435477">
+            <w:r>
+              <w:rPr>
+                <w:rStyle w:val="Hyperlink"/>
+              </w:rPr>
               <w:t xml:space="preserve">Limitations</w:t>
             </w:r>
             <w:r>
@@ -5075,7 +5142,7 @@
                 <w:noProof/>
                 <w:webHidden/>
               </w:rPr>
-              <w:instrText xml:space="preserve">PAGEREF _Toc877617392 \h</w:instrText>
+              <w:instrText xml:space="preserve">PAGEREF _Toc440435477 \h</w:instrText>
             </w:r>
             <w:r>
               <w:rPr>
@@ -5095,7 +5162,7 @@
                 <w:noProof/>
                 <w:webHidden/>
               </w:rPr>
-              <w:t>50</w:t>
+              <w:t>51</w:t>
             </w:r>
             <w:r>
               <w:rPr>
@@ -5116,7 +5183,7 @@
               <w:noProof/>
             </w:rPr>
           </w:pPr>
-          <w:hyperlink w:anchor="_Toc877617393">
+          <w:hyperlink w:anchor="_Toc440435478">
             <w:r>
               <w:rPr>
                 <w:rStyle w:val="Hyperlink"/>
@@ -5142,7 +5209,7 @@
                 <w:noProof/>
                 <w:webHidden/>
               </w:rPr>
-              <w:instrText xml:space="preserve">PAGEREF _Toc877617393 \h</w:instrText>
+              <w:instrText xml:space="preserve">PAGEREF _Toc440435478 \h</w:instrText>
             </w:r>
             <w:r>
               <w:rPr>
@@ -5162,7 +5229,7 @@
                 <w:noProof/>
                 <w:webHidden/>
               </w:rPr>
-              <w:t>50</w:t>
+              <w:t>51</w:t>
             </w:r>
             <w:r>
               <w:rPr>
@@ -5183,7 +5250,7 @@
               <w:noProof/>
             </w:rPr>
           </w:pPr>
-          <w:hyperlink w:anchor="_Toc877617394">
+          <w:hyperlink w:anchor="_Toc440435479">
             <w:r>
               <w:rPr>
                 <w:rStyle w:val="Hyperlink"/>
@@ -5209,7 +5276,7 @@
                 <w:noProof/>
                 <w:webHidden/>
               </w:rPr>
-              <w:instrText xml:space="preserve">PAGEREF _Toc877617394 \h</w:instrText>
+              <w:instrText xml:space="preserve">PAGEREF _Toc440435479 \h</w:instrText>
             </w:r>
             <w:r>
               <w:rPr>
@@ -5250,7 +5317,7 @@
               <w:noProof/>
             </w:rPr>
           </w:pPr>
-          <w:hyperlink w:anchor="_Toc877617395">
+          <w:hyperlink w:anchor="_Toc440435480">
             <w:r>
               <w:rPr>
                 <w:rStyle w:val="Hyperlink"/>
@@ -5276,7 +5343,7 @@
                 <w:noProof/>
                 <w:webHidden/>
               </w:rPr>
-              <w:instrText xml:space="preserve">PAGEREF _Toc877617395 \h</w:instrText>
+              <w:instrText xml:space="preserve">PAGEREF _Toc440435480 \h</w:instrText>
             </w:r>
             <w:r>
               <w:rPr>
@@ -5317,7 +5384,7 @@
               <w:noProof/>
             </w:rPr>
           </w:pPr>
-          <w:hyperlink w:anchor="_Toc877617396">
+          <w:hyperlink w:anchor="_Toc440435481">
             <w:r>
               <w:rPr>
                 <w:rStyle w:val="Hyperlink"/>
@@ -5343,7 +5410,7 @@
                 <w:noProof/>
                 <w:webHidden/>
               </w:rPr>
-              <w:instrText xml:space="preserve">PAGEREF _Toc877617396 \h</w:instrText>
+              <w:instrText xml:space="preserve">PAGEREF _Toc440435481 \h</w:instrText>
             </w:r>
             <w:r>
               <w:rPr>
@@ -5363,7 +5430,7 @@
                 <w:noProof/>
                 <w:webHidden/>
               </w:rPr>
-              <w:t>51</w:t>
+              <w:t>52</w:t>
             </w:r>
             <w:r>
               <w:rPr>
@@ -5384,7 +5451,7 @@
               <w:noProof/>
             </w:rPr>
           </w:pPr>
-          <w:hyperlink w:anchor="_Toc877617397">
+          <w:hyperlink w:anchor="_Toc440435482">
             <w:r>
               <w:rPr>
                 <w:rStyle w:val="Hyperlink"/>
@@ -5410,7 +5477,7 @@
                 <w:noProof/>
                 <w:webHidden/>
               </w:rPr>
-              <w:instrText xml:space="preserve">PAGEREF _Toc877617397 \h</w:instrText>
+              <w:instrText xml:space="preserve">PAGEREF _Toc440435482 \h</w:instrText>
             </w:r>
             <w:r>
               <w:rPr>
@@ -5430,7 +5497,7 @@
                 <w:noProof/>
                 <w:webHidden/>
               </w:rPr>
-              <w:t>51</w:t>
+              <w:t>52</w:t>
             </w:r>
             <w:r>
               <w:rPr>
@@ -5451,7 +5518,7 @@
               <w:noProof/>
             </w:rPr>
           </w:pPr>
-          <w:hyperlink w:anchor="_Toc877617398">
+          <w:hyperlink w:anchor="_Toc440435483">
             <w:r>
               <w:rPr>
                 <w:rStyle w:val="Hyperlink"/>
@@ -5478,7 +5545,7 @@
                 <w:noProof/>
                 <w:webHidden/>
               </w:rPr>
-              <w:instrText xml:space="preserve">PAGEREF _Toc877617398 \h</w:instrText>
+              <w:instrText xml:space="preserve">PAGEREF _Toc440435483 \h</w:instrText>
             </w:r>
             <w:r>
               <w:rPr>
@@ -5498,7 +5565,7 @@
                 <w:noProof/>
                 <w:webHidden/>
               </w:rPr>
-              <w:t>52</w:t>
+              <w:t>53</w:t>
             </w:r>
             <w:r>
               <w:rPr>
@@ -5519,7 +5586,7 @@
               <w:noProof/>
             </w:rPr>
           </w:pPr>
-          <w:hyperlink w:anchor="_Toc877617399">
+          <w:hyperlink w:anchor="_Toc440435484">
             <w:r>
               <w:rPr>
                 <w:rStyle w:val="Hyperlink"/>
@@ -5563,7 +5630,7 @@
                 <w:noProof/>
                 <w:webHidden/>
               </w:rPr>
-              <w:instrText xml:space="preserve">PAGEREF _Toc877617399 \h</w:instrText>
+              <w:instrText xml:space="preserve">PAGEREF _Toc440435484 \h</w:instrText>
             </w:r>
             <w:r>
               <w:rPr>
@@ -5604,7 +5671,7 @@
               <w:noProof/>
             </w:rPr>
           </w:pPr>
-          <w:hyperlink w:anchor="_Toc877617400">
+          <w:hyperlink w:anchor="_Toc440435485">
             <w:r>
               <w:rPr>
                 <w:rStyle w:val="Hyperlink"/>
@@ -5630,7 +5697,7 @@
                 <w:noProof/>
                 <w:webHidden/>
               </w:rPr>
-              <w:instrText xml:space="preserve">PAGEREF _Toc877617400 \h</w:instrText>
+              <w:instrText xml:space="preserve">PAGEREF _Toc440435485 \h</w:instrText>
             </w:r>
             <w:r>
               <w:rPr>
@@ -5671,7 +5738,7 @@
               <w:noProof/>
             </w:rPr>
           </w:pPr>
-          <w:hyperlink w:anchor="_Toc877617401">
+          <w:hyperlink w:anchor="_Toc440435486">
             <w:r>
               <w:rPr>
                 <w:rStyle w:val="Hyperlink"/>
@@ -5709,7 +5776,7 @@
                 <w:noProof/>
                 <w:webHidden/>
               </w:rPr>
-              <w:instrText xml:space="preserve">PAGEREF _Toc877617401 \h</w:instrText>
+              <w:instrText xml:space="preserve">PAGEREF _Toc440435486 \h</w:instrText>
             </w:r>
             <w:r>
               <w:rPr>
@@ -5750,7 +5817,7 @@
               <w:noProof/>
             </w:rPr>
           </w:pPr>
-          <w:hyperlink w:anchor="_Toc877617402">
+          <w:hyperlink w:anchor="_Toc440435487">
             <w:r>
               <w:rPr>
                 <w:rStyle w:val="Hyperlink"/>
@@ -5776,7 +5843,7 @@
                 <w:noProof/>
                 <w:webHidden/>
               </w:rPr>
-              <w:instrText xml:space="preserve">PAGEREF _Toc877617402 \h</w:instrText>
+              <w:instrText xml:space="preserve">PAGEREF _Toc440435487 \h</w:instrText>
             </w:r>
             <w:r>
               <w:rPr>
@@ -5928,6 +5995,7 @@
       <w:pPr>
         <w:pStyle w:val="Heading1"/>
       </w:pPr>
+      <w:bookmarkStart w:name="_Toc440435403" w:id="403"/>
       <w:bookmarkStart w:name="_Toc877617319" w:id="319"/>
       <w:bookmarkStart w:name="_Toc48274241" w:id="241"/>
       <w:bookmarkStart w:name="_Toc239426560" w:id="0"/>
@@ -5941,6 +6009,7 @@
       <w:bookmarkEnd w:id="2"/>
       <w:bookmarkEnd w:id="241"/>
       <w:bookmarkEnd w:id="319"/>
+      <w:bookmarkEnd w:id="403"/>
     </w:p>
     <w:p>
       <w:r>
@@ -6151,6 +6220,7 @@
       <w:pPr>
         <w:pStyle w:val="Heading1"/>
       </w:pPr>
+      <w:bookmarkStart w:name="_Toc440435404" w:id="404"/>
       <w:bookmarkStart w:name="_Toc877617320" w:id="320"/>
       <w:bookmarkStart w:name="_Toc48274242" w:id="242"/>
       <w:bookmarkStart w:name="_Toc239426561" w:id="3"/>
@@ -6164,6 +6234,7 @@
       <w:bookmarkEnd w:id="5"/>
       <w:bookmarkEnd w:id="242"/>
       <w:bookmarkEnd w:id="320"/>
+      <w:bookmarkEnd w:id="404"/>
     </w:p>
     <w:p>
       <w:pPr>
@@ -6210,7 +6281,7 @@
         </w:numPr>
       </w:pPr>
       <w:r>
-        <w:t xml:space="preserve">Create charts, and edit their data (docx, pptx, xlsx)</w:t>
+        <w:t xml:space="preserve">Create charts, edit their data, and draw them in PDF and HTML output or as images (docx, pptx, xlsx)</w:t>
       </w:r>
     </w:p>
     <w:p>
@@ -6299,7 +6370,7 @@
         </w:numPr>
       </w:pPr>
       <w:r>
-        <w:t>Export as (X)HTML or PDF</w:t>
+        <w:t xml:space="preserve">Export as (X)HTML or PDF, including charts</w:t>
       </w:r>
     </w:p>
     <w:p>
@@ -6371,6 +6442,7 @@
       <w:pPr>
         <w:pStyle w:val="Heading1"/>
       </w:pPr>
+      <w:bookmarkStart w:name="_Toc440435405" w:id="405"/>
       <w:bookmarkStart w:name="_Toc877617321" w:id="321"/>
       <w:bookmarkStart w:name="_Toc48274243" w:id="243"/>
       <w:bookmarkStart w:name="_Toc239426562" w:id="6"/>
@@ -6384,6 +6456,7 @@
       <w:bookmarkEnd w:id="8"/>
       <w:bookmarkEnd w:id="243"/>
       <w:bookmarkEnd w:id="321"/>
+      <w:bookmarkEnd w:id="405"/>
     </w:p>
     <w:p>
       <w:r>
@@ -6404,6 +6477,7 @@
       <w:pPr>
         <w:pStyle w:val="Heading1"/>
       </w:pPr>
+      <w:bookmarkStart w:name="_Toc440435406" w:id="406"/>
       <w:bookmarkStart w:name="_Toc877617322" w:id="322"/>
       <w:bookmarkStart w:name="_Toc48274244" w:id="244"/>
       <w:bookmarkStart w:name="_Toc239426563" w:id="9"/>
@@ -6418,6 +6492,7 @@
       <w:bookmarkEnd w:id="11"/>
       <w:bookmarkEnd w:id="244"/>
       <w:bookmarkEnd w:id="322"/>
+      <w:bookmarkEnd w:id="406"/>
     </w:p>
     <w:p>
       <w:r>
@@ -6428,6 +6503,7 @@
       <w:pPr>
         <w:pStyle w:val="Heading1"/>
       </w:pPr>
+      <w:bookmarkStart w:name="_Toc440435407" w:id="407"/>
       <w:bookmarkStart w:name="_Toc877617323" w:id="323"/>
       <w:bookmarkStart w:name="_Toc48274245" w:id="245"/>
       <w:bookmarkStart w:name="_Toc239426564" w:id="12"/>
@@ -6441,6 +6517,7 @@
       <w:bookmarkEnd w:id="14"/>
       <w:bookmarkEnd w:id="245"/>
       <w:bookmarkEnd w:id="323"/>
+      <w:bookmarkEnd w:id="407"/>
     </w:p>
     <w:p>
       <w:r>
@@ -6590,6 +6667,7 @@
       <w:pPr>
         <w:pStyle w:val="Heading1"/>
       </w:pPr>
+      <w:bookmarkStart w:name="_Toc440435408" w:id="408"/>
       <w:bookmarkStart w:name="_Toc877617324" w:id="324"/>
       <w:bookmarkStart w:name="_Toc48274246" w:id="246"/>
       <w:bookmarkStart w:name="_Toc239426565" w:id="15"/>
@@ -6603,6 +6681,7 @@
       <w:bookmarkEnd w:id="17"/>
       <w:bookmarkEnd w:id="246"/>
       <w:bookmarkEnd w:id="324"/>
+      <w:bookmarkEnd w:id="408"/>
     </w:p>
     <w:p>
       <w:r>
@@ -6766,6 +6845,7 @@
       <w:pPr>
         <w:pStyle w:val="Heading1"/>
       </w:pPr>
+      <w:bookmarkStart w:name="_Toc440435409" w:id="409"/>
       <w:bookmarkStart w:name="_Toc877617325" w:id="325"/>
       <w:bookmarkStart w:name="_Toc48274247" w:id="247"/>
       <w:bookmarkStart w:name="_Toc239426566" w:id="18"/>
@@ -6779,6 +6859,7 @@
       <w:bookmarkEnd w:id="20"/>
       <w:bookmarkEnd w:id="247"/>
       <w:bookmarkEnd w:id="325"/>
+      <w:bookmarkEnd w:id="409"/>
     </w:p>
     <w:p>
       <w:r>
@@ -6806,6 +6887,7 @@
       <w:pPr>
         <w:pStyle w:val="Heading1"/>
       </w:pPr>
+      <w:bookmarkStart w:name="_Toc440435410" w:id="410"/>
       <w:bookmarkStart w:name="_Toc877617326" w:id="326"/>
       <w:bookmarkStart w:name="_Toc48274248" w:id="248"/>
       <w:bookmarkStart w:name="_Toc239426567" w:id="21"/>
@@ -6819,6 +6901,7 @@
       <w:bookmarkEnd w:id="23"/>
       <w:bookmarkEnd w:id="248"/>
       <w:bookmarkEnd w:id="326"/>
+      <w:bookmarkEnd w:id="410"/>
     </w:p>
     <w:p>
       <w:r>
@@ -7122,6 +7205,7 @@
       <w:pPr>
         <w:pStyle w:val="Heading1"/>
       </w:pPr>
+      <w:bookmarkStart w:name="_Toc440435411" w:id="411"/>
       <w:bookmarkStart w:name="_Toc877617327" w:id="327"/>
       <w:bookmarkStart w:name="_Toc48274249" w:id="249"/>
       <w:bookmarkStart w:name="_Toc239426568" w:id="24"/>
@@ -7135,6 +7219,7 @@
       <w:bookmarkEnd w:id="26"/>
       <w:bookmarkEnd w:id="249"/>
       <w:bookmarkEnd w:id="327"/>
+      <w:bookmarkEnd w:id="411"/>
     </w:p>
     <w:p>
       <w:r>
@@ -7793,6 +7878,7 @@
       <w:pPr>
         <w:pStyle w:val="Heading1"/>
       </w:pPr>
+      <w:bookmarkStart w:name="_Toc440435412" w:id="412"/>
       <w:bookmarkStart w:name="_Toc877617328" w:id="328"/>
       <w:bookmarkStart w:name="_Toc48274250" w:id="250"/>
       <w:bookmarkStart w:name="_Toc239426569" w:id="27"/>
@@ -7806,6 +7892,7 @@
       <w:bookmarkEnd w:id="29"/>
       <w:bookmarkEnd w:id="250"/>
       <w:bookmarkEnd w:id="328"/>
+      <w:bookmarkEnd w:id="412"/>
     </w:p>
     <w:p>
       <w:r>
@@ -7894,6 +7981,7 @@
       <w:pPr>
         <w:pStyle w:val="Heading1"/>
       </w:pPr>
+      <w:bookmarkStart w:name="_Toc440435413" w:id="413"/>
       <w:bookmarkStart w:name="_Toc877617329" w:id="329"/>
       <w:bookmarkStart w:name="_Toc48274251" w:id="251"/>
       <w:bookmarkStart w:name="_Toc239426570" w:id="30"/>
@@ -7907,11 +7995,13 @@
       <w:bookmarkEnd w:id="32"/>
       <w:bookmarkEnd w:id="251"/>
       <w:bookmarkEnd w:id="329"/>
+      <w:bookmarkEnd w:id="413"/>
     </w:p>
     <w:p>
       <w:pPr>
         <w:pStyle w:val="Heading2"/>
       </w:pPr>
+      <w:bookmarkStart w:name="_Toc440435414" w:id="414"/>
       <w:bookmarkStart w:name="_Toc877617330" w:id="330"/>
       <w:bookmarkStart w:name="_Toc48274252" w:id="252"/>
       <w:bookmarkStart w:name="_Toc239426571" w:id="33"/>
@@ -7928,6 +8018,7 @@
       <w:bookmarkEnd w:id="35"/>
       <w:bookmarkEnd w:id="252"/>
       <w:bookmarkEnd w:id="330"/>
+      <w:bookmarkEnd w:id="414"/>
     </w:p>
     <w:p>
       <w:r>
@@ -8710,6 +8801,7 @@
       <w:pPr>
         <w:pStyle w:val="Heading2"/>
       </w:pPr>
+      <w:bookmarkStart w:name="_Toc440435415" w:id="415"/>
       <w:bookmarkStart w:name="_Toc877617331" w:id="331"/>
       <w:bookmarkStart w:name="_Toc48274253" w:id="253"/>
       <w:bookmarkStart w:name="_Toc239426572" w:id="36"/>
@@ -8726,6 +8818,7 @@
       <w:bookmarkEnd w:id="38"/>
       <w:bookmarkEnd w:id="253"/>
       <w:bookmarkEnd w:id="331"/>
+      <w:bookmarkEnd w:id="415"/>
     </w:p>
     <w:p>
       <w:r>
@@ -8754,6 +8847,7 @@
       <w:pPr>
         <w:pStyle w:val="Heading1"/>
       </w:pPr>
+      <w:bookmarkStart w:name="_Toc440435416" w:id="416"/>
       <w:bookmarkStart w:name="_Toc877617332" w:id="332"/>
       <w:bookmarkStart w:name="_Toc48274254" w:id="254"/>
       <w:bookmarkStart w:name="_Toc239426573" w:id="39"/>
@@ -8768,6 +8862,7 @@
       <w:bookmarkEnd w:id="41"/>
       <w:bookmarkEnd w:id="254"/>
       <w:bookmarkEnd w:id="332"/>
+      <w:bookmarkEnd w:id="416"/>
     </w:p>
     <w:p>
       <w:r>
@@ -8821,6 +8916,7 @@
       <w:pPr>
         <w:pStyle w:val="Heading1"/>
       </w:pPr>
+      <w:bookmarkStart w:name="_Toc440435417" w:id="417"/>
       <w:bookmarkStart w:name="_Toc877617333" w:id="333"/>
       <w:bookmarkStart w:name="_Toc48274255" w:id="255"/>
       <w:bookmarkStart w:name="_Toc239426574" w:id="42"/>
@@ -8834,6 +8930,7 @@
       <w:bookmarkEnd w:id="44"/>
       <w:bookmarkEnd w:id="255"/>
       <w:bookmarkEnd w:id="333"/>
+      <w:bookmarkEnd w:id="417"/>
     </w:p>
     <w:p>
       <w:r>
@@ -8844,6 +8941,7 @@
       <w:pPr>
         <w:pStyle w:val="Heading1"/>
       </w:pPr>
+      <w:bookmarkStart w:name="_Toc440435418" w:id="418"/>
       <w:bookmarkStart w:name="_Toc877617334" w:id="334"/>
       <w:bookmarkStart w:name="_Toc48274256" w:id="256"/>
       <w:bookmarkStart w:name="_Toc239426575" w:id="45"/>
@@ -8860,6 +8958,7 @@
       <w:bookmarkEnd w:id="47"/>
       <w:bookmarkEnd w:id="256"/>
       <w:bookmarkEnd w:id="334"/>
+      <w:bookmarkEnd w:id="418"/>
     </w:p>
     <w:p>
       <w:r>
@@ -8887,6 +8986,7 @@
       <w:pPr>
         <w:pStyle w:val="Heading2"/>
       </w:pPr>
+      <w:bookmarkStart w:name="_Toc440435419" w:id="419"/>
       <w:bookmarkStart w:name="_Toc877617335" w:id="335"/>
       <w:bookmarkStart w:name="_Toc48274257" w:id="257"/>
       <w:bookmarkStart w:name="_Toc239426576" w:id="48"/>
@@ -8900,6 +9000,7 @@
       <w:bookmarkEnd w:id="50"/>
       <w:bookmarkEnd w:id="257"/>
       <w:bookmarkEnd w:id="335"/>
+      <w:bookmarkEnd w:id="419"/>
     </w:p>
     <w:p>
       <w:pPr>
@@ -8932,6 +9033,7 @@
         <w:pStyle w:val="Heading2"/>
         <w:keepNext/>
       </w:pPr>
+      <w:bookmarkStart w:name="_Toc440435420" w:id="420"/>
       <w:bookmarkStart w:name="_Toc877617336" w:id="336"/>
       <w:bookmarkStart w:name="_Toc48274258" w:id="258"/>
       <w:bookmarkStart w:name="_Toc239426577" w:id="51"/>
@@ -8945,6 +9047,7 @@
       <w:bookmarkEnd w:id="53"/>
       <w:bookmarkEnd w:id="258"/>
       <w:bookmarkEnd w:id="336"/>
+      <w:bookmarkEnd w:id="420"/>
     </w:p>
     <w:p>
       <w:r>
@@ -9077,6 +9180,7 @@
       <w:pPr>
         <w:pStyle w:val="Heading2"/>
       </w:pPr>
+      <w:bookmarkStart w:name="_Toc440435421" w:id="421"/>
       <w:bookmarkStart w:name="_Toc877617337" w:id="337"/>
       <w:bookmarkStart w:name="_Toc48274259" w:id="259"/>
       <w:bookmarkStart w:name="_Toc239426578" w:id="54"/>
@@ -9090,6 +9194,7 @@
       <w:bookmarkEnd w:id="56"/>
       <w:bookmarkEnd w:id="259"/>
       <w:bookmarkEnd w:id="337"/>
+      <w:bookmarkEnd w:id="421"/>
     </w:p>
     <w:p>
       <w:pPr>
@@ -9112,6 +9217,7 @@
           <w:kern w:val="36"/>
         </w:rPr>
       </w:pPr>
+      <w:bookmarkStart w:name="_Toc440435422" w:id="422"/>
       <w:bookmarkStart w:name="_Toc877617338" w:id="338"/>
       <w:bookmarkStart w:name="_Toc48274260" w:id="260"/>
       <w:bookmarkStart w:name="_Toc239426579" w:id="57"/>
@@ -9129,6 +9235,7 @@
       <w:bookmarkEnd w:id="59"/>
       <w:bookmarkEnd w:id="260"/>
       <w:bookmarkEnd w:id="338"/>
+      <w:bookmarkEnd w:id="422"/>
     </w:p>
     <w:p>
       <w:pPr>
@@ -9390,6 +9497,7 @@
       <w:pPr>
         <w:pStyle w:val="Heading1"/>
       </w:pPr>
+      <w:bookmarkStart w:name="_Toc440435423" w:id="423"/>
       <w:bookmarkStart w:name="_Toc877617339" w:id="339"/>
       <w:bookmarkStart w:name="_Toc48274261" w:id="261"/>
       <w:bookmarkStart w:name="_Toc239426580" w:id="60"/>
@@ -9407,6 +9515,7 @@
       <w:bookmarkEnd w:id="62"/>
       <w:bookmarkEnd w:id="261"/>
       <w:bookmarkEnd w:id="339"/>
+      <w:bookmarkEnd w:id="423"/>
     </w:p>
     <w:p>
       <w:r>
@@ -9559,6 +9668,7 @@
           <w:kern w:val="36"/>
         </w:rPr>
       </w:pPr>
+      <w:bookmarkStart w:name="_Toc440435424" w:id="424"/>
       <w:bookmarkStart w:name="_Toc877617340" w:id="340"/>
       <w:bookmarkStart w:name="_Toc48274262" w:id="262"/>
       <w:bookmarkStart w:name="_Ref280708892" w:id="63"/>
@@ -9585,6 +9695,7 @@
       <w:bookmarkEnd w:id="66"/>
       <w:bookmarkEnd w:id="262"/>
       <w:bookmarkEnd w:id="340"/>
+      <w:bookmarkEnd w:id="424"/>
     </w:p>
     <w:p>
       <w:r>
@@ -10103,6 +10214,7 @@
           <w:rFonts w:eastAsia="Times New Roman"/>
         </w:rPr>
       </w:pPr>
+      <w:bookmarkStart w:name="_Toc440435425" w:id="425"/>
       <w:bookmarkStart w:name="_Toc877617341" w:id="341"/>
       <w:bookmarkStart w:name="_Toc48274263" w:id="263"/>
       <w:bookmarkStart w:name="_Toc239426582" w:id="67"/>
@@ -10119,6 +10231,7 @@
       <w:bookmarkEnd w:id="69"/>
       <w:bookmarkEnd w:id="263"/>
       <w:bookmarkEnd w:id="341"/>
+      <w:bookmarkEnd w:id="425"/>
     </w:p>
     <w:p>
       <w:r>
@@ -10710,6 +10823,7 @@
           <w:kern w:val="36"/>
         </w:rPr>
       </w:pPr>
+      <w:bookmarkStart w:name="_Toc440435426" w:id="426"/>
       <w:bookmarkStart w:name="_Toc877617342" w:id="342"/>
       <w:bookmarkStart w:name="_Toc48274264" w:id="264"/>
       <w:bookmarkStart w:name="_Toc239426583" w:id="70"/>
@@ -10734,6 +10848,7 @@
       <w:bookmarkEnd w:id="72"/>
       <w:bookmarkEnd w:id="264"/>
       <w:bookmarkEnd w:id="342"/>
+      <w:bookmarkEnd w:id="426"/>
     </w:p>
     <w:p>
       <w:r>
@@ -11636,6 +11751,7 @@
           <w:kern w:val="36"/>
         </w:rPr>
       </w:pPr>
+      <w:bookmarkStart w:name="_Toc440435427" w:id="427"/>
       <w:bookmarkStart w:name="_Toc877617343" w:id="343"/>
       <w:bookmarkStart w:name="_Toc48274265" w:id="265"/>
       <w:bookmarkStart w:name="_Toc239426584" w:id="73"/>
@@ -11654,6 +11770,7 @@
       <w:bookmarkEnd w:id="75"/>
       <w:bookmarkEnd w:id="265"/>
       <w:bookmarkEnd w:id="343"/>
+      <w:bookmarkEnd w:id="427"/>
     </w:p>
     <w:p>
       <w:r>
@@ -13784,6 +13901,7 @@
           <w:kern w:val="36"/>
         </w:rPr>
       </w:pPr>
+      <w:bookmarkStart w:name="_Toc440435428" w:id="428"/>
       <w:bookmarkStart w:name="_Toc877617344" w:id="344"/>
       <w:bookmarkStart w:name="_Toc48274266" w:id="266"/>
       <w:bookmarkStart w:name="_Toc239426585" w:id="76"/>
@@ -13802,6 +13920,7 @@
       <w:bookmarkEnd w:id="78"/>
       <w:bookmarkEnd w:id="266"/>
       <w:bookmarkEnd w:id="344"/>
+      <w:bookmarkEnd w:id="428"/>
     </w:p>
     <w:p>
       <w:r>
@@ -16102,6 +16221,7 @@
           <w:kern w:val="36"/>
         </w:rPr>
       </w:pPr>
+      <w:bookmarkStart w:name="_Toc440435429" w:id="429"/>
       <w:bookmarkStart w:name="_Toc877617345" w:id="345"/>
       <w:bookmarkStart w:name="_Toc48274267" w:id="267"/>
       <w:bookmarkStart w:name="_Toc239426586" w:id="79"/>
@@ -16119,6 +16239,7 @@
       <w:bookmarkEnd w:id="81"/>
       <w:bookmarkEnd w:id="267"/>
       <w:bookmarkEnd w:id="345"/>
+      <w:bookmarkEnd w:id="429"/>
     </w:p>
     <w:p>
       <w:pPr>
@@ -17260,6 +17381,7 @@
           <w:kern w:val="36"/>
         </w:rPr>
       </w:pPr>
+      <w:bookmarkStart w:name="_Toc440435430" w:id="430"/>
       <w:bookmarkStart w:name="_Toc877617346" w:id="346"/>
       <w:bookmarkStart w:name="_Toc48274268" w:id="268"/>
       <w:bookmarkStart w:name="_Toc239426587" w:id="82"/>
@@ -17278,6 +17400,7 @@
       <w:bookmarkEnd w:id="84"/>
       <w:bookmarkEnd w:id="268"/>
       <w:bookmarkEnd w:id="346"/>
+      <w:bookmarkEnd w:id="430"/>
     </w:p>
     <w:p>
       <w:pPr>
@@ -18117,6 +18240,7 @@
       <w:pPr>
         <w:pStyle w:val="Heading1"/>
       </w:pPr>
+      <w:bookmarkStart w:name="_Toc440435431" w:id="431"/>
       <w:bookmarkStart w:name="_Toc877617347" w:id="347"/>
       <w:bookmarkStart w:name="_Toc48274269" w:id="269"/>
       <w:bookmarkStart w:name="_Toc239426588" w:id="85"/>
@@ -18131,6 +18255,7 @@
       <w:bookmarkEnd w:id="87"/>
       <w:bookmarkEnd w:id="269"/>
       <w:bookmarkEnd w:id="347"/>
+      <w:bookmarkEnd w:id="431"/>
     </w:p>
     <w:p>
       <w:r>
@@ -18982,6 +19107,7 @@
       <w:pPr>
         <w:pStyle w:val="Heading1"/>
       </w:pPr>
+      <w:bookmarkStart w:name="_Toc440435432" w:id="432"/>
       <w:bookmarkStart w:name="_Toc877617348" w:id="348"/>
       <w:bookmarkStart w:name="_Toc48274270" w:id="270"/>
       <w:bookmarkStart w:name="_Toc239426589" w:id="89"/>
@@ -18996,6 +19122,7 @@
       <w:bookmarkEnd w:id="91"/>
       <w:bookmarkEnd w:id="270"/>
       <w:bookmarkEnd w:id="348"/>
+      <w:bookmarkEnd w:id="432"/>
     </w:p>
     <w:p>
       <w:r>
@@ -21198,6 +21325,7 @@
           <w:kern w:val="36"/>
         </w:rPr>
       </w:pPr>
+      <w:bookmarkStart w:name="_Toc440435433" w:id="433"/>
       <w:bookmarkStart w:name="_Toc877617349" w:id="349"/>
       <w:bookmarkStart w:name="_Toc48274271" w:id="271"/>
       <w:bookmarkStart w:name="_Ref273526076" w:id="92"/>
@@ -21217,6 +21345,7 @@
       <w:bookmarkEnd w:id="95"/>
       <w:bookmarkEnd w:id="271"/>
       <w:bookmarkEnd w:id="349"/>
+      <w:bookmarkEnd w:id="433"/>
     </w:p>
     <w:p>
       <w:r>
@@ -23602,6 +23731,7 @@
           <w:kern w:val="36"/>
         </w:rPr>
       </w:pPr>
+      <w:bookmarkStart w:name="_Toc440435434" w:id="434"/>
       <w:bookmarkStart w:name="_Toc877617350" w:id="350"/>
       <w:bookmarkStart w:name="_Toc48274272" w:id="272"/>
       <w:bookmarkStart w:name="_Toc239426591" w:id="96"/>
@@ -23619,6 +23749,7 @@
       <w:bookmarkEnd w:id="98"/>
       <w:bookmarkEnd w:id="272"/>
       <w:bookmarkEnd w:id="350"/>
+      <w:bookmarkEnd w:id="434"/>
     </w:p>
     <w:p>
       <w:r>
@@ -23793,6 +23924,7 @@
           <w:kern w:val="36"/>
         </w:rPr>
       </w:pPr>
+      <w:bookmarkStart w:name="_Toc440435435" w:id="435"/>
       <w:bookmarkStart w:name="_Toc877617351" w:id="351"/>
       <w:bookmarkStart w:name="_Toc48274273" w:id="273"/>
       <w:bookmarkStart w:name="_Toc239426592" w:id="99"/>
@@ -23810,6 +23942,7 @@
       <w:bookmarkEnd w:id="101"/>
       <w:bookmarkEnd w:id="273"/>
       <w:bookmarkEnd w:id="351"/>
+      <w:bookmarkEnd w:id="435"/>
     </w:p>
     <w:p>
       <w:hyperlink w:history="true" r:id="rId53">
@@ -23912,6 +24045,7 @@
           <w:kern w:val="36"/>
         </w:rPr>
       </w:pPr>
+      <w:bookmarkStart w:name="_Toc440435436" w:id="436"/>
       <w:bookmarkStart w:name="_Toc877617352" w:id="352"/>
       <w:bookmarkStart w:name="_Toc48274274" w:id="274"/>
       <w:bookmarkStart w:name="_Toc239426593" w:id="102"/>
@@ -23938,6 +24072,7 @@
       <w:bookmarkEnd w:id="104"/>
       <w:bookmarkEnd w:id="274"/>
       <w:bookmarkEnd w:id="352"/>
+      <w:bookmarkEnd w:id="436"/>
     </w:p>
     <w:p>
       <w:pPr>
@@ -24177,6 +24312,7 @@
           <w:kern w:val="36"/>
         </w:rPr>
       </w:pPr>
+      <w:bookmarkStart w:name="_Toc440435437" w:id="437"/>
       <w:bookmarkStart w:name="_Toc877617353" w:id="353"/>
       <w:bookmarkStart w:name="_Toc48274275" w:id="275"/>
       <w:bookmarkStart w:name="_Toc239426594" w:id="105"/>
@@ -24194,6 +24330,7 @@
       <w:bookmarkEnd w:id="107"/>
       <w:bookmarkEnd w:id="275"/>
       <w:bookmarkEnd w:id="353"/>
+      <w:bookmarkEnd w:id="437"/>
     </w:p>
     <w:p>
       <w:hyperlink w:history="true" r:id="rId56">
@@ -24666,6 +24803,7 @@
       <w:pPr>
         <w:pStyle w:val="Heading1"/>
       </w:pPr>
+      <w:bookmarkStart w:name="_Toc440435438" w:id="438"/>
       <w:bookmarkStart w:name="_Toc877617354" w:id="354"/>
       <w:bookmarkStart w:name="_Toc48274276" w:id="276"/>
       <w:bookmarkStart w:name="_Ref275255216" w:id="108"/>
@@ -24681,6 +24819,7 @@
       <w:bookmarkEnd w:id="111"/>
       <w:bookmarkEnd w:id="276"/>
       <w:bookmarkEnd w:id="354"/>
+      <w:bookmarkEnd w:id="438"/>
     </w:p>
     <w:p>
       <w:pPr>
@@ -24995,6 +25134,7 @@
           <w:kern w:val="36"/>
         </w:rPr>
       </w:pPr>
+      <w:bookmarkStart w:name="_Toc440435439" w:id="439"/>
       <w:bookmarkStart w:name="_Toc877617355" w:id="355"/>
       <w:bookmarkStart w:name="_Toc48274277" w:id="277"/>
       <w:bookmarkStart w:name="_Toc239426596" w:id="112"/>
@@ -25013,6 +25153,7 @@
       <w:bookmarkEnd w:id="114"/>
       <w:bookmarkEnd w:id="277"/>
       <w:bookmarkEnd w:id="355"/>
+      <w:bookmarkEnd w:id="439"/>
     </w:p>
     <w:p>
       <w:r>
@@ -25125,6 +25266,7 @@
           <w:kern w:val="36"/>
         </w:rPr>
       </w:pPr>
+      <w:bookmarkStart w:name="_Toc440435440" w:id="440"/>
       <w:bookmarkStart w:name="_Toc877617356" w:id="356"/>
       <w:bookmarkStart w:name="_Toc48274278" w:id="278"/>
       <w:bookmarkStart w:name="_Toc239426597" w:id="115"/>
@@ -25138,6 +25280,7 @@
       <w:bookmarkEnd w:id="117"/>
       <w:bookmarkEnd w:id="278"/>
       <w:bookmarkEnd w:id="356"/>
+      <w:bookmarkEnd w:id="440"/>
     </w:p>
     <w:p>
       <w:r>
@@ -25162,6 +25305,7 @@
           <w:kern w:val="36"/>
         </w:rPr>
       </w:pPr>
+      <w:bookmarkStart w:name="_Toc440435441" w:id="441"/>
       <w:bookmarkStart w:name="_Toc877617357" w:id="357"/>
       <w:bookmarkStart w:name="_Toc48274279" w:id="279"/>
       <w:bookmarkStart w:name="_Toc239426598" w:id="118"/>
@@ -25175,6 +25319,7 @@
       <w:bookmarkEnd w:id="120"/>
       <w:bookmarkEnd w:id="279"/>
       <w:bookmarkEnd w:id="357"/>
+      <w:bookmarkEnd w:id="441"/>
     </w:p>
     <w:p>
       <w:r>
@@ -25189,6 +25334,7 @@
           <w:kern w:val="36"/>
         </w:rPr>
       </w:pPr>
+      <w:bookmarkStart w:name="_Toc440435442" w:id="442"/>
       <w:bookmarkStart w:name="_Toc877617358" w:id="358"/>
       <w:bookmarkStart w:name="_Toc48274280" w:id="280"/>
       <w:bookmarkStart w:name="_Toc239426599" w:id="121"/>
@@ -25202,6 +25348,7 @@
       <w:bookmarkEnd w:id="123"/>
       <w:bookmarkEnd w:id="280"/>
       <w:bookmarkEnd w:id="358"/>
+      <w:bookmarkEnd w:id="442"/>
     </w:p>
     <w:p>
       <w:r>
@@ -25235,6 +25382,7 @@
           <w:kern w:val="36"/>
         </w:rPr>
       </w:pPr>
+      <w:bookmarkStart w:name="_Toc440435443" w:id="443"/>
       <w:bookmarkStart w:name="_Toc877617359" w:id="359"/>
       <w:bookmarkStart w:name="_Toc48274281" w:id="281"/>
       <w:bookmarkStart w:name="_Toc505250203" w:id="124"/>
@@ -25244,6 +25392,7 @@
       <w:bookmarkEnd w:id="124"/>
       <w:bookmarkEnd w:id="281"/>
       <w:bookmarkEnd w:id="359"/>
+      <w:bookmarkEnd w:id="443"/>
     </w:p>
     <w:p>
       <w:r>
@@ -25373,6 +25522,7 @@
           <w:kern w:val="36"/>
         </w:rPr>
       </w:pPr>
+      <w:bookmarkStart w:name="_Toc440435444" w:id="444"/>
       <w:bookmarkStart w:name="_Toc877617360" w:id="360"/>
       <w:bookmarkStart w:name="_Toc48274282" w:id="282"/>
       <w:bookmarkStart w:name="_Toc239426600" w:id="125"/>
@@ -25390,6 +25540,7 @@
       <w:bookmarkEnd w:id="127"/>
       <w:bookmarkEnd w:id="282"/>
       <w:bookmarkEnd w:id="360"/>
+      <w:bookmarkEnd w:id="444"/>
     </w:p>
     <w:p>
       <w:pPr>
@@ -25413,7 +25564,7 @@
         <w:spacing w:before="100" w:beforeAutospacing="true" w:after="100" w:afterAutospacing="true" w:line="240" w:lineRule="auto"/>
       </w:pPr>
       <w:r>
-        <w:t>Docx4j’s HTML output is suitable for documents which contain paragraphs, tables and images.  From 17.0.4, equations are output as native MathML.  It can’t handle more exotic features, such as SmartArt or WordArt (DrawingML or VML).</w:t>
+        <w:t xml:space="preserve">Docx4j’s HTML output is suitable for documents which contain paragraphs, tables and images.  From 17.0.4, equations are output as native MathML, and from 17.3.3 charts are drawn (an inline SVG, or a PNG; see Charts).  It can’t handle more exotic features, such as SmartArt or WordArt (DrawingML or VML).</w:t>
       </w:r>
     </w:p>
     <w:p>
@@ -25751,6 +25902,7 @@
           <w:kern w:val="36"/>
         </w:rPr>
       </w:pPr>
+      <w:bookmarkStart w:name="_Toc440435445" w:id="445"/>
       <w:bookmarkStart w:name="_Toc877617361" w:id="361"/>
       <w:bookmarkStart w:name="_Toc48274283" w:id="283"/>
       <w:bookmarkStart w:name="_Toc239426601" w:id="128"/>
@@ -25768,6 +25920,7 @@
       <w:bookmarkEnd w:id="130"/>
       <w:bookmarkEnd w:id="283"/>
       <w:bookmarkEnd w:id="361"/>
+      <w:bookmarkEnd w:id="445"/>
     </w:p>
     <w:p>
       <w:r>
@@ -26133,6 +26286,7 @@
       <w:pPr>
         <w:pStyle w:val="Heading2"/>
       </w:pPr>
+      <w:bookmarkStart w:name="_Toc440435446" w:id="446"/>
       <w:bookmarkStart w:name="_Toc877617362" w:id="362"/>
       <w:bookmarkStart w:name="_Toc48274284" w:id="284"/>
       <w:bookmarkStart w:name="_Toc239426602" w:id="131"/>
@@ -26146,6 +26300,7 @@
       <w:bookmarkEnd w:id="133"/>
       <w:bookmarkEnd w:id="284"/>
       <w:bookmarkEnd w:id="362"/>
+      <w:bookmarkEnd w:id="446"/>
     </w:p>
     <w:p>
       <w:r>
@@ -26238,6 +26393,7 @@
       <w:pPr>
         <w:pStyle w:val="Heading2"/>
       </w:pPr>
+      <w:bookmarkStart w:name="_Toc440435447" w:id="447"/>
       <w:bookmarkStart w:name="_Toc877617363" w:id="363"/>
       <w:bookmarkStart w:name="_Toc48274285" w:id="285"/>
       <w:bookmarkStart w:name="_Toc239426603" w:id="134"/>
@@ -26251,6 +26407,7 @@
       <w:bookmarkEnd w:id="136"/>
       <w:bookmarkEnd w:id="285"/>
       <w:bookmarkEnd w:id="363"/>
+      <w:bookmarkEnd w:id="447"/>
     </w:p>
     <w:p>
       <w:r>
@@ -26280,6 +26437,7 @@
       <w:pPr>
         <w:pStyle w:val="Heading2"/>
       </w:pPr>
+      <w:bookmarkStart w:name="_Toc440435448" w:id="448"/>
       <w:bookmarkStart w:name="_Toc877617364" w:id="364"/>
       <w:bookmarkStart w:name="_Toc48274286" w:id="286"/>
       <w:bookmarkStart w:name="_Toc239426604" w:id="137"/>
@@ -26293,6 +26451,7 @@
       <w:bookmarkEnd w:id="139"/>
       <w:bookmarkEnd w:id="286"/>
       <w:bookmarkEnd w:id="364"/>
+      <w:bookmarkEnd w:id="448"/>
     </w:p>
     <w:p>
       <w:r>
@@ -26546,6 +26705,27 @@
     <w:p>
       <w:r>
         <w:t>To make the docx itself smaller, CompressPictures.compress(wordMLPackage, "220", true) does what Word’s Compress Pictures does.</w:t>
+      </w:r>
+    </w:p>
+    <w:p>
+      <w:r>
+        <w:rPr>
+          <w:b/>
+          <w:bCs/>
+        </w:rPr>
+        <w:t xml:space="preserve">Charts.  </w:t>
+      </w:r>
+      <w:r>
+        <w:t xml:space="preserve">From 17.3.3, charts in the docx are drawn in the PDF, on both FO pathways, as Office lays them out: SVG inside </w:t>
+      </w:r>
+      <w:r>
+        <w:rPr>
+          <w:rFonts w:ascii="Consolas" w:hAnsi="Consolas"/>
+        </w:rPr>
+        <w:t xml:space="preserve">fo:instream-foreign-object</w:t>
+      </w:r>
+      <w:r>
+        <w:t xml:space="preserve">, with its text kept as text.  docx4j-export-fo brings the module that draws them, docx4j-chart-render.  See Charts, below, for what it draws and its settings.</w:t>
       </w:r>
     </w:p>
     <w:p>
@@ -27239,6 +27419,7 @@
           <w:rFonts w:eastAsia="Times New Roman"/>
         </w:rPr>
       </w:pPr>
+      <w:bookmarkStart w:name="_Toc440435449" w:id="449"/>
       <w:bookmarkStart w:name="_Toc877617365" w:id="365"/>
       <w:bookmarkStart w:name="_Toc48274287" w:id="287"/>
       <w:bookmarkStart w:name="_Toc239426605" w:id="140"/>
@@ -27261,6 +27442,7 @@
       <w:bookmarkEnd w:id="142"/>
       <w:bookmarkEnd w:id="287"/>
       <w:bookmarkEnd w:id="365"/>
+      <w:bookmarkEnd w:id="449"/>
     </w:p>
     <w:p>
       <w:r>
@@ -31812,6 +31994,7 @@
       <w:pPr>
         <w:pStyle w:val="Heading2"/>
       </w:pPr>
+      <w:bookmarkStart w:name="_Toc440435450" w:id="450"/>
       <w:bookmarkStart w:name="_Toc877617366" w:id="366"/>
       <w:bookmarkStart w:name="_Toc48274288" w:id="288"/>
       <w:bookmarkStart w:name="_Toc241334768" w:id="143"/>
@@ -31823,6 +32006,7 @@
       <w:bookmarkEnd w:id="144"/>
       <w:bookmarkEnd w:id="288"/>
       <w:bookmarkEnd w:id="366"/>
+      <w:bookmarkEnd w:id="450"/>
     </w:p>
     <w:p>
       <w:r>
@@ -31856,6 +32040,7 @@
           <w:rFonts w:eastAsia="Times New Roman"/>
         </w:rPr>
       </w:pPr>
+      <w:bookmarkStart w:name="_Toc440435451" w:id="451"/>
       <w:bookmarkStart w:name="_Toc877617367" w:id="367"/>
       <w:bookmarkStart w:name="_Toc48274289" w:id="289"/>
       <w:bookmarkStart w:name="_Toc239426606" w:id="145"/>
@@ -31872,6 +32057,7 @@
       <w:bookmarkEnd w:id="147"/>
       <w:bookmarkEnd w:id="289"/>
       <w:bookmarkEnd w:id="367"/>
+      <w:bookmarkEnd w:id="451"/>
     </w:p>
     <w:p>
       <w:r>
@@ -32096,6 +32282,7 @@
           <w:rFonts w:eastAsia="Times New Roman"/>
         </w:rPr>
       </w:pPr>
+      <w:bookmarkStart w:name="_Toc440435452" w:id="452"/>
       <w:bookmarkStart w:name="_Toc877617368" w:id="368"/>
       <w:bookmarkStart w:name="_Toc48274290" w:id="290"/>
       <w:bookmarkStart w:name="_Toc239426607" w:id="148"/>
@@ -32112,6 +32299,7 @@
       <w:bookmarkEnd w:id="150"/>
       <w:bookmarkEnd w:id="290"/>
       <w:bookmarkEnd w:id="368"/>
+      <w:bookmarkEnd w:id="452"/>
     </w:p>
     <w:p>
       <w:r>
@@ -32136,6 +32324,7 @@
           <w:rFonts w:eastAsia="Times New Roman"/>
         </w:rPr>
       </w:pPr>
+      <w:bookmarkStart w:name="_Toc440435453" w:id="453"/>
       <w:bookmarkStart w:name="_Toc877617369" w:id="369"/>
       <w:bookmarkStart w:name="_Toc48274291" w:id="291"/>
       <w:bookmarkStart w:name="_Toc239426608" w:id="151"/>
@@ -32152,6 +32341,7 @@
       <w:bookmarkEnd w:id="153"/>
       <w:bookmarkEnd w:id="291"/>
       <w:bookmarkEnd w:id="369"/>
+      <w:bookmarkEnd w:id="453"/>
     </w:p>
     <w:p>
       <w:r>
@@ -32165,6 +32355,7 @@
           <w:rFonts w:eastAsia="Times New Roman"/>
         </w:rPr>
       </w:pPr>
+      <w:bookmarkStart w:name="_Toc440435454" w:id="454"/>
       <w:bookmarkStart w:name="_Toc877617370" w:id="370"/>
       <w:bookmarkStart w:name="_Toc48274292" w:id="292"/>
       <w:bookmarkStart w:name="_Toc239426609" w:id="154"/>
@@ -32181,6 +32372,7 @@
       <w:bookmarkEnd w:id="156"/>
       <w:bookmarkEnd w:id="292"/>
       <w:bookmarkEnd w:id="370"/>
+      <w:bookmarkEnd w:id="454"/>
     </w:p>
     <w:p>
       <w:r>
@@ -32762,6 +32954,7 @@
           <w:rFonts w:eastAsia="Times New Roman"/>
         </w:rPr>
       </w:pPr>
+      <w:bookmarkStart w:name="_Toc440435455" w:id="455"/>
       <w:bookmarkStart w:name="_Toc877617371" w:id="371"/>
       <w:bookmarkStart w:name="_Toc48274293" w:id="293"/>
       <w:bookmarkStart w:name="_Toc239426610" w:id="157"/>
@@ -32784,6 +32977,7 @@
       <w:bookmarkEnd w:id="159"/>
       <w:bookmarkEnd w:id="293"/>
       <w:bookmarkEnd w:id="371"/>
+      <w:bookmarkEnd w:id="455"/>
     </w:p>
     <w:p>
       <w:pPr>
@@ -32921,6 +33115,7 @@
       <w:pPr>
         <w:pStyle w:val="Heading2"/>
       </w:pPr>
+      <w:bookmarkStart w:name="_Toc440435456" w:id="456"/>
       <w:bookmarkStart w:name="_Toc877617372" w:id="372"/>
       <w:bookmarkStart w:name="_Toc48274294" w:id="294"/>
       <w:bookmarkStart w:name="_Toc403733683" w:id="160"/>
@@ -32936,6 +33131,7 @@
       <w:bookmarkEnd w:id="163"/>
       <w:bookmarkEnd w:id="294"/>
       <w:bookmarkEnd w:id="372"/>
+      <w:bookmarkEnd w:id="456"/>
     </w:p>
     <w:p>
       <w:r>
@@ -32967,6 +33163,7 @@
       <w:pPr>
         <w:pStyle w:val="Heading2"/>
       </w:pPr>
+      <w:bookmarkStart w:name="_Toc440435457" w:id="457"/>
       <w:bookmarkStart w:name="_Toc877617373" w:id="373"/>
       <w:bookmarkStart w:name="_Toc48274295" w:id="295"/>
       <w:bookmarkStart w:name="_Toc403733684" w:id="164"/>
@@ -32983,6 +33180,7 @@
       <w:bookmarkEnd w:id="167"/>
       <w:bookmarkEnd w:id="295"/>
       <w:bookmarkEnd w:id="373"/>
+      <w:bookmarkEnd w:id="457"/>
     </w:p>
     <w:p>
       <w:r>
@@ -34216,6 +34414,7 @@
       <w:pPr>
         <w:pStyle w:val="Heading2"/>
       </w:pPr>
+      <w:bookmarkStart w:name="_Toc440435458" w:id="458"/>
       <w:bookmarkStart w:name="_Toc877617374" w:id="374"/>
       <w:bookmarkStart w:name="_Toc48274296" w:id="296"/>
       <w:bookmarkStart w:name="_Toc403733685" w:id="168"/>
@@ -34231,6 +34430,7 @@
       <w:bookmarkEnd w:id="171"/>
       <w:bookmarkEnd w:id="296"/>
       <w:bookmarkEnd w:id="374"/>
+      <w:bookmarkEnd w:id="458"/>
     </w:p>
     <w:p>
       <w:pPr>
@@ -34376,6 +34576,7 @@
       <w:pPr>
         <w:pStyle w:val="Heading2"/>
       </w:pPr>
+      <w:bookmarkStart w:name="_Toc440435459" w:id="459"/>
       <w:bookmarkStart w:name="_Toc877617375" w:id="375"/>
       <w:bookmarkStart w:name="_Toc48274297" w:id="297"/>
       <w:bookmarkStart w:name="_Toc403733686" w:id="172"/>
@@ -34391,6 +34592,7 @@
       <w:bookmarkEnd w:id="175"/>
       <w:bookmarkEnd w:id="297"/>
       <w:bookmarkEnd w:id="375"/>
+      <w:bookmarkEnd w:id="459"/>
     </w:p>
     <w:p>
       <w:r>
@@ -35227,6 +35429,7 @@
       <w:pPr>
         <w:pStyle w:val="Heading2"/>
       </w:pPr>
+      <w:bookmarkStart w:name="_Toc440435460" w:id="460"/>
       <w:bookmarkStart w:name="_Toc877617376" w:id="376"/>
       <w:bookmarkStart w:name="_Toc48274298" w:id="298"/>
       <w:bookmarkStart w:name="_Toc403733687" w:id="176"/>
@@ -35245,6 +35448,7 @@
       <w:bookmarkEnd w:id="179"/>
       <w:bookmarkEnd w:id="298"/>
       <w:bookmarkEnd w:id="376"/>
+      <w:bookmarkEnd w:id="460"/>
     </w:p>
     <w:p>
       <w:r>
@@ -35748,6 +35952,7 @@
       <w:pPr>
         <w:pStyle w:val="Heading1"/>
       </w:pPr>
+      <w:bookmarkStart w:name="_Toc440435461" w:id="461"/>
       <w:bookmarkStart w:name="_Toc877617377" w:id="377"/>
       <w:bookmarkStart w:name="_Toc48274299" w:id="299"/>
       <w:bookmarkStart w:name="_Toc241334779" w:id="180"/>
@@ -35759,6 +35964,7 @@
       <w:bookmarkEnd w:id="181"/>
       <w:bookmarkEnd w:id="299"/>
       <w:bookmarkEnd w:id="377"/>
+      <w:bookmarkEnd w:id="461"/>
     </w:p>
     <w:p>
       <w:r>
@@ -35819,6 +36025,7 @@
           <w:rFonts w:eastAsia="Times New Roman"/>
         </w:rPr>
       </w:pPr>
+      <w:bookmarkStart w:name="_Toc440435462" w:id="462"/>
       <w:bookmarkStart w:name="_Toc877617378" w:id="378"/>
       <w:bookmarkStart w:name="_Toc48274300" w:id="300"/>
       <w:bookmarkStart w:name="_Toc239426616" w:id="182"/>
@@ -35835,6 +36042,7 @@
       <w:bookmarkEnd w:id="184"/>
       <w:bookmarkEnd w:id="300"/>
       <w:bookmarkEnd w:id="378"/>
+      <w:bookmarkEnd w:id="462"/>
     </w:p>
     <w:p>
       <w:pPr>
@@ -35920,6 +36128,7 @@
           <w:rFonts w:eastAsia="Times New Roman"/>
         </w:rPr>
       </w:pPr>
+      <w:bookmarkStart w:name="_Toc440435463" w:id="463"/>
       <w:bookmarkStart w:name="_Toc877617379" w:id="379"/>
       <w:bookmarkStart w:name="_Toc48274301" w:id="301"/>
       <w:bookmarkStart w:name="_Toc239426617" w:id="185"/>
@@ -35942,6 +36151,7 @@
       <w:bookmarkEnd w:id="187"/>
       <w:bookmarkEnd w:id="301"/>
       <w:bookmarkEnd w:id="379"/>
+      <w:bookmarkEnd w:id="463"/>
     </w:p>
     <w:p>
       <w:r>
@@ -36235,6 +36445,7 @@
       <w:pPr>
         <w:pStyle w:val="Heading2"/>
       </w:pPr>
+      <w:bookmarkStart w:name="_Toc440435464" w:id="464"/>
       <w:bookmarkStart w:name="_Toc877617380" w:id="380"/>
       <w:bookmarkStart w:name="_Toc48274302" w:id="302"/>
       <w:bookmarkStart w:name="_Toc239426618" w:id="188"/>
@@ -36248,6 +36459,7 @@
       <w:bookmarkEnd w:id="190"/>
       <w:bookmarkEnd w:id="302"/>
       <w:bookmarkEnd w:id="380"/>
+      <w:bookmarkEnd w:id="464"/>
     </w:p>
     <w:p>
       <w:r>
@@ -37268,6 +37480,7 @@
       <w:pPr>
         <w:pStyle w:val="Heading2"/>
       </w:pPr>
+      <w:bookmarkStart w:name="_Toc440435465" w:id="465"/>
       <w:bookmarkStart w:name="_Toc877617381" w:id="381"/>
       <w:bookmarkStart w:name="_Toc48274303" w:id="303"/>
       <w:bookmarkStart w:name="_Toc239426619" w:id="191"/>
@@ -37281,6 +37494,7 @@
       <w:bookmarkEnd w:id="193"/>
       <w:bookmarkEnd w:id="303"/>
       <w:bookmarkEnd w:id="381"/>
+      <w:bookmarkEnd w:id="465"/>
     </w:p>
     <w:p>
       <w:r>
@@ -38326,6 +38540,7 @@
       <w:pPr>
         <w:pStyle w:val="Heading3"/>
       </w:pPr>
+      <w:bookmarkStart w:name="_Toc440435466" w:id="466"/>
       <w:bookmarkStart w:name="_Toc877617382" w:id="382"/>
       <w:bookmarkStart w:name="_Toc48274304" w:id="304"/>
       <w:bookmarkStart w:name="_Toc239426620" w:id="194"/>
@@ -38339,6 +38554,7 @@
       <w:bookmarkEnd w:id="196"/>
       <w:bookmarkEnd w:id="304"/>
       <w:bookmarkEnd w:id="382"/>
+      <w:bookmarkEnd w:id="466"/>
     </w:p>
     <w:p>
       <w:r>
@@ -38402,6 +38618,7 @@
       <w:pPr>
         <w:pStyle w:val="Heading3"/>
       </w:pPr>
+      <w:bookmarkStart w:name="_Toc440435467" w:id="467"/>
       <w:bookmarkStart w:name="_Toc877617383" w:id="383"/>
       <w:bookmarkStart w:name="_Toc48274305" w:id="305"/>
       <w:bookmarkStart w:name="_Toc239426621" w:id="197"/>
@@ -38415,6 +38632,7 @@
       <w:bookmarkEnd w:id="199"/>
       <w:bookmarkEnd w:id="305"/>
       <w:bookmarkEnd w:id="383"/>
+      <w:bookmarkEnd w:id="467"/>
     </w:p>
     <w:p>
       <w:r>
@@ -38428,6 +38646,7 @@
       <w:pPr>
         <w:pStyle w:val="Heading3"/>
       </w:pPr>
+      <w:bookmarkStart w:name="_Toc440435468" w:id="468"/>
       <w:bookmarkStart w:name="_Toc877617384" w:id="384"/>
       <w:bookmarkStart w:name="_Toc48274306" w:id="306"/>
       <w:bookmarkStart w:name="_Toc239426622" w:id="200"/>
@@ -38441,6 +38660,7 @@
       <w:bookmarkEnd w:id="202"/>
       <w:bookmarkEnd w:id="306"/>
       <w:bookmarkEnd w:id="384"/>
+      <w:bookmarkEnd w:id="468"/>
     </w:p>
     <w:p>
       <w:r>
@@ -38451,6 +38671,7 @@
       <w:pPr>
         <w:pStyle w:val="Heading3"/>
       </w:pPr>
+      <w:bookmarkStart w:name="_Toc440435469" w:id="469"/>
       <w:bookmarkStart w:name="_Toc877617385" w:id="385"/>
       <w:bookmarkStart w:name="_Toc48274307" w:id="307"/>
       <w:bookmarkStart w:name="_Toc239426623" w:id="203"/>
@@ -38464,6 +38685,7 @@
       <w:bookmarkEnd w:id="205"/>
       <w:bookmarkEnd w:id="307"/>
       <w:bookmarkEnd w:id="385"/>
+      <w:bookmarkEnd w:id="469"/>
     </w:p>
     <w:p>
       <w:r>
@@ -38494,6 +38716,7 @@
           <w:rFonts w:eastAsia="Times New Roman"/>
         </w:rPr>
       </w:pPr>
+      <w:bookmarkStart w:name="_Toc440435470" w:id="470"/>
       <w:bookmarkStart w:name="_Toc877617386" w:id="386"/>
       <w:bookmarkStart w:name="_Toc48274308" w:id="308"/>
       <w:bookmarkStart w:name="_Toc239426624" w:id="206"/>
@@ -38510,6 +38733,7 @@
       <w:bookmarkEnd w:id="208"/>
       <w:bookmarkEnd w:id="308"/>
       <w:bookmarkEnd w:id="386"/>
+      <w:bookmarkEnd w:id="470"/>
     </w:p>
     <w:p>
       <w:r>
@@ -38520,15 +38744,20 @@
       <w:pPr>
         <w:pStyle w:val="Heading1"/>
       </w:pPr>
+      <w:bookmarkStart w:name="_Toc440435471" w:id="471"/>
       <w:bookmarkStart w:name="_Toc877617387" w:id="387"/>
       <w:r>
         <w:t xml:space="preserve">Charts</w:t>
       </w:r>
       <w:bookmarkEnd w:id="387"/>
+      <w:bookmarkEnd w:id="471"/>
     </w:p>
     <w:p>
       <w:r>
         <w:t xml:space="preserve">From docx4j 17.3.3, you can create a chart in a docx, and edit the data of a chart already there, as Word does.  A chart docx4j creates is Word’s own chart of its type (made from the parts Word and Excel write), with its data in an Excel workbook embedded in the document, so that in Word, Edit Data opens the data and the Chart Design tools (the chart styles, Change Chart Type) work on it.</w:t>
+      </w:r>
+      <w:r>
+        <w:t xml:space="preserve">  From the same release, docx4j’s PDF and HTML output draw charts (see Drawing charts, below).</w:t>
       </w:r>
     </w:p>
     <w:p>
@@ -38729,11 +38958,13 @@
       <w:pPr>
         <w:pStyle w:val="Heading2"/>
       </w:pPr>
+      <w:bookmarkStart w:name="_Toc440435472" w:id="472"/>
       <w:bookmarkStart w:name="_Toc877617388" w:id="388"/>
       <w:r>
         <w:t xml:space="preserve">Creating a chart</w:t>
       </w:r>
       <w:bookmarkEnd w:id="388"/>
+      <w:bookmarkEnd w:id="472"/>
     </w:p>
     <w:p>
       <w:r>
@@ -38927,11 +39158,13 @@
       <w:pPr>
         <w:pStyle w:val="Heading2"/>
       </w:pPr>
+      <w:bookmarkStart w:name="_Toc440435473" w:id="473"/>
       <w:bookmarkStart w:name="_Toc877617389" w:id="389"/>
       <w:r>
         <w:t xml:space="preserve">Editing a chart’s data</w:t>
       </w:r>
       <w:bookmarkEnd w:id="389"/>
+      <w:bookmarkEnd w:id="473"/>
     </w:p>
     <w:p>
       <w:r>
@@ -39013,11 +39246,13 @@
       <w:pPr>
         <w:pStyle w:val="Heading2"/>
       </w:pPr>
+      <w:bookmarkStart w:name="_Toc440435474" w:id="474"/>
       <w:bookmarkStart w:name="_Toc877617390" w:id="390"/>
       <w:r>
         <w:t xml:space="preserve">Settings, reading and deleting</w:t>
       </w:r>
       <w:bookmarkEnd w:id="390"/>
+      <w:bookmarkEnd w:id="474"/>
     </w:p>
     <w:p>
       <w:r>
@@ -39084,11 +39319,13 @@
       <w:pPr>
         <w:pStyle w:val="Heading2"/>
       </w:pPr>
+      <w:bookmarkStart w:name="_Toc440435475" w:id="475"/>
       <w:bookmarkStart w:name="_Toc877617391" w:id="391"/>
       <w:r>
         <w:t xml:space="preserve">Presentations and workbooks</w:t>
       </w:r>
       <w:bookmarkEnd w:id="391"/>
+      <w:bookmarkEnd w:id="475"/>
     </w:p>
     <w:p>
       <w:r>
@@ -39153,11 +39390,155 @@
       <w:pPr>
         <w:pStyle w:val="Heading2"/>
       </w:pPr>
+      <w:bookmarkStart w:name="_Toc440435476" w:id="476"/>
+      <w:r>
+        <w:t xml:space="preserve">Drawing charts</w:t>
+      </w:r>
+      <w:bookmarkEnd w:id="476"/>
+    </w:p>
+    <w:p>
+      <w:r>
+        <w:t xml:space="preserve">docx4j’s PDF and HTML output draw a chart as Office lays it out: its title, legend, axes, gridlines and series, with data labels and axis titles, in the chart’s own colours, fills (gradients and patterns), shadows and fonts.  The drawing is done by docx4j-chart-render, which docx4j-export-fo brings with it.  It draws the types above, in docx, pptx and xlsx, whether docx4j or Office made the chart.</w:t>
+      </w:r>
+    </w:p>
+    <w:p>
+      <w:r>
+        <w:t xml:space="preserve">In a PDF a chart is drawn as vectors, with its text kept as text (</w:t>
+      </w:r>
+      <w:r>
+        <w:rPr>
+          <w:rFonts w:ascii="Consolas" w:hAnsi="Consolas"/>
+        </w:rPr>
+        <w:t xml:space="preserve">docx4j.chart.render.textAsShapes=true</w:t>
+      </w:r>
+      <w:r>
+        <w:t xml:space="preserve"> draws the text as outlines instead); in HTML it is an inline svg element (</w:t>
+      </w:r>
+      <w:r>
+        <w:rPr>
+          <w:rFonts w:ascii="Consolas" w:hAnsi="Consolas"/>
+        </w:rPr>
+        <w:t xml:space="preserve">docx4j.convert.out.html.chartAsPng=true</w:t>
+      </w:r>
+      <w:r>
+        <w:t xml:space="preserve"> writes a PNG instead).  pptx’s SVG-in-HTML output draws charts too.</w:t>
+      </w:r>
+    </w:p>
+    <w:p>
+      <w:r>
+        <w:rPr>
+          <w:rFonts w:ascii="Consolas" w:hAnsi="Consolas"/>
+        </w:rPr>
+        <w:t xml:space="preserve">ChartImages</w:t>
+      </w:r>
+      <w:r>
+        <w:t xml:space="preserve"> (in </w:t>
+      </w:r>
+      <w:r>
+        <w:rPr>
+          <w:rFonts w:ascii="Consolas" w:hAnsi="Consolas"/>
+        </w:rPr>
+        <w:t xml:space="preserve">org.docx4j.model.chart</w:t>
+      </w:r>
+      <w:r>
+        <w:t xml:space="preserve">) gives any chart as SVG or PNG (</w:t>
+      </w:r>
+      <w:r>
+        <w:rPr>
+          <w:rFonts w:ascii="Consolas" w:hAnsi="Consolas"/>
+        </w:rPr>
+        <w:t xml:space="preserve">writeSvg</w:t>
+      </w:r>
+      <w:r>
+        <w:t xml:space="preserve">, </w:t>
+      </w:r>
+      <w:r>
+        <w:rPr>
+          <w:rFonts w:ascii="Consolas" w:hAnsi="Consolas"/>
+        </w:rPr>
+        <w:t xml:space="preserve">writePng</w:t>
+      </w:r>
+      <w:r>
+        <w:t xml:space="preserve">; or </w:t>
+      </w:r>
+      <w:r>
+        <w:rPr>
+          <w:rFonts w:ascii="Consolas" w:hAnsi="Consolas"/>
+        </w:rPr>
+        <w:t xml:space="preserve">toSvg</w:t>
+      </w:r>
+      <w:r>
+        <w:t xml:space="preserve"> and </w:t>
+      </w:r>
+      <w:r>
+        <w:rPr>
+          <w:rFonts w:ascii="Consolas" w:hAnsi="Consolas"/>
+        </w:rPr>
+        <w:t xml:space="preserve">toImage</w:t>
+      </w:r>
+      <w:r>
+        <w:t xml:space="preserve">, a DOM document and a picture):</w:t>
+      </w:r>
+    </w:p>
+    <w:p>
+      <w:pPr>
+        <w:pStyle w:val="Command"/>
+        <w:ind w:left="0"/>
+      </w:pPr>
+      <w:r>
+        <w:t xml:space="preserve">for (ChartRef chart : Charts.in(pkg)) {</w:t>
+      </w:r>
+      <w:r>
+        <w:br/>
+        <w:t xml:space="preserve">    if (ChartImages.check(chart).isDrawn()) {</w:t>
+      </w:r>
+      <w:r>
+        <w:br/>
+        <w:t xml:space="preserve">        String name = chart.getName() + ".png";</w:t>
+      </w:r>
+      <w:r>
+        <w:br/>
+        <w:t xml:space="preserve">        try (OutputStream out = new FileOutputStream(name)) {</w:t>
+      </w:r>
+      <w:r>
+        <w:br/>
+        <w:t xml:space="preserve">            ChartImages.writePng(chart, 192, out);  // 192 dpi</w:t>
+      </w:r>
+      <w:r>
+        <w:br/>
+        <w:t xml:space="preserve">        }</w:t>
+      </w:r>
+      <w:r>
+        <w:br/>
+        <w:t xml:space="preserve">    }</w:t>
+      </w:r>
+      <w:r>
+        <w:br/>
+        <w:t xml:space="preserve">}</w:t>
+      </w:r>
+    </w:p>
+    <w:p>
+      <w:r>
+        <w:rPr>
+          <w:rFonts w:ascii="Consolas" w:hAnsi="Consolas"/>
+        </w:rPr>
+        <w:t xml:space="preserve">check</w:t>
+      </w:r>
+      <w:r>
+        <w:t xml:space="preserve"> says what the renderer would do with a chart: draw it, draw it simplified (naming what it doesn’t draw as Office does, a picture fill for example), or refuse it, with the reasons.  A chart it refuses keeps its space in PDF and HTML output, empty.  See the sample ChartsAsImages in docx4j-samples-docx-export-fo.</w:t>
+      </w:r>
+    </w:p>
+    <w:p>
+      <w:pPr>
+        <w:pStyle w:val="Heading2"/>
+      </w:pPr>
+      <w:bookmarkStart w:name="_Toc440435477" w:id="477"/>
       <w:bookmarkStart w:name="_Toc877617392" w:id="392"/>
       <w:r>
         <w:t xml:space="preserve">Limitations</w:t>
       </w:r>
       <w:bookmarkEnd w:id="392"/>
+      <w:bookmarkEnd w:id="477"/>
     </w:p>
     <w:p>
       <w:pPr>
@@ -39249,13 +39630,23 @@
         </w:numPr>
       </w:pPr>
       <w:r>
-        <w:t xml:space="preserve">docx4j’s PDF and HTML output don’t draw charts yet: a chart’s space is kept, empty.</w:t>
+        <w:t xml:space="preserve">PDF and HTML output and </w:t>
+      </w:r>
+      <w:r>
+        <w:rPr>
+          <w:rFonts w:ascii="Consolas" w:hAnsi="Consolas"/>
+        </w:rPr>
+        <w:t xml:space="preserve">ChartImages</w:t>
+      </w:r>
+      <w:r>
+        <w:t xml:space="preserve"> don’t draw combination charts, secondary axes, 3-D charts or the Office 2016 types: their space is kept, empty.  A few placements differ from Office’s by a point or so (a pie’s labels at best fit, a layout set by factors).</w:t>
       </w:r>
     </w:p>
     <w:p>
       <w:pPr>
         <w:pStyle w:val="Heading1"/>
       </w:pPr>
+      <w:bookmarkStart w:name="_Toc440435478" w:id="478"/>
       <w:bookmarkStart w:name="_Toc877617393" w:id="393"/>
       <w:bookmarkStart w:name="_Toc48274309" w:id="309"/>
       <w:bookmarkStart w:name="_Toc239426625" w:id="209"/>
@@ -39269,6 +39660,7 @@
       <w:bookmarkEnd w:id="211"/>
       <w:bookmarkEnd w:id="309"/>
       <w:bookmarkEnd w:id="393"/>
+      <w:bookmarkEnd w:id="478"/>
     </w:p>
     <w:p>
       <w:r>
@@ -39371,6 +39763,7 @@
       <w:pPr>
         <w:pStyle w:val="Heading1"/>
       </w:pPr>
+      <w:bookmarkStart w:name="_Toc440435479" w:id="479"/>
       <w:bookmarkStart w:name="_Toc877617394" w:id="394"/>
       <w:bookmarkStart w:name="_Toc48274310" w:id="310"/>
       <w:bookmarkStart w:name="_Toc239426626" w:id="212"/>
@@ -39385,11 +39778,13 @@
       <w:bookmarkEnd w:id="214"/>
       <w:bookmarkEnd w:id="310"/>
       <w:bookmarkEnd w:id="394"/>
+      <w:bookmarkEnd w:id="479"/>
     </w:p>
     <w:p>
       <w:pPr>
         <w:pStyle w:val="Heading2"/>
       </w:pPr>
+      <w:bookmarkStart w:name="_Toc440435480" w:id="480"/>
       <w:bookmarkStart w:name="_Toc877617395" w:id="395"/>
       <w:bookmarkStart w:name="_Toc48274311" w:id="311"/>
       <w:bookmarkStart w:name="_Toc239426627" w:id="215"/>
@@ -39403,6 +39798,7 @@
       <w:bookmarkEnd w:id="217"/>
       <w:bookmarkEnd w:id="311"/>
       <w:bookmarkEnd w:id="395"/>
+      <w:bookmarkEnd w:id="480"/>
     </w:p>
     <w:p>
       <w:pPr>
@@ -39612,6 +40008,7 @@
           <w:szCs w:val="18"/>
         </w:rPr>
       </w:pPr>
+      <w:bookmarkStart w:name="_Toc440435481" w:id="481"/>
       <w:bookmarkStart w:name="_Toc877617396" w:id="396"/>
       <w:bookmarkStart w:name="_Toc48274312" w:id="312"/>
       <w:bookmarkStart w:name="_Toc239426628" w:id="218"/>
@@ -39629,6 +40026,7 @@
       <w:bookmarkEnd w:id="220"/>
       <w:bookmarkEnd w:id="312"/>
       <w:bookmarkEnd w:id="396"/>
+      <w:bookmarkEnd w:id="481"/>
     </w:p>
     <w:p>
       <w:r>
@@ -39794,6 +40192,7 @@
       <w:pPr>
         <w:pStyle w:val="Heading2"/>
       </w:pPr>
+      <w:bookmarkStart w:name="_Toc440435482" w:id="482"/>
       <w:bookmarkStart w:name="_Toc877617397" w:id="397"/>
       <w:bookmarkStart w:name="_Toc48274313" w:id="313"/>
       <w:bookmarkStart w:name="_Toc239426629" w:id="222"/>
@@ -39808,6 +40207,7 @@
       <w:bookmarkEnd w:id="224"/>
       <w:bookmarkEnd w:id="313"/>
       <w:bookmarkEnd w:id="397"/>
+      <w:bookmarkEnd w:id="482"/>
     </w:p>
     <w:p>
       <w:r>
@@ -40811,6 +41211,7 @@
           <w:rFonts w:eastAsia="Times New Roman"/>
         </w:rPr>
       </w:pPr>
+      <w:bookmarkStart w:name="_Toc440435483" w:id="483"/>
       <w:bookmarkStart w:name="_Toc877617398" w:id="398"/>
       <w:bookmarkStart w:name="_Toc48274314" w:id="314"/>
       <w:bookmarkStart w:name="_Toc239426630" w:id="225"/>
@@ -40827,6 +41228,7 @@
       <w:bookmarkEnd w:id="227"/>
       <w:bookmarkEnd w:id="314"/>
       <w:bookmarkEnd w:id="398"/>
+      <w:bookmarkEnd w:id="483"/>
     </w:p>
     <w:p>
       <w:pPr>
@@ -41222,6 +41624,7 @@
           <w:u w:val="single"/>
         </w:rPr>
       </w:pPr>
+      <w:bookmarkStart w:name="_Toc440435484" w:id="484"/>
       <w:bookmarkStart w:name="_Toc877617399" w:id="399"/>
       <w:bookmarkStart w:name="_Toc48274315" w:id="315"/>
       <w:bookmarkStart w:name="_Toc239426631" w:id="228"/>
@@ -41256,6 +41659,7 @@
       <w:bookmarkEnd w:id="230"/>
       <w:bookmarkEnd w:id="315"/>
       <w:bookmarkEnd w:id="399"/>
+      <w:bookmarkEnd w:id="484"/>
     </w:p>
     <w:p>
       <w:pPr>
@@ -43287,6 +43691,7 @@
       <w:pPr>
         <w:pStyle w:val="Heading2"/>
       </w:pPr>
+      <w:bookmarkStart w:name="_Toc440435485" w:id="485"/>
       <w:bookmarkStart w:name="_Toc877617400" w:id="400"/>
       <w:bookmarkStart w:name="_Toc48274316" w:id="316"/>
       <w:bookmarkStart w:name="_Toc241334796" w:id="231"/>
@@ -43299,6 +43704,7 @@
       <w:bookmarkEnd w:id="232"/>
       <w:bookmarkEnd w:id="316"/>
       <w:bookmarkEnd w:id="400"/>
+      <w:bookmarkEnd w:id="485"/>
     </w:p>
     <w:p>
       <w:r>
@@ -43444,6 +43850,7 @@
           <w:u w:val="single"/>
         </w:rPr>
       </w:pPr>
+      <w:bookmarkStart w:name="_Toc440435486" w:id="486"/>
       <w:bookmarkStart w:name="_Toc877617401" w:id="401"/>
       <w:bookmarkStart w:name="_Toc48274317" w:id="317"/>
       <w:bookmarkStart w:name="_Toc239426632" w:id="233"/>
@@ -43472,6 +43879,7 @@
       <w:bookmarkEnd w:id="235"/>
       <w:bookmarkEnd w:id="317"/>
       <w:bookmarkEnd w:id="401"/>
+      <w:bookmarkEnd w:id="486"/>
     </w:p>
     <w:p>
       <w:r>
@@ -44933,6 +45341,7 @@
       <w:pPr>
         <w:pStyle w:val="Heading2"/>
       </w:pPr>
+      <w:bookmarkStart w:name="_Toc440435487" w:id="487"/>
       <w:bookmarkStart w:name="_Toc877617402" w:id="402"/>
       <w:bookmarkStart w:name="_Toc48274318" w:id="318"/>
       <w:bookmarkStart w:name="_Toc241334798" w:id="239"/>
@@ -44944,6 +45353,7 @@
       <w:bookmarkEnd w:id="240"/>
       <w:bookmarkEnd w:id="318"/>
       <w:bookmarkEnd w:id="402"/>
+      <w:bookmarkEnd w:id="487"/>
     </w:p>
     <w:p>
       <w:r>
@@ -45000,7 +45410,7 @@
 </file>
 
 <file path=word/endnotes.xml><?xml version="1.0" encoding="utf-8"?>
-<w:endnotes xmlns:w="http://schemas.openxmlformats.org/wordprocessingml/2006/main" xmlns:w14="http://schemas.microsoft.com/office/word/2010/wordml" xmlns:w16du="http://schemas.microsoft.com/office/word/2023/wordml/word16du" xmlns:w16sdtdh="http://schemas.microsoft.com/office/word/2020/wordml/sdtdatahash" xmlns:w15="http://schemas.microsoft.com/office/word/2012/wordml" xmlns:w16sdtfl="http://schemas.microsoft.com/office/word/2024/wordml/sdtformatlock" xmlns:r="http://schemas.openxmlformats.org/officeDocument/2006/relationships" xmlns:w16se="http://schemas.microsoft.com/office/word/2015/wordml/symex" xmlns:m="http://schemas.openxmlformats.org/officeDocument/2006/math" xmlns:a="http://schemas.openxmlformats.org/drawingml/2006/main" xmlns:wp="http://schemas.openxmlformats.org/drawingml/2006/wordprocessingDrawing" xmlns:wp14="http://schemas.microsoft.com/office/word/2010/wordprocessingDrawing" xmlns:mc="http://schemas.openxmlformats.org/markup-compatibility/2006" xmlns:a14="http://schemas.microsoft.com/office/drawing/2010/main" xmlns:w16cid="http://schemas.microsoft.com/office/word/2016/wordml/cid" xmlns:sl="http://schemas.openxmlformats.org/schemaLibrary/2006/main" xmlns:wne="http://schemas.microsoft.com/office/word/2006/wordml" xmlns:c="http://schemas.openxmlformats.org/drawingml/2006/chart" xmlns:cdr="http://schemas.openxmlformats.org/drawingml/2006/chartDrawing" xmlns:c14="http://schemas.microsoft.com/office/drawing/2007/8/2/chart" xmlns:dgm="http://schemas.openxmlformats.org/drawingml/2006/diagram" xmlns:pic="http://schemas.openxmlformats.org/drawingml/2006/picture" xmlns:xdr="http://schemas.openxmlformats.org/drawingml/2006/spreadsheetDrawing" xmlns:dsp="http://schemas.microsoft.com/office/drawing/2008/diagram" xmlns:o="urn:schemas-microsoft-com:office:office" xmlns:v="urn:schemas-microsoft-com:vml" xmlns:w10="urn:schemas-microsoft-com:office:word" xmlns:xvml="urn:schemas-microsoft-com:office:excel" xmlns:pvml="urn:schemas-microsoft-com:office:powerpoint" xmlns:cppr="http://schemas.microsoft.com/office/2006/coverPageProps" xmlns:odx="http://opendope.org/xpaths" xmlns:odc="http://opendope.org/conditions" xmlns:odq="http://opendope.org/questions" xmlns:oda="http://opendope.org/answers" xmlns:odi="http://opendope.org/components" xmlns:odgm="http://opendope.org/SmartArt/DataHierarchy" xmlns:b="http://schemas.openxmlformats.org/officeDocument/2006/bibliography" xmlns:msink="http://schemas.microsoft.com/ink/2010/main" xmlns:cdr14="http://schemas.microsoft.com/office/drawing/2010/chartDrawing" xmlns:c15="http://schemas.microsoft.com/office/drawing/2012/chart" xmlns:cs="http://schemas.microsoft.com/office/drawing/2012/chartStyle" xmlns:ns43="http://www.w3.org/1998/Math/MathML" xmlns:ns44="http://www.w3.org/2003/InkML" xmlns:a13cmd="http://schemas.microsoft.com/office/drawing/2013/main/command" xmlns:cx="http://schemas.microsoft.com/office/drawing/2014/chartex" xmlns:c16="http://schemas.microsoft.com/office/drawing/2014/chart" xmlns:dgm1611="http://schemas.microsoft.com/office/drawing/2016/11/diagram" xmlns:c16r3="http://schemas.microsoft.com/office/drawing/2017/03/chart" xmlns:am3d="http://schemas.microsoft.com/office/drawing/2017/model3d" xmlns:an18="http://schemas.microsoft.com/office/drawing/2018/animation" xmlns:anam3d="http://schemas.microsoft.com/office/drawing/2018/animation/model3d" xmlns:iact="http://schemas.microsoft.com/office/powerpoint/2014/inkAction" xmlns:thm15="http://schemas.microsoft.com/office/thememl/2012/main" xmlns:wps="http://schemas.microsoft.com/office/word/2010/wordprocessingShape" xmlns:wpc="http://schemas.microsoft.com/office/word/2010/wordprocessingCanvas" xmlns:wpg="http://schemas.microsoft.com/office/word/2010/wordprocessingGroup" xmlns:w16="http://schemas.microsoft.com/office/word/2018/wordml" xmlns:w16cex="http://schemas.microsoft.com/office/word/2018/wordml/cex" xmlns:cei="http://schemas.microsoft.com/office/word/2026/wordml/cei" xmlns:wetp="http://schemas.microsoft.com/office/webextensions/taskpanes/2010/11" xmlns:we="http://schemas.microsoft.com/office/webextensions/webextension/2010/11" xmlns:comp="http://schemas.openxmlformats.org/drawingml/2006/compatibility" xmlns:lc="http://schemas.openxmlformats.org/drawingml/2006/lockedCanvas" xmlns:dgm14="http://schemas.microsoft.com/office/drawing/2010/diagram" xmlns:a15="http://schemas.microsoft.com/office/drawing/2012/main" xmlns:pic14="http://schemas.microsoft.com/office/drawing/2010/picture" xmlns:c16ac="http://schemas.microsoft.com/office/drawing/2014/chart/ac" xmlns:a16="http://schemas.microsoft.com/office/drawing/2014/main" xmlns:a1611="http://schemas.microsoft.com/office/drawing/2016/11/main" xmlns:dgm1612="http://schemas.microsoft.com/office/drawing/2016/12/diagram" xmlns:a16svg="http://schemas.microsoft.com/office/drawing/2016/SVG/main" xmlns:adec="http://schemas.microsoft.com/office/drawing/2017/decorative" xmlns:a18hc="http://schemas.microsoft.com/office/drawing/2018/hyperlinkcolor" xmlns:wp15="http://schemas.microsoft.com/office/word/2012/wordprocessingDrawing" mc:Ignorable="w14 w15 w16se w16cid w16 w16cex w16sdtdh w16sdtfl w16du wp14">
+<w:endnotes xmlns:w="http://schemas.openxmlformats.org/wordprocessingml/2006/main" xmlns:w14="http://schemas.microsoft.com/office/word/2010/wordml" xmlns:w16du="http://schemas.microsoft.com/office/word/2023/wordml/word16du" xmlns:w16se="http://schemas.microsoft.com/office/word/2015/wordml/symex" xmlns:r="http://schemas.openxmlformats.org/officeDocument/2006/relationships" xmlns:w16sdtdh="http://schemas.microsoft.com/office/word/2020/wordml/sdtdatahash" xmlns:w15="http://schemas.microsoft.com/office/word/2012/wordml" xmlns:w16sdtfl="http://schemas.microsoft.com/office/word/2024/wordml/sdtformatlock" xmlns:m="http://schemas.openxmlformats.org/officeDocument/2006/math" xmlns:a="http://schemas.openxmlformats.org/drawingml/2006/main" xmlns:wp="http://schemas.openxmlformats.org/drawingml/2006/wordprocessingDrawing" xmlns:wp14="http://schemas.microsoft.com/office/word/2010/wordprocessingDrawing" xmlns:mc="http://schemas.openxmlformats.org/markup-compatibility/2006" xmlns:a14="http://schemas.microsoft.com/office/drawing/2010/main" xmlns:w16cid="http://schemas.microsoft.com/office/word/2016/wordml/cid" xmlns:sl="http://schemas.openxmlformats.org/schemaLibrary/2006/main" xmlns:wne="http://schemas.microsoft.com/office/word/2006/wordml" xmlns:c="http://schemas.openxmlformats.org/drawingml/2006/chart" xmlns:cdr="http://schemas.openxmlformats.org/drawingml/2006/chartDrawing" xmlns:c14="http://schemas.microsoft.com/office/drawing/2007/8/2/chart" xmlns:dgm="http://schemas.openxmlformats.org/drawingml/2006/diagram" xmlns:pic="http://schemas.openxmlformats.org/drawingml/2006/picture" xmlns:xdr="http://schemas.openxmlformats.org/drawingml/2006/spreadsheetDrawing" xmlns:dsp="http://schemas.microsoft.com/office/drawing/2008/diagram" xmlns:o="urn:schemas-microsoft-com:office:office" xmlns:v="urn:schemas-microsoft-com:vml" xmlns:w10="urn:schemas-microsoft-com:office:word" xmlns:xvml="urn:schemas-microsoft-com:office:excel" xmlns:pvml="urn:schemas-microsoft-com:office:powerpoint" xmlns:cppr="http://schemas.microsoft.com/office/2006/coverPageProps" xmlns:odx="http://opendope.org/xpaths" xmlns:odc="http://opendope.org/conditions" xmlns:odq="http://opendope.org/questions" xmlns:oda="http://opendope.org/answers" xmlns:odi="http://opendope.org/components" xmlns:odgm="http://opendope.org/SmartArt/DataHierarchy" xmlns:b="http://schemas.openxmlformats.org/officeDocument/2006/bibliography" xmlns:msink="http://schemas.microsoft.com/ink/2010/main" xmlns:cdr14="http://schemas.microsoft.com/office/drawing/2010/chartDrawing" xmlns:c15="http://schemas.microsoft.com/office/drawing/2012/chart" xmlns:cs="http://schemas.microsoft.com/office/drawing/2012/chartStyle" xmlns:ns43="http://www.w3.org/1998/Math/MathML" xmlns:ns44="http://www.w3.org/2003/InkML" xmlns:a13cmd="http://schemas.microsoft.com/office/drawing/2013/main/command" xmlns:cx="http://schemas.microsoft.com/office/drawing/2014/chartex" xmlns:c16="http://schemas.microsoft.com/office/drawing/2014/chart" xmlns:dgm1611="http://schemas.microsoft.com/office/drawing/2016/11/diagram" xmlns:c16r3="http://schemas.microsoft.com/office/drawing/2017/03/chart" xmlns:am3d="http://schemas.microsoft.com/office/drawing/2017/model3d" xmlns:an18="http://schemas.microsoft.com/office/drawing/2018/animation" xmlns:anam3d="http://schemas.microsoft.com/office/drawing/2018/animation/model3d" xmlns:iact="http://schemas.microsoft.com/office/powerpoint/2014/inkAction" xmlns:thm15="http://schemas.microsoft.com/office/thememl/2012/main" xmlns:wps="http://schemas.microsoft.com/office/word/2010/wordprocessingShape" xmlns:wpc="http://schemas.microsoft.com/office/word/2010/wordprocessingCanvas" xmlns:wpg="http://schemas.microsoft.com/office/word/2010/wordprocessingGroup" xmlns:w16="http://schemas.microsoft.com/office/word/2018/wordml" xmlns:w16cex="http://schemas.microsoft.com/office/word/2018/wordml/cex" xmlns:cei="http://schemas.microsoft.com/office/word/2026/wordml/cei" xmlns:wetp="http://schemas.microsoft.com/office/webextensions/taskpanes/2010/11" xmlns:we="http://schemas.microsoft.com/office/webextensions/webextension/2010/11" xmlns:comp="http://schemas.openxmlformats.org/drawingml/2006/compatibility" xmlns:lc="http://schemas.openxmlformats.org/drawingml/2006/lockedCanvas" xmlns:dgm14="http://schemas.microsoft.com/office/drawing/2010/diagram" xmlns:a15="http://schemas.microsoft.com/office/drawing/2012/main" xmlns:pic14="http://schemas.microsoft.com/office/drawing/2010/picture" xmlns:c16ac="http://schemas.microsoft.com/office/drawing/2014/chart/ac" xmlns:a16="http://schemas.microsoft.com/office/drawing/2014/main" xmlns:a1611="http://schemas.microsoft.com/office/drawing/2016/11/main" xmlns:dgm1612="http://schemas.microsoft.com/office/drawing/2016/12/diagram" xmlns:a16svg="http://schemas.microsoft.com/office/drawing/2016/SVG/main" xmlns:adec="http://schemas.microsoft.com/office/drawing/2017/decorative" xmlns:a18hc="http://schemas.microsoft.com/office/drawing/2018/hyperlinkcolor" xmlns:wp15="http://schemas.microsoft.com/office/word/2012/wordprocessingDrawing" mc:Ignorable="w14 w15 w16se w16cid w16 w16cex w16sdtdh w16sdtfl w16du wp14">
   <w:endnote w:type="separator" w:id="-1">
     <w:p>
       <w:pPr>
@@ -45025,7 +45435,7 @@
 </file>
 
 <file path=word/footer1.xml><?xml version="1.0" encoding="utf-8"?>
-<w:ftr xmlns:w="http://schemas.openxmlformats.org/wordprocessingml/2006/main" xmlns:w14="http://schemas.microsoft.com/office/word/2010/wordml" xmlns:w16du="http://schemas.microsoft.com/office/word/2023/wordml/word16du" xmlns:w16sdtdh="http://schemas.microsoft.com/office/word/2020/wordml/sdtdatahash" xmlns:w15="http://schemas.microsoft.com/office/word/2012/wordml" xmlns:w16sdtfl="http://schemas.microsoft.com/office/word/2024/wordml/sdtformatlock" xmlns:r="http://schemas.openxmlformats.org/officeDocument/2006/relationships" xmlns:w16se="http://schemas.microsoft.com/office/word/2015/wordml/symex" xmlns:m="http://schemas.openxmlformats.org/officeDocument/2006/math" xmlns:a="http://schemas.openxmlformats.org/drawingml/2006/main" xmlns:wp="http://schemas.openxmlformats.org/drawingml/2006/wordprocessingDrawing" xmlns:wp14="http://schemas.microsoft.com/office/word/2010/wordprocessingDrawing" xmlns:mc="http://schemas.openxmlformats.org/markup-compatibility/2006" xmlns:a14="http://schemas.microsoft.com/office/drawing/2010/main" xmlns:w16cid="http://schemas.microsoft.com/office/word/2016/wordml/cid" xmlns:sl="http://schemas.openxmlformats.org/schemaLibrary/2006/main" xmlns:wne="http://schemas.microsoft.com/office/word/2006/wordml" xmlns:c="http://schemas.openxmlformats.org/drawingml/2006/chart" xmlns:cdr="http://schemas.openxmlformats.org/drawingml/2006/chartDrawing" xmlns:c14="http://schemas.microsoft.com/office/drawing/2007/8/2/chart" xmlns:dgm="http://schemas.openxmlformats.org/drawingml/2006/diagram" xmlns:pic="http://schemas.openxmlformats.org/drawingml/2006/picture" xmlns:xdr="http://schemas.openxmlformats.org/drawingml/2006/spreadsheetDrawing" xmlns:dsp="http://schemas.microsoft.com/office/drawing/2008/diagram" xmlns:o="urn:schemas-microsoft-com:office:office" xmlns:v="urn:schemas-microsoft-com:vml" xmlns:w10="urn:schemas-microsoft-com:office:word" xmlns:xvml="urn:schemas-microsoft-com:office:excel" xmlns:pvml="urn:schemas-microsoft-com:office:powerpoint" xmlns:cppr="http://schemas.microsoft.com/office/2006/coverPageProps" xmlns:odx="http://opendope.org/xpaths" xmlns:odc="http://opendope.org/conditions" xmlns:odq="http://opendope.org/questions" xmlns:oda="http://opendope.org/answers" xmlns:odi="http://opendope.org/components" xmlns:odgm="http://opendope.org/SmartArt/DataHierarchy" xmlns:b="http://schemas.openxmlformats.org/officeDocument/2006/bibliography" xmlns:msink="http://schemas.microsoft.com/ink/2010/main" xmlns:cdr14="http://schemas.microsoft.com/office/drawing/2010/chartDrawing" xmlns:c15="http://schemas.microsoft.com/office/drawing/2012/chart" xmlns:cs="http://schemas.microsoft.com/office/drawing/2012/chartStyle" xmlns:ns43="http://www.w3.org/1998/Math/MathML" xmlns:ns44="http://www.w3.org/2003/InkML" xmlns:a13cmd="http://schemas.microsoft.com/office/drawing/2013/main/command" xmlns:cx="http://schemas.microsoft.com/office/drawing/2014/chartex" xmlns:c16="http://schemas.microsoft.com/office/drawing/2014/chart" xmlns:dgm1611="http://schemas.microsoft.com/office/drawing/2016/11/diagram" xmlns:c16r3="http://schemas.microsoft.com/office/drawing/2017/03/chart" xmlns:am3d="http://schemas.microsoft.com/office/drawing/2017/model3d" xmlns:an18="http://schemas.microsoft.com/office/drawing/2018/animation" xmlns:anam3d="http://schemas.microsoft.com/office/drawing/2018/animation/model3d" xmlns:iact="http://schemas.microsoft.com/office/powerpoint/2014/inkAction" xmlns:thm15="http://schemas.microsoft.com/office/thememl/2012/main" xmlns:wps="http://schemas.microsoft.com/office/word/2010/wordprocessingShape" xmlns:wpc="http://schemas.microsoft.com/office/word/2010/wordprocessingCanvas" xmlns:wpg="http://schemas.microsoft.com/office/word/2010/wordprocessingGroup" xmlns:w16="http://schemas.microsoft.com/office/word/2018/wordml" xmlns:w16cex="http://schemas.microsoft.com/office/word/2018/wordml/cex" xmlns:cei="http://schemas.microsoft.com/office/word/2026/wordml/cei" xmlns:wetp="http://schemas.microsoft.com/office/webextensions/taskpanes/2010/11" xmlns:we="http://schemas.microsoft.com/office/webextensions/webextension/2010/11" xmlns:comp="http://schemas.openxmlformats.org/drawingml/2006/compatibility" xmlns:lc="http://schemas.openxmlformats.org/drawingml/2006/lockedCanvas" xmlns:dgm14="http://schemas.microsoft.com/office/drawing/2010/diagram" xmlns:a15="http://schemas.microsoft.com/office/drawing/2012/main" xmlns:pic14="http://schemas.microsoft.com/office/drawing/2010/picture" xmlns:c16ac="http://schemas.microsoft.com/office/drawing/2014/chart/ac" xmlns:a16="http://schemas.microsoft.com/office/drawing/2014/main" xmlns:a1611="http://schemas.microsoft.com/office/drawing/2016/11/main" xmlns:dgm1612="http://schemas.microsoft.com/office/drawing/2016/12/diagram" xmlns:a16svg="http://schemas.microsoft.com/office/drawing/2016/SVG/main" xmlns:adec="http://schemas.microsoft.com/office/drawing/2017/decorative" xmlns:a18hc="http://schemas.microsoft.com/office/drawing/2018/hyperlinkcolor" xmlns:wp15="http://schemas.microsoft.com/office/word/2012/wordprocessingDrawing" mc:Ignorable="w14 w15 w16se w16cid w16 w16cex w16sdtdh w16sdtfl w16du wp14">
+<w:ftr xmlns:w="http://schemas.openxmlformats.org/wordprocessingml/2006/main" xmlns:w14="http://schemas.microsoft.com/office/word/2010/wordml" xmlns:w16du="http://schemas.microsoft.com/office/word/2023/wordml/word16du" xmlns:w16se="http://schemas.microsoft.com/office/word/2015/wordml/symex" xmlns:r="http://schemas.openxmlformats.org/officeDocument/2006/relationships" xmlns:w16sdtdh="http://schemas.microsoft.com/office/word/2020/wordml/sdtdatahash" xmlns:w15="http://schemas.microsoft.com/office/word/2012/wordml" xmlns:w16sdtfl="http://schemas.microsoft.com/office/word/2024/wordml/sdtformatlock" xmlns:m="http://schemas.openxmlformats.org/officeDocument/2006/math" xmlns:a="http://schemas.openxmlformats.org/drawingml/2006/main" xmlns:wp="http://schemas.openxmlformats.org/drawingml/2006/wordprocessingDrawing" xmlns:wp14="http://schemas.microsoft.com/office/word/2010/wordprocessingDrawing" xmlns:mc="http://schemas.openxmlformats.org/markup-compatibility/2006" xmlns:a14="http://schemas.microsoft.com/office/drawing/2010/main" xmlns:w16cid="http://schemas.microsoft.com/office/word/2016/wordml/cid" xmlns:sl="http://schemas.openxmlformats.org/schemaLibrary/2006/main" xmlns:wne="http://schemas.microsoft.com/office/word/2006/wordml" xmlns:c="http://schemas.openxmlformats.org/drawingml/2006/chart" xmlns:cdr="http://schemas.openxmlformats.org/drawingml/2006/chartDrawing" xmlns:c14="http://schemas.microsoft.com/office/drawing/2007/8/2/chart" xmlns:dgm="http://schemas.openxmlformats.org/drawingml/2006/diagram" xmlns:pic="http://schemas.openxmlformats.org/drawingml/2006/picture" xmlns:xdr="http://schemas.openxmlformats.org/drawingml/2006/spreadsheetDrawing" xmlns:dsp="http://schemas.microsoft.com/office/drawing/2008/diagram" xmlns:o="urn:schemas-microsoft-com:office:office" xmlns:v="urn:schemas-microsoft-com:vml" xmlns:w10="urn:schemas-microsoft-com:office:word" xmlns:xvml="urn:schemas-microsoft-com:office:excel" xmlns:pvml="urn:schemas-microsoft-com:office:powerpoint" xmlns:cppr="http://schemas.microsoft.com/office/2006/coverPageProps" xmlns:odx="http://opendope.org/xpaths" xmlns:odc="http://opendope.org/conditions" xmlns:odq="http://opendope.org/questions" xmlns:oda="http://opendope.org/answers" xmlns:odi="http://opendope.org/components" xmlns:odgm="http://opendope.org/SmartArt/DataHierarchy" xmlns:b="http://schemas.openxmlformats.org/officeDocument/2006/bibliography" xmlns:msink="http://schemas.microsoft.com/ink/2010/main" xmlns:cdr14="http://schemas.microsoft.com/office/drawing/2010/chartDrawing" xmlns:c15="http://schemas.microsoft.com/office/drawing/2012/chart" xmlns:cs="http://schemas.microsoft.com/office/drawing/2012/chartStyle" xmlns:ns43="http://www.w3.org/1998/Math/MathML" xmlns:ns44="http://www.w3.org/2003/InkML" xmlns:a13cmd="http://schemas.microsoft.com/office/drawing/2013/main/command" xmlns:cx="http://schemas.microsoft.com/office/drawing/2014/chartex" xmlns:c16="http://schemas.microsoft.com/office/drawing/2014/chart" xmlns:dgm1611="http://schemas.microsoft.com/office/drawing/2016/11/diagram" xmlns:c16r3="http://schemas.microsoft.com/office/drawing/2017/03/chart" xmlns:am3d="http://schemas.microsoft.com/office/drawing/2017/model3d" xmlns:an18="http://schemas.microsoft.com/office/drawing/2018/animation" xmlns:anam3d="http://schemas.microsoft.com/office/drawing/2018/animation/model3d" xmlns:iact="http://schemas.microsoft.com/office/powerpoint/2014/inkAction" xmlns:thm15="http://schemas.microsoft.com/office/thememl/2012/main" xmlns:wps="http://schemas.microsoft.com/office/word/2010/wordprocessingShape" xmlns:wpc="http://schemas.microsoft.com/office/word/2010/wordprocessingCanvas" xmlns:wpg="http://schemas.microsoft.com/office/word/2010/wordprocessingGroup" xmlns:w16="http://schemas.microsoft.com/office/word/2018/wordml" xmlns:w16cex="http://schemas.microsoft.com/office/word/2018/wordml/cex" xmlns:cei="http://schemas.microsoft.com/office/word/2026/wordml/cei" xmlns:wetp="http://schemas.microsoft.com/office/webextensions/taskpanes/2010/11" xmlns:we="http://schemas.microsoft.com/office/webextensions/webextension/2010/11" xmlns:comp="http://schemas.openxmlformats.org/drawingml/2006/compatibility" xmlns:lc="http://schemas.openxmlformats.org/drawingml/2006/lockedCanvas" xmlns:dgm14="http://schemas.microsoft.com/office/drawing/2010/diagram" xmlns:a15="http://schemas.microsoft.com/office/drawing/2012/main" xmlns:pic14="http://schemas.microsoft.com/office/drawing/2010/picture" xmlns:c16ac="http://schemas.microsoft.com/office/drawing/2014/chart/ac" xmlns:a16="http://schemas.microsoft.com/office/drawing/2014/main" xmlns:a1611="http://schemas.microsoft.com/office/drawing/2016/11/main" xmlns:dgm1612="http://schemas.microsoft.com/office/drawing/2016/12/diagram" xmlns:a16svg="http://schemas.microsoft.com/office/drawing/2016/SVG/main" xmlns:adec="http://schemas.microsoft.com/office/drawing/2017/decorative" xmlns:a18hc="http://schemas.microsoft.com/office/drawing/2018/hyperlinkcolor" xmlns:wp15="http://schemas.microsoft.com/office/word/2012/wordprocessingDrawing" mc:Ignorable="w14 w15 w16se w16cid w16 w16cex w16sdtdh w16sdtfl w16du wp14">
   <w:sdt>
     <w:sdtPr>
       <w:id w:val="349237360"/>
@@ -45074,7 +45484,7 @@
 </file>
 
 <file path=word/footnotes.xml><?xml version="1.0" encoding="utf-8"?>
-<w:footnotes xmlns:w="http://schemas.openxmlformats.org/wordprocessingml/2006/main" xmlns:w14="http://schemas.microsoft.com/office/word/2010/wordml" xmlns:w16du="http://schemas.microsoft.com/office/word/2023/wordml/word16du" xmlns:w16sdtdh="http://schemas.microsoft.com/office/word/2020/wordml/sdtdatahash" xmlns:w15="http://schemas.microsoft.com/office/word/2012/wordml" xmlns:w16sdtfl="http://schemas.microsoft.com/office/word/2024/wordml/sdtformatlock" xmlns:r="http://schemas.openxmlformats.org/officeDocument/2006/relationships" xmlns:w16se="http://schemas.microsoft.com/office/word/2015/wordml/symex" xmlns:m="http://schemas.openxmlformats.org/officeDocument/2006/math" xmlns:a="http://schemas.openxmlformats.org/drawingml/2006/main" xmlns:wp="http://schemas.openxmlformats.org/drawingml/2006/wordprocessingDrawing" xmlns:wp14="http://schemas.microsoft.com/office/word/2010/wordprocessingDrawing" xmlns:mc="http://schemas.openxmlformats.org/markup-compatibility/2006" xmlns:a14="http://schemas.microsoft.com/office/drawing/2010/main" xmlns:w16cid="http://schemas.microsoft.com/office/word/2016/wordml/cid" xmlns:sl="http://schemas.openxmlformats.org/schemaLibrary/2006/main" xmlns:wne="http://schemas.microsoft.com/office/word/2006/wordml" xmlns:c="http://schemas.openxmlformats.org/drawingml/2006/chart" xmlns:cdr="http://schemas.openxmlformats.org/drawingml/2006/chartDrawing" xmlns:c14="http://schemas.microsoft.com/office/drawing/2007/8/2/chart" xmlns:dgm="http://schemas.openxmlformats.org/drawingml/2006/diagram" xmlns:pic="http://schemas.openxmlformats.org/drawingml/2006/picture" xmlns:xdr="http://schemas.openxmlformats.org/drawingml/2006/spreadsheetDrawing" xmlns:dsp="http://schemas.microsoft.com/office/drawing/2008/diagram" xmlns:o="urn:schemas-microsoft-com:office:office" xmlns:v="urn:schemas-microsoft-com:vml" xmlns:w10="urn:schemas-microsoft-com:office:word" xmlns:xvml="urn:schemas-microsoft-com:office:excel" xmlns:pvml="urn:schemas-microsoft-com:office:powerpoint" xmlns:cppr="http://schemas.microsoft.com/office/2006/coverPageProps" xmlns:odx="http://opendope.org/xpaths" xmlns:odc="http://opendope.org/conditions" xmlns:odq="http://opendope.org/questions" xmlns:oda="http://opendope.org/answers" xmlns:odi="http://opendope.org/components" xmlns:odgm="http://opendope.org/SmartArt/DataHierarchy" xmlns:b="http://schemas.openxmlformats.org/officeDocument/2006/bibliography" xmlns:msink="http://schemas.microsoft.com/ink/2010/main" xmlns:cdr14="http://schemas.microsoft.com/office/drawing/2010/chartDrawing" xmlns:c15="http://schemas.microsoft.com/office/drawing/2012/chart" xmlns:cs="http://schemas.microsoft.com/office/drawing/2012/chartStyle" xmlns:ns43="http://www.w3.org/1998/Math/MathML" xmlns:ns44="http://www.w3.org/2003/InkML" xmlns:a13cmd="http://schemas.microsoft.com/office/drawing/2013/main/command" xmlns:cx="http://schemas.microsoft.com/office/drawing/2014/chartex" xmlns:c16="http://schemas.microsoft.com/office/drawing/2014/chart" xmlns:dgm1611="http://schemas.microsoft.com/office/drawing/2016/11/diagram" xmlns:c16r3="http://schemas.microsoft.com/office/drawing/2017/03/chart" xmlns:am3d="http://schemas.microsoft.com/office/drawing/2017/model3d" xmlns:an18="http://schemas.microsoft.com/office/drawing/2018/animation" xmlns:anam3d="http://schemas.microsoft.com/office/drawing/2018/animation/model3d" xmlns:iact="http://schemas.microsoft.com/office/powerpoint/2014/inkAction" xmlns:thm15="http://schemas.microsoft.com/office/thememl/2012/main" xmlns:wps="http://schemas.microsoft.com/office/word/2010/wordprocessingShape" xmlns:wpc="http://schemas.microsoft.com/office/word/2010/wordprocessingCanvas" xmlns:wpg="http://schemas.microsoft.com/office/word/2010/wordprocessingGroup" xmlns:w16="http://schemas.microsoft.com/office/word/2018/wordml" xmlns:w16cex="http://schemas.microsoft.com/office/word/2018/wordml/cex" xmlns:cei="http://schemas.microsoft.com/office/word/2026/wordml/cei" xmlns:wetp="http://schemas.microsoft.com/office/webextensions/taskpanes/2010/11" xmlns:we="http://schemas.microsoft.com/office/webextensions/webextension/2010/11" xmlns:comp="http://schemas.openxmlformats.org/drawingml/2006/compatibility" xmlns:lc="http://schemas.openxmlformats.org/drawingml/2006/lockedCanvas" xmlns:dgm14="http://schemas.microsoft.com/office/drawing/2010/diagram" xmlns:a15="http://schemas.microsoft.com/office/drawing/2012/main" xmlns:pic14="http://schemas.microsoft.com/office/drawing/2010/picture" xmlns:c16ac="http://schemas.microsoft.com/office/drawing/2014/chart/ac" xmlns:a16="http://schemas.microsoft.com/office/drawing/2014/main" xmlns:a1611="http://schemas.microsoft.com/office/drawing/2016/11/main" xmlns:dgm1612="http://schemas.microsoft.com/office/drawing/2016/12/diagram" xmlns:a16svg="http://schemas.microsoft.com/office/drawing/2016/SVG/main" xmlns:adec="http://schemas.microsoft.com/office/drawing/2017/decorative" xmlns:a18hc="http://schemas.microsoft.com/office/drawing/2018/hyperlinkcolor" xmlns:wp15="http://schemas.microsoft.com/office/word/2012/wordprocessingDrawing" mc:Ignorable="w14 w15 w16se w16cid w16 w16cex w16sdtdh w16sdtfl w16du wp14">
+<w:footnotes xmlns:w="http://schemas.openxmlformats.org/wordprocessingml/2006/main" xmlns:w14="http://schemas.microsoft.com/office/word/2010/wordml" xmlns:w16du="http://schemas.microsoft.com/office/word/2023/wordml/word16du" xmlns:w16se="http://schemas.microsoft.com/office/word/2015/wordml/symex" xmlns:r="http://schemas.openxmlformats.org/officeDocument/2006/relationships" xmlns:w16sdtdh="http://schemas.microsoft.com/office/word/2020/wordml/sdtdatahash" xmlns:w15="http://schemas.microsoft.com/office/word/2012/wordml" xmlns:w16sdtfl="http://schemas.microsoft.com/office/word/2024/wordml/sdtformatlock" xmlns:m="http://schemas.openxmlformats.org/officeDocument/2006/math" xmlns:a="http://schemas.openxmlformats.org/drawingml/2006/main" xmlns:wp="http://schemas.openxmlformats.org/drawingml/2006/wordprocessingDrawing" xmlns:wp14="http://schemas.microsoft.com/office/word/2010/wordprocessingDrawing" xmlns:mc="http://schemas.openxmlformats.org/markup-compatibility/2006" xmlns:a14="http://schemas.microsoft.com/office/drawing/2010/main" xmlns:w16cid="http://schemas.microsoft.com/office/word/2016/wordml/cid" xmlns:sl="http://schemas.openxmlformats.org/schemaLibrary/2006/main" xmlns:wne="http://schemas.microsoft.com/office/word/2006/wordml" xmlns:c="http://schemas.openxmlformats.org/drawingml/2006/chart" xmlns:cdr="http://schemas.openxmlformats.org/drawingml/2006/chartDrawing" xmlns:c14="http://schemas.microsoft.com/office/drawing/2007/8/2/chart" xmlns:dgm="http://schemas.openxmlformats.org/drawingml/2006/diagram" xmlns:pic="http://schemas.openxmlformats.org/drawingml/2006/picture" xmlns:xdr="http://schemas.openxmlformats.org/drawingml/2006/spreadsheetDrawing" xmlns:dsp="http://schemas.microsoft.com/office/drawing/2008/diagram" xmlns:o="urn:schemas-microsoft-com:office:office" xmlns:v="urn:schemas-microsoft-com:vml" xmlns:w10="urn:schemas-microsoft-com:office:word" xmlns:xvml="urn:schemas-microsoft-com:office:excel" xmlns:pvml="urn:schemas-microsoft-com:office:powerpoint" xmlns:cppr="http://schemas.microsoft.com/office/2006/coverPageProps" xmlns:odx="http://opendope.org/xpaths" xmlns:odc="http://opendope.org/conditions" xmlns:odq="http://opendope.org/questions" xmlns:oda="http://opendope.org/answers" xmlns:odi="http://opendope.org/components" xmlns:odgm="http://opendope.org/SmartArt/DataHierarchy" xmlns:b="http://schemas.openxmlformats.org/officeDocument/2006/bibliography" xmlns:msink="http://schemas.microsoft.com/ink/2010/main" xmlns:cdr14="http://schemas.microsoft.com/office/drawing/2010/chartDrawing" xmlns:c15="http://schemas.microsoft.com/office/drawing/2012/chart" xmlns:cs="http://schemas.microsoft.com/office/drawing/2012/chartStyle" xmlns:ns43="http://www.w3.org/1998/Math/MathML" xmlns:ns44="http://www.w3.org/2003/InkML" xmlns:a13cmd="http://schemas.microsoft.com/office/drawing/2013/main/command" xmlns:cx="http://schemas.microsoft.com/office/drawing/2014/chartex" xmlns:c16="http://schemas.microsoft.com/office/drawing/2014/chart" xmlns:dgm1611="http://schemas.microsoft.com/office/drawing/2016/11/diagram" xmlns:c16r3="http://schemas.microsoft.com/office/drawing/2017/03/chart" xmlns:am3d="http://schemas.microsoft.com/office/drawing/2017/model3d" xmlns:an18="http://schemas.microsoft.com/office/drawing/2018/animation" xmlns:anam3d="http://schemas.microsoft.com/office/drawing/2018/animation/model3d" xmlns:iact="http://schemas.microsoft.com/office/powerpoint/2014/inkAction" xmlns:thm15="http://schemas.microsoft.com/office/thememl/2012/main" xmlns:wps="http://schemas.microsoft.com/office/word/2010/wordprocessingShape" xmlns:wpc="http://schemas.microsoft.com/office/word/2010/wordprocessingCanvas" xmlns:wpg="http://schemas.microsoft.com/office/word/2010/wordprocessingGroup" xmlns:w16="http://schemas.microsoft.com/office/word/2018/wordml" xmlns:w16cex="http://schemas.microsoft.com/office/word/2018/wordml/cex" xmlns:cei="http://schemas.microsoft.com/office/word/2026/wordml/cei" xmlns:wetp="http://schemas.microsoft.com/office/webextensions/taskpanes/2010/11" xmlns:we="http://schemas.microsoft.com/office/webextensions/webextension/2010/11" xmlns:comp="http://schemas.openxmlformats.org/drawingml/2006/compatibility" xmlns:lc="http://schemas.openxmlformats.org/drawingml/2006/lockedCanvas" xmlns:dgm14="http://schemas.microsoft.com/office/drawing/2010/diagram" xmlns:a15="http://schemas.microsoft.com/office/drawing/2012/main" xmlns:pic14="http://schemas.microsoft.com/office/drawing/2010/picture" xmlns:c16ac="http://schemas.microsoft.com/office/drawing/2014/chart/ac" xmlns:a16="http://schemas.microsoft.com/office/drawing/2014/main" xmlns:a1611="http://schemas.microsoft.com/office/drawing/2016/11/main" xmlns:dgm1612="http://schemas.microsoft.com/office/drawing/2016/12/diagram" xmlns:a16svg="http://schemas.microsoft.com/office/drawing/2016/SVG/main" xmlns:adec="http://schemas.microsoft.com/office/drawing/2017/decorative" xmlns:a18hc="http://schemas.microsoft.com/office/drawing/2018/hyperlinkcolor" xmlns:wp15="http://schemas.microsoft.com/office/word/2012/wordprocessingDrawing" mc:Ignorable="w14 w15 w16se w16cid w16 w16cex w16sdtdh w16sdtfl w16du wp14">
   <w:footnote w:type="separator" w:id="-1">
     <w:p>
       <w:pPr>
@@ -45196,7 +45606,7 @@
 </file>
 
 <file path=word/numbering.xml><?xml version="1.0" encoding="utf-8"?>
-<w:numbering xmlns:w="http://schemas.openxmlformats.org/wordprocessingml/2006/main" xmlns:w14="http://schemas.microsoft.com/office/word/2010/wordml" xmlns:w16du="http://schemas.microsoft.com/office/word/2023/wordml/word16du" xmlns:w16sdtdh="http://schemas.microsoft.com/office/word/2020/wordml/sdtdatahash" xmlns:w15="http://schemas.microsoft.com/office/word/2012/wordml" xmlns:w16sdtfl="http://schemas.microsoft.com/office/word/2024/wordml/sdtformatlock" xmlns:r="http://schemas.openxmlformats.org/officeDocument/2006/relationships" xmlns:w16se="http://schemas.microsoft.com/office/word/2015/wordml/symex" xmlns:m="http://schemas.openxmlformats.org/officeDocument/2006/math" xmlns:a="http://schemas.openxmlformats.org/drawingml/2006/main" xmlns:wp="http://schemas.openxmlformats.org/drawingml/2006/wordprocessingDrawing" xmlns:wp14="http://schemas.microsoft.com/office/word/2010/wordprocessingDrawing" xmlns:mc="http://schemas.openxmlformats.org/markup-compatibility/2006" xmlns:a14="http://schemas.microsoft.com/office/drawing/2010/main" xmlns:w16cid="http://schemas.microsoft.com/office/word/2016/wordml/cid" xmlns:sl="http://schemas.openxmlformats.org/schemaLibrary/2006/main" xmlns:wne="http://schemas.microsoft.com/office/word/2006/wordml" xmlns:c="http://schemas.openxmlformats.org/drawingml/2006/chart" xmlns:cdr="http://schemas.openxmlformats.org/drawingml/2006/chartDrawing" xmlns:c14="http://schemas.microsoft.com/office/drawing/2007/8/2/chart" xmlns:dgm="http://schemas.openxmlformats.org/drawingml/2006/diagram" xmlns:pic="http://schemas.openxmlformats.org/drawingml/2006/picture" xmlns:xdr="http://schemas.openxmlformats.org/drawingml/2006/spreadsheetDrawing" xmlns:dsp="http://schemas.microsoft.com/office/drawing/2008/diagram" xmlns:o="urn:schemas-microsoft-com:office:office" xmlns:v="urn:schemas-microsoft-com:vml" xmlns:w10="urn:schemas-microsoft-com:office:word" xmlns:xvml="urn:schemas-microsoft-com:office:excel" xmlns:pvml="urn:schemas-microsoft-com:office:powerpoint" xmlns:cppr="http://schemas.microsoft.com/office/2006/coverPageProps" xmlns:odx="http://opendope.org/xpaths" xmlns:odc="http://opendope.org/conditions" xmlns:odq="http://opendope.org/questions" xmlns:oda="http://opendope.org/answers" xmlns:odi="http://opendope.org/components" xmlns:odgm="http://opendope.org/SmartArt/DataHierarchy" xmlns:b="http://schemas.openxmlformats.org/officeDocument/2006/bibliography" xmlns:msink="http://schemas.microsoft.com/ink/2010/main" xmlns:cdr14="http://schemas.microsoft.com/office/drawing/2010/chartDrawing" xmlns:c15="http://schemas.microsoft.com/office/drawing/2012/chart" xmlns:cs="http://schemas.microsoft.com/office/drawing/2012/chartStyle" xmlns:ns43="http://www.w3.org/1998/Math/MathML" xmlns:ns44="http://www.w3.org/2003/InkML" xmlns:a13cmd="http://schemas.microsoft.com/office/drawing/2013/main/command" xmlns:cx="http://schemas.microsoft.com/office/drawing/2014/chartex" xmlns:c16="http://schemas.microsoft.com/office/drawing/2014/chart" xmlns:dgm1611="http://schemas.microsoft.com/office/drawing/2016/11/diagram" xmlns:c16r3="http://schemas.microsoft.com/office/drawing/2017/03/chart" xmlns:am3d="http://schemas.microsoft.com/office/drawing/2017/model3d" xmlns:an18="http://schemas.microsoft.com/office/drawing/2018/animation" xmlns:anam3d="http://schemas.microsoft.com/office/drawing/2018/animation/model3d" xmlns:iact="http://schemas.microsoft.com/office/powerpoint/2014/inkAction" xmlns:thm15="http://schemas.microsoft.com/office/thememl/2012/main" xmlns:wps="http://schemas.microsoft.com/office/word/2010/wordprocessingShape" xmlns:wpc="http://schemas.microsoft.com/office/word/2010/wordprocessingCanvas" xmlns:wpg="http://schemas.microsoft.com/office/word/2010/wordprocessingGroup" xmlns:w16="http://schemas.microsoft.com/office/word/2018/wordml" xmlns:w16cex="http://schemas.microsoft.com/office/word/2018/wordml/cex" xmlns:cei="http://schemas.microsoft.com/office/word/2026/wordml/cei" xmlns:wetp="http://schemas.microsoft.com/office/webextensions/taskpanes/2010/11" xmlns:we="http://schemas.microsoft.com/office/webextensions/webextension/2010/11" xmlns:comp="http://schemas.openxmlformats.org/drawingml/2006/compatibility" xmlns:lc="http://schemas.openxmlformats.org/drawingml/2006/lockedCanvas" xmlns:dgm14="http://schemas.microsoft.com/office/drawing/2010/diagram" xmlns:a15="http://schemas.microsoft.com/office/drawing/2012/main" xmlns:pic14="http://schemas.microsoft.com/office/drawing/2010/picture" xmlns:c16ac="http://schemas.microsoft.com/office/drawing/2014/chart/ac" xmlns:a16="http://schemas.microsoft.com/office/drawing/2014/main" xmlns:a1611="http://schemas.microsoft.com/office/drawing/2016/11/main" xmlns:dgm1612="http://schemas.microsoft.com/office/drawing/2016/12/diagram" xmlns:a16svg="http://schemas.microsoft.com/office/drawing/2016/SVG/main" xmlns:adec="http://schemas.microsoft.com/office/drawing/2017/decorative" xmlns:a18hc="http://schemas.microsoft.com/office/drawing/2018/hyperlinkcolor" xmlns:wp15="http://schemas.microsoft.com/office/word/2012/wordprocessingDrawing" mc:Ignorable="w14 w15 w16se w16cid w16 w16cex w16sdtdh w16sdtfl w16du wp14">
+<w:numbering xmlns:w="http://schemas.openxmlformats.org/wordprocessingml/2006/main" xmlns:w14="http://schemas.microsoft.com/office/word/2010/wordml" xmlns:w16du="http://schemas.microsoft.com/office/word/2023/wordml/word16du" xmlns:w16se="http://schemas.microsoft.com/office/word/2015/wordml/symex" xmlns:r="http://schemas.openxmlformats.org/officeDocument/2006/relationships" xmlns:w16sdtdh="http://schemas.microsoft.com/office/word/2020/wordml/sdtdatahash" xmlns:w15="http://schemas.microsoft.com/office/word/2012/wordml" xmlns:w16sdtfl="http://schemas.microsoft.com/office/word/2024/wordml/sdtformatlock" xmlns:m="http://schemas.openxmlformats.org/officeDocument/2006/math" xmlns:a="http://schemas.openxmlformats.org/drawingml/2006/main" xmlns:wp="http://schemas.openxmlformats.org/drawingml/2006/wordprocessingDrawing" xmlns:wp14="http://schemas.microsoft.com/office/word/2010/wordprocessingDrawing" xmlns:mc="http://schemas.openxmlformats.org/markup-compatibility/2006" xmlns:a14="http://schemas.microsoft.com/office/drawing/2010/main" xmlns:w16cid="http://schemas.microsoft.com/office/word/2016/wordml/cid" xmlns:sl="http://schemas.openxmlformats.org/schemaLibrary/2006/main" xmlns:wne="http://schemas.microsoft.com/office/word/2006/wordml" xmlns:c="http://schemas.openxmlformats.org/drawingml/2006/chart" xmlns:cdr="http://schemas.openxmlformats.org/drawingml/2006/chartDrawing" xmlns:c14="http://schemas.microsoft.com/office/drawing/2007/8/2/chart" xmlns:dgm="http://schemas.openxmlformats.org/drawingml/2006/diagram" xmlns:pic="http://schemas.openxmlformats.org/drawingml/2006/picture" xmlns:xdr="http://schemas.openxmlformats.org/drawingml/2006/spreadsheetDrawing" xmlns:dsp="http://schemas.microsoft.com/office/drawing/2008/diagram" xmlns:o="urn:schemas-microsoft-com:office:office" xmlns:v="urn:schemas-microsoft-com:vml" xmlns:w10="urn:schemas-microsoft-com:office:word" xmlns:xvml="urn:schemas-microsoft-com:office:excel" xmlns:pvml="urn:schemas-microsoft-com:office:powerpoint" xmlns:cppr="http://schemas.microsoft.com/office/2006/coverPageProps" xmlns:odx="http://opendope.org/xpaths" xmlns:odc="http://opendope.org/conditions" xmlns:odq="http://opendope.org/questions" xmlns:oda="http://opendope.org/answers" xmlns:odi="http://opendope.org/components" xmlns:odgm="http://opendope.org/SmartArt/DataHierarchy" xmlns:b="http://schemas.openxmlformats.org/officeDocument/2006/bibliography" xmlns:msink="http://schemas.microsoft.com/ink/2010/main" xmlns:cdr14="http://schemas.microsoft.com/office/drawing/2010/chartDrawing" xmlns:c15="http://schemas.microsoft.com/office/drawing/2012/chart" xmlns:cs="http://schemas.microsoft.com/office/drawing/2012/chartStyle" xmlns:ns43="http://www.w3.org/1998/Math/MathML" xmlns:ns44="http://www.w3.org/2003/InkML" xmlns:a13cmd="http://schemas.microsoft.com/office/drawing/2013/main/command" xmlns:cx="http://schemas.microsoft.com/office/drawing/2014/chartex" xmlns:c16="http://schemas.microsoft.com/office/drawing/2014/chart" xmlns:dgm1611="http://schemas.microsoft.com/office/drawing/2016/11/diagram" xmlns:c16r3="http://schemas.microsoft.com/office/drawing/2017/03/chart" xmlns:am3d="http://schemas.microsoft.com/office/drawing/2017/model3d" xmlns:an18="http://schemas.microsoft.com/office/drawing/2018/animation" xmlns:anam3d="http://schemas.microsoft.com/office/drawing/2018/animation/model3d" xmlns:iact="http://schemas.microsoft.com/office/powerpoint/2014/inkAction" xmlns:thm15="http://schemas.microsoft.com/office/thememl/2012/main" xmlns:wps="http://schemas.microsoft.com/office/word/2010/wordprocessingShape" xmlns:wpc="http://schemas.microsoft.com/office/word/2010/wordprocessingCanvas" xmlns:wpg="http://schemas.microsoft.com/office/word/2010/wordprocessingGroup" xmlns:w16="http://schemas.microsoft.com/office/word/2018/wordml" xmlns:w16cex="http://schemas.microsoft.com/office/word/2018/wordml/cex" xmlns:cei="http://schemas.microsoft.com/office/word/2026/wordml/cei" xmlns:wetp="http://schemas.microsoft.com/office/webextensions/taskpanes/2010/11" xmlns:we="http://schemas.microsoft.com/office/webextensions/webextension/2010/11" xmlns:comp="http://schemas.openxmlformats.org/drawingml/2006/compatibility" xmlns:lc="http://schemas.openxmlformats.org/drawingml/2006/lockedCanvas" xmlns:dgm14="http://schemas.microsoft.com/office/drawing/2010/diagram" xmlns:a15="http://schemas.microsoft.com/office/drawing/2012/main" xmlns:pic14="http://schemas.microsoft.com/office/drawing/2010/picture" xmlns:c16ac="http://schemas.microsoft.com/office/drawing/2014/chart/ac" xmlns:a16="http://schemas.microsoft.com/office/drawing/2014/main" xmlns:a1611="http://schemas.microsoft.com/office/drawing/2016/11/main" xmlns:dgm1612="http://schemas.microsoft.com/office/drawing/2016/12/diagram" xmlns:a16svg="http://schemas.microsoft.com/office/drawing/2016/SVG/main" xmlns:adec="http://schemas.microsoft.com/office/drawing/2017/decorative" xmlns:a18hc="http://schemas.microsoft.com/office/drawing/2018/hyperlinkcolor" xmlns:wp15="http://schemas.microsoft.com/office/word/2012/wordprocessingDrawing" mc:Ignorable="w14 w15 w16se w16cid w16 w16cex w16sdtdh w16sdtfl w16du wp14">
   <w:abstractNum w:abstractNumId="0" w15:restartNumberingAfterBreak="0">
     <w:nsid w:val="00AC75D1"/>
     <w:multiLevelType w:val="hybridMultilevel"/>
@@ -50355,7 +50765,7 @@
 </file>
 
 <file path=word/styles.xml><?xml version="1.0" encoding="utf-8"?>
-<w:styles xmlns:w="http://schemas.openxmlformats.org/wordprocessingml/2006/main" xmlns:w14="http://schemas.microsoft.com/office/word/2010/wordml" xmlns:w16du="http://schemas.microsoft.com/office/word/2023/wordml/word16du" xmlns:w16sdtdh="http://schemas.microsoft.com/office/word/2020/wordml/sdtdatahash" xmlns:w15="http://schemas.microsoft.com/office/word/2012/wordml" xmlns:w16sdtfl="http://schemas.microsoft.com/office/word/2024/wordml/sdtformatlock" xmlns:r="http://schemas.openxmlformats.org/officeDocument/2006/relationships" xmlns:w16se="http://schemas.microsoft.com/office/word/2015/wordml/symex" xmlns:m="http://schemas.openxmlformats.org/officeDocument/2006/math" xmlns:a="http://schemas.openxmlformats.org/drawingml/2006/main" xmlns:wp="http://schemas.openxmlformats.org/drawingml/2006/wordprocessingDrawing" xmlns:wp14="http://schemas.microsoft.com/office/word/2010/wordprocessingDrawing" xmlns:mc="http://schemas.openxmlformats.org/markup-compatibility/2006" xmlns:a14="http://schemas.microsoft.com/office/drawing/2010/main" xmlns:w16cid="http://schemas.microsoft.com/office/word/2016/wordml/cid" xmlns:sl="http://schemas.openxmlformats.org/schemaLibrary/2006/main" xmlns:wne="http://schemas.microsoft.com/office/word/2006/wordml" xmlns:c="http://schemas.openxmlformats.org/drawingml/2006/chart" xmlns:cdr="http://schemas.openxmlformats.org/drawingml/2006/chartDrawing" xmlns:c14="http://schemas.microsoft.com/office/drawing/2007/8/2/chart" xmlns:dgm="http://schemas.openxmlformats.org/drawingml/2006/diagram" xmlns:pic="http://schemas.openxmlformats.org/drawingml/2006/picture" xmlns:xdr="http://schemas.openxmlformats.org/drawingml/2006/spreadsheetDrawing" xmlns:dsp="http://schemas.microsoft.com/office/drawing/2008/diagram" xmlns:o="urn:schemas-microsoft-com:office:office" xmlns:v="urn:schemas-microsoft-com:vml" xmlns:w10="urn:schemas-microsoft-com:office:word" xmlns:xvml="urn:schemas-microsoft-com:office:excel" xmlns:pvml="urn:schemas-microsoft-com:office:powerpoint" xmlns:cppr="http://schemas.microsoft.com/office/2006/coverPageProps" xmlns:odx="http://opendope.org/xpaths" xmlns:odc="http://opendope.org/conditions" xmlns:odq="http://opendope.org/questions" xmlns:oda="http://opendope.org/answers" xmlns:odi="http://opendope.org/components" xmlns:odgm="http://opendope.org/SmartArt/DataHierarchy" xmlns:b="http://schemas.openxmlformats.org/officeDocument/2006/bibliography" xmlns:msink="http://schemas.microsoft.com/ink/2010/main" xmlns:cdr14="http://schemas.microsoft.com/office/drawing/2010/chartDrawing" xmlns:c15="http://schemas.microsoft.com/office/drawing/2012/chart" xmlns:cs="http://schemas.microsoft.com/office/drawing/2012/chartStyle" xmlns:ns43="http://www.w3.org/1998/Math/MathML" xmlns:ns44="http://www.w3.org/2003/InkML" xmlns:a13cmd="http://schemas.microsoft.com/office/drawing/2013/main/command" xmlns:cx="http://schemas.microsoft.com/office/drawing/2014/chartex" xmlns:c16="http://schemas.microsoft.com/office/drawing/2014/chart" xmlns:dgm1611="http://schemas.microsoft.com/office/drawing/2016/11/diagram" xmlns:c16r3="http://schemas.microsoft.com/office/drawing/2017/03/chart" xmlns:am3d="http://schemas.microsoft.com/office/drawing/2017/model3d" xmlns:an18="http://schemas.microsoft.com/office/drawing/2018/animation" xmlns:anam3d="http://schemas.microsoft.com/office/drawing/2018/animation/model3d" xmlns:iact="http://schemas.microsoft.com/office/powerpoint/2014/inkAction" xmlns:thm15="http://schemas.microsoft.com/office/thememl/2012/main" xmlns:wps="http://schemas.microsoft.com/office/word/2010/wordprocessingShape" xmlns:wpc="http://schemas.microsoft.com/office/word/2010/wordprocessingCanvas" xmlns:wpg="http://schemas.microsoft.com/office/word/2010/wordprocessingGroup" xmlns:w16="http://schemas.microsoft.com/office/word/2018/wordml" xmlns:w16cex="http://schemas.microsoft.com/office/word/2018/wordml/cex" xmlns:cei="http://schemas.microsoft.com/office/word/2026/wordml/cei" xmlns:wetp="http://schemas.microsoft.com/office/webextensions/taskpanes/2010/11" xmlns:we="http://schemas.microsoft.com/office/webextensions/webextension/2010/11" xmlns:comp="http://schemas.openxmlformats.org/drawingml/2006/compatibility" xmlns:lc="http://schemas.openxmlformats.org/drawingml/2006/lockedCanvas" xmlns:dgm14="http://schemas.microsoft.com/office/drawing/2010/diagram" xmlns:a15="http://schemas.microsoft.com/office/drawing/2012/main" xmlns:pic14="http://schemas.microsoft.com/office/drawing/2010/picture" xmlns:c16ac="http://schemas.microsoft.com/office/drawing/2014/chart/ac" xmlns:a16="http://schemas.microsoft.com/office/drawing/2014/main" xmlns:a1611="http://schemas.microsoft.com/office/drawing/2016/11/main" xmlns:dgm1612="http://schemas.microsoft.com/office/drawing/2016/12/diagram" xmlns:a16svg="http://schemas.microsoft.com/office/drawing/2016/SVG/main" xmlns:adec="http://schemas.microsoft.com/office/drawing/2017/decorative" xmlns:a18hc="http://schemas.microsoft.com/office/drawing/2018/hyperlinkcolor" xmlns:wp15="http://schemas.microsoft.com/office/word/2012/wordprocessingDrawing" mc:Ignorable="w14 w15 w16se w16cid w16 w16cex w16sdtdh w16sdtfl w16du">
+<w:styles xmlns:w="http://schemas.openxmlformats.org/wordprocessingml/2006/main" xmlns:w14="http://schemas.microsoft.com/office/word/2010/wordml" xmlns:w16du="http://schemas.microsoft.com/office/word/2023/wordml/word16du" xmlns:w16se="http://schemas.microsoft.com/office/word/2015/wordml/symex" xmlns:r="http://schemas.openxmlformats.org/officeDocument/2006/relationships" xmlns:w16sdtdh="http://schemas.microsoft.com/office/word/2020/wordml/sdtdatahash" xmlns:w15="http://schemas.microsoft.com/office/word/2012/wordml" xmlns:w16sdtfl="http://schemas.microsoft.com/office/word/2024/wordml/sdtformatlock" xmlns:m="http://schemas.openxmlformats.org/officeDocument/2006/math" xmlns:a="http://schemas.openxmlformats.org/drawingml/2006/main" xmlns:wp="http://schemas.openxmlformats.org/drawingml/2006/wordprocessingDrawing" xmlns:wp14="http://schemas.microsoft.com/office/word/2010/wordprocessingDrawing" xmlns:mc="http://schemas.openxmlformats.org/markup-compatibility/2006" xmlns:a14="http://schemas.microsoft.com/office/drawing/2010/main" xmlns:w16cid="http://schemas.microsoft.com/office/word/2016/wordml/cid" xmlns:sl="http://schemas.openxmlformats.org/schemaLibrary/2006/main" xmlns:wne="http://schemas.microsoft.com/office/word/2006/wordml" xmlns:c="http://schemas.openxmlformats.org/drawingml/2006/chart" xmlns:cdr="http://schemas.openxmlformats.org/drawingml/2006/chartDrawing" xmlns:c14="http://schemas.microsoft.com/office/drawing/2007/8/2/chart" xmlns:dgm="http://schemas.openxmlformats.org/drawingml/2006/diagram" xmlns:pic="http://schemas.openxmlformats.org/drawingml/2006/picture" xmlns:xdr="http://schemas.openxmlformats.org/drawingml/2006/spreadsheetDrawing" xmlns:dsp="http://schemas.microsoft.com/office/drawing/2008/diagram" xmlns:o="urn:schemas-microsoft-com:office:office" xmlns:v="urn:schemas-microsoft-com:vml" xmlns:w10="urn:schemas-microsoft-com:office:word" xmlns:xvml="urn:schemas-microsoft-com:office:excel" xmlns:pvml="urn:schemas-microsoft-com:office:powerpoint" xmlns:cppr="http://schemas.microsoft.com/office/2006/coverPageProps" xmlns:odx="http://opendope.org/xpaths" xmlns:odc="http://opendope.org/conditions" xmlns:odq="http://opendope.org/questions" xmlns:oda="http://opendope.org/answers" xmlns:odi="http://opendope.org/components" xmlns:odgm="http://opendope.org/SmartArt/DataHierarchy" xmlns:b="http://schemas.openxmlformats.org/officeDocument/2006/bibliography" xmlns:msink="http://schemas.microsoft.com/ink/2010/main" xmlns:cdr14="http://schemas.microsoft.com/office/drawing/2010/chartDrawing" xmlns:c15="http://schemas.microsoft.com/office/drawing/2012/chart" xmlns:cs="http://schemas.microsoft.com/office/drawing/2012/chartStyle" xmlns:ns43="http://www.w3.org/1998/Math/MathML" xmlns:ns44="http://www.w3.org/2003/InkML" xmlns:a13cmd="http://schemas.microsoft.com/office/drawing/2013/main/command" xmlns:cx="http://schemas.microsoft.com/office/drawing/2014/chartex" xmlns:c16="http://schemas.microsoft.com/office/drawing/2014/chart" xmlns:dgm1611="http://schemas.microsoft.com/office/drawing/2016/11/diagram" xmlns:c16r3="http://schemas.microsoft.com/office/drawing/2017/03/chart" xmlns:am3d="http://schemas.microsoft.com/office/drawing/2017/model3d" xmlns:an18="http://schemas.microsoft.com/office/drawing/2018/animation" xmlns:anam3d="http://schemas.microsoft.com/office/drawing/2018/animation/model3d" xmlns:iact="http://schemas.microsoft.com/office/powerpoint/2014/inkAction" xmlns:thm15="http://schemas.microsoft.com/office/thememl/2012/main" xmlns:wps="http://schemas.microsoft.com/office/word/2010/wordprocessingShape" xmlns:wpc="http://schemas.microsoft.com/office/word/2010/wordprocessingCanvas" xmlns:wpg="http://schemas.microsoft.com/office/word/2010/wordprocessingGroup" xmlns:w16="http://schemas.microsoft.com/office/word/2018/wordml" xmlns:w16cex="http://schemas.microsoft.com/office/word/2018/wordml/cex" xmlns:cei="http://schemas.microsoft.com/office/word/2026/wordml/cei" xmlns:wetp="http://schemas.microsoft.com/office/webextensions/taskpanes/2010/11" xmlns:we="http://schemas.microsoft.com/office/webextensions/webextension/2010/11" xmlns:comp="http://schemas.openxmlformats.org/drawingml/2006/compatibility" xmlns:lc="http://schemas.openxmlformats.org/drawingml/2006/lockedCanvas" xmlns:dgm14="http://schemas.microsoft.com/office/drawing/2010/diagram" xmlns:a15="http://schemas.microsoft.com/office/drawing/2012/main" xmlns:pic14="http://schemas.microsoft.com/office/drawing/2010/picture" xmlns:c16ac="http://schemas.microsoft.com/office/drawing/2014/chart/ac" xmlns:a16="http://schemas.microsoft.com/office/drawing/2014/main" xmlns:a1611="http://schemas.microsoft.com/office/drawing/2016/11/main" xmlns:dgm1612="http://schemas.microsoft.com/office/drawing/2016/12/diagram" xmlns:a16svg="http://schemas.microsoft.com/office/drawing/2016/SVG/main" xmlns:adec="http://schemas.microsoft.com/office/drawing/2017/decorative" xmlns:a18hc="http://schemas.microsoft.com/office/drawing/2018/hyperlinkcolor" xmlns:wp15="http://schemas.microsoft.com/office/word/2012/wordprocessingDrawing" mc:Ignorable="w14 w15 w16se w16cid w16 w16cex w16sdtdh w16sdtfl w16du">
   <w:docDefaults>
     <w:rPrDefault>
       <w:rPr>
@@ -51460,7 +51870,7 @@
 </file>
 
 <file path=word/theme/theme1.xml><?xml version="1.0" encoding="utf-8"?>
-<a:theme xmlns:w="http://schemas.openxmlformats.org/wordprocessingml/2006/main" xmlns:w14="http://schemas.microsoft.com/office/word/2010/wordml" xmlns:w16du="http://schemas.microsoft.com/office/word/2023/wordml/word16du" xmlns:w16sdtdh="http://schemas.microsoft.com/office/word/2020/wordml/sdtdatahash" xmlns:w15="http://schemas.microsoft.com/office/word/2012/wordml" xmlns:w16sdtfl="http://schemas.microsoft.com/office/word/2024/wordml/sdtformatlock" xmlns:r="http://schemas.openxmlformats.org/officeDocument/2006/relationships" xmlns:w16se="http://schemas.microsoft.com/office/word/2015/wordml/symex" xmlns:m="http://schemas.openxmlformats.org/officeDocument/2006/math" xmlns:a="http://schemas.openxmlformats.org/drawingml/2006/main" xmlns:wp="http://schemas.openxmlformats.org/drawingml/2006/wordprocessingDrawing" xmlns:wp14="http://schemas.microsoft.com/office/word/2010/wordprocessingDrawing" xmlns:mc="http://schemas.openxmlformats.org/markup-compatibility/2006" xmlns:a14="http://schemas.microsoft.com/office/drawing/2010/main" xmlns:w16cid="http://schemas.microsoft.com/office/word/2016/wordml/cid" xmlns:sl="http://schemas.openxmlformats.org/schemaLibrary/2006/main" xmlns:wne="http://schemas.microsoft.com/office/word/2006/wordml" xmlns:c="http://schemas.openxmlformats.org/drawingml/2006/chart" xmlns:cdr="http://schemas.openxmlformats.org/drawingml/2006/chartDrawing" xmlns:c14="http://schemas.microsoft.com/office/drawing/2007/8/2/chart" xmlns:dgm="http://schemas.openxmlformats.org/drawingml/2006/diagram" xmlns:pic="http://schemas.openxmlformats.org/drawingml/2006/picture" xmlns:xdr="http://schemas.openxmlformats.org/drawingml/2006/spreadsheetDrawing" xmlns:dsp="http://schemas.microsoft.com/office/drawing/2008/diagram" xmlns:o="urn:schemas-microsoft-com:office:office" xmlns:v="urn:schemas-microsoft-com:vml" xmlns:w10="urn:schemas-microsoft-com:office:word" xmlns:xvml="urn:schemas-microsoft-com:office:excel" xmlns:pvml="urn:schemas-microsoft-com:office:powerpoint" xmlns:cppr="http://schemas.microsoft.com/office/2006/coverPageProps" xmlns:odx="http://opendope.org/xpaths" xmlns:odc="http://opendope.org/conditions" xmlns:odq="http://opendope.org/questions" xmlns:oda="http://opendope.org/answers" xmlns:odi="http://opendope.org/components" xmlns:odgm="http://opendope.org/SmartArt/DataHierarchy" xmlns:b="http://schemas.openxmlformats.org/officeDocument/2006/bibliography" xmlns:msink="http://schemas.microsoft.com/ink/2010/main" xmlns:cdr14="http://schemas.microsoft.com/office/drawing/2010/chartDrawing" xmlns:c15="http://schemas.microsoft.com/office/drawing/2012/chart" xmlns:cs="http://schemas.microsoft.com/office/drawing/2012/chartStyle" xmlns:ns43="http://www.w3.org/1998/Math/MathML" xmlns:ns44="http://www.w3.org/2003/InkML" xmlns:a13cmd="http://schemas.microsoft.com/office/drawing/2013/main/command" xmlns:cx="http://schemas.microsoft.com/office/drawing/2014/chartex" xmlns:c16="http://schemas.microsoft.com/office/drawing/2014/chart" xmlns:dgm1611="http://schemas.microsoft.com/office/drawing/2016/11/diagram" xmlns:c16r3="http://schemas.microsoft.com/office/drawing/2017/03/chart" xmlns:am3d="http://schemas.microsoft.com/office/drawing/2017/model3d" xmlns:an18="http://schemas.microsoft.com/office/drawing/2018/animation" xmlns:anam3d="http://schemas.microsoft.com/office/drawing/2018/animation/model3d" xmlns:iact="http://schemas.microsoft.com/office/powerpoint/2014/inkAction" xmlns:thm15="http://schemas.microsoft.com/office/thememl/2012/main" xmlns:wps="http://schemas.microsoft.com/office/word/2010/wordprocessingShape" xmlns:wpc="http://schemas.microsoft.com/office/word/2010/wordprocessingCanvas" xmlns:wpg="http://schemas.microsoft.com/office/word/2010/wordprocessingGroup" xmlns:w16="http://schemas.microsoft.com/office/word/2018/wordml" xmlns:w16cex="http://schemas.microsoft.com/office/word/2018/wordml/cex" xmlns:cei="http://schemas.microsoft.com/office/word/2026/wordml/cei" xmlns:wetp="http://schemas.microsoft.com/office/webextensions/taskpanes/2010/11" xmlns:we="http://schemas.microsoft.com/office/webextensions/webextension/2010/11" xmlns:comp="http://schemas.openxmlformats.org/drawingml/2006/compatibility" xmlns:lc="http://schemas.openxmlformats.org/drawingml/2006/lockedCanvas" xmlns:dgm14="http://schemas.microsoft.com/office/drawing/2010/diagram" xmlns:a15="http://schemas.microsoft.com/office/drawing/2012/main" xmlns:pic14="http://schemas.microsoft.com/office/drawing/2010/picture" xmlns:c16ac="http://schemas.microsoft.com/office/drawing/2014/chart/ac" xmlns:a16="http://schemas.microsoft.com/office/drawing/2014/main" xmlns:a1611="http://schemas.microsoft.com/office/drawing/2016/11/main" xmlns:dgm1612="http://schemas.microsoft.com/office/drawing/2016/12/diagram" xmlns:a16svg="http://schemas.microsoft.com/office/drawing/2016/SVG/main" xmlns:adec="http://schemas.microsoft.com/office/drawing/2017/decorative" xmlns:a18hc="http://schemas.microsoft.com/office/drawing/2018/hyperlinkcolor" xmlns:wp15="http://schemas.microsoft.com/office/word/2012/wordprocessingDrawing" name="Office Theme">
+<a:theme xmlns:w="http://schemas.openxmlformats.org/wordprocessingml/2006/main" xmlns:w14="http://schemas.microsoft.com/office/word/2010/wordml" xmlns:w16du="http://schemas.microsoft.com/office/word/2023/wordml/word16du" xmlns:w16se="http://schemas.microsoft.com/office/word/2015/wordml/symex" xmlns:r="http://schemas.openxmlformats.org/officeDocument/2006/relationships" xmlns:w16sdtdh="http://schemas.microsoft.com/office/word/2020/wordml/sdtdatahash" xmlns:w15="http://schemas.microsoft.com/office/word/2012/wordml" xmlns:w16sdtfl="http://schemas.microsoft.com/office/word/2024/wordml/sdtformatlock" xmlns:m="http://schemas.openxmlformats.org/officeDocument/2006/math" xmlns:a="http://schemas.openxmlformats.org/drawingml/2006/main" xmlns:wp="http://schemas.openxmlformats.org/drawingml/2006/wordprocessingDrawing" xmlns:wp14="http://schemas.microsoft.com/office/word/2010/wordprocessingDrawing" xmlns:mc="http://schemas.openxmlformats.org/markup-compatibility/2006" xmlns:a14="http://schemas.microsoft.com/office/drawing/2010/main" xmlns:w16cid="http://schemas.microsoft.com/office/word/2016/wordml/cid" xmlns:sl="http://schemas.openxmlformats.org/schemaLibrary/2006/main" xmlns:wne="http://schemas.microsoft.com/office/word/2006/wordml" xmlns:c="http://schemas.openxmlformats.org/drawingml/2006/chart" xmlns:cdr="http://schemas.openxmlformats.org/drawingml/2006/chartDrawing" xmlns:c14="http://schemas.microsoft.com/office/drawing/2007/8/2/chart" xmlns:dgm="http://schemas.openxmlformats.org/drawingml/2006/diagram" xmlns:pic="http://schemas.openxmlformats.org/drawingml/2006/picture" xmlns:xdr="http://schemas.openxmlformats.org/drawingml/2006/spreadsheetDrawing" xmlns:dsp="http://schemas.microsoft.com/office/drawing/2008/diagram" xmlns:o="urn:schemas-microsoft-com:office:office" xmlns:v="urn:schemas-microsoft-com:vml" xmlns:w10="urn:schemas-microsoft-com:office:word" xmlns:xvml="urn:schemas-microsoft-com:office:excel" xmlns:pvml="urn:schemas-microsoft-com:office:powerpoint" xmlns:cppr="http://schemas.microsoft.com/office/2006/coverPageProps" xmlns:odx="http://opendope.org/xpaths" xmlns:odc="http://opendope.org/conditions" xmlns:odq="http://opendope.org/questions" xmlns:oda="http://opendope.org/answers" xmlns:odi="http://opendope.org/components" xmlns:odgm="http://opendope.org/SmartArt/DataHierarchy" xmlns:b="http://schemas.openxmlformats.org/officeDocument/2006/bibliography" xmlns:msink="http://schemas.microsoft.com/ink/2010/main" xmlns:cdr14="http://schemas.microsoft.com/office/drawing/2010/chartDrawing" xmlns:c15="http://schemas.microsoft.com/office/drawing/2012/chart" xmlns:cs="http://schemas.microsoft.com/office/drawing/2012/chartStyle" xmlns:ns43="http://www.w3.org/1998/Math/MathML" xmlns:ns44="http://www.w3.org/2003/InkML" xmlns:a13cmd="http://schemas.microsoft.com/office/drawing/2013/main/command" xmlns:cx="http://schemas.microsoft.com/office/drawing/2014/chartex" xmlns:c16="http://schemas.microsoft.com/office/drawing/2014/chart" xmlns:dgm1611="http://schemas.microsoft.com/office/drawing/2016/11/diagram" xmlns:c16r3="http://schemas.microsoft.com/office/drawing/2017/03/chart" xmlns:am3d="http://schemas.microsoft.com/office/drawing/2017/model3d" xmlns:an18="http://schemas.microsoft.com/office/drawing/2018/animation" xmlns:anam3d="http://schemas.microsoft.com/office/drawing/2018/animation/model3d" xmlns:iact="http://schemas.microsoft.com/office/powerpoint/2014/inkAction" xmlns:thm15="http://schemas.microsoft.com/office/thememl/2012/main" xmlns:wps="http://schemas.microsoft.com/office/word/2010/wordprocessingShape" xmlns:wpc="http://schemas.microsoft.com/office/word/2010/wordprocessingCanvas" xmlns:wpg="http://schemas.microsoft.com/office/word/2010/wordprocessingGroup" xmlns:w16="http://schemas.microsoft.com/office/word/2018/wordml" xmlns:w16cex="http://schemas.microsoft.com/office/word/2018/wordml/cex" xmlns:cei="http://schemas.microsoft.com/office/word/2026/wordml/cei" xmlns:wetp="http://schemas.microsoft.com/office/webextensions/taskpanes/2010/11" xmlns:we="http://schemas.microsoft.com/office/webextensions/webextension/2010/11" xmlns:comp="http://schemas.openxmlformats.org/drawingml/2006/compatibility" xmlns:lc="http://schemas.openxmlformats.org/drawingml/2006/lockedCanvas" xmlns:dgm14="http://schemas.microsoft.com/office/drawing/2010/diagram" xmlns:a15="http://schemas.microsoft.com/office/drawing/2012/main" xmlns:pic14="http://schemas.microsoft.com/office/drawing/2010/picture" xmlns:c16ac="http://schemas.microsoft.com/office/drawing/2014/chart/ac" xmlns:a16="http://schemas.microsoft.com/office/drawing/2014/main" xmlns:a1611="http://schemas.microsoft.com/office/drawing/2016/11/main" xmlns:dgm1612="http://schemas.microsoft.com/office/drawing/2016/12/diagram" xmlns:a16svg="http://schemas.microsoft.com/office/drawing/2016/SVG/main" xmlns:adec="http://schemas.microsoft.com/office/drawing/2017/decorative" xmlns:a18hc="http://schemas.microsoft.com/office/drawing/2018/hyperlinkcolor" xmlns:wp15="http://schemas.microsoft.com/office/word/2012/wordprocessingDrawing" name="Office Theme">
   <a:themeElements>
     <a:clrScheme name="Office">
       <a:dk1>
@@ -51747,7 +52157,7 @@
 </file>
 
 <file path=customXml/item2.xml><?xml version="1.0" encoding="utf-8"?>
-<b:Sources xmlns:w="http://schemas.openxmlformats.org/wordprocessingml/2006/main" xmlns:w14="http://schemas.microsoft.com/office/word/2010/wordml" xmlns:w16du="http://schemas.microsoft.com/office/word/2023/wordml/word16du" xmlns:w16sdtdh="http://schemas.microsoft.com/office/word/2020/wordml/sdtdatahash" xmlns:w15="http://schemas.microsoft.com/office/word/2012/wordml" xmlns:w16sdtfl="http://schemas.microsoft.com/office/word/2024/wordml/sdtformatlock" xmlns:r="http://schemas.openxmlformats.org/officeDocument/2006/relationships" xmlns:w16se="http://schemas.microsoft.com/office/word/2015/wordml/symex" xmlns:m="http://schemas.openxmlformats.org/officeDocument/2006/math" xmlns:a="http://schemas.openxmlformats.org/drawingml/2006/main" xmlns:wp="http://schemas.openxmlformats.org/drawingml/2006/wordprocessingDrawing" xmlns:wp14="http://schemas.microsoft.com/office/word/2010/wordprocessingDrawing" xmlns:mc="http://schemas.openxmlformats.org/markup-compatibility/2006" xmlns:a14="http://schemas.microsoft.com/office/drawing/2010/main" xmlns:w16cid="http://schemas.microsoft.com/office/word/2016/wordml/cid" xmlns:sl="http://schemas.openxmlformats.org/schemaLibrary/2006/main" xmlns:wne="http://schemas.microsoft.com/office/word/2006/wordml" xmlns:c="http://schemas.openxmlformats.org/drawingml/2006/chart" xmlns:cdr="http://schemas.openxmlformats.org/drawingml/2006/chartDrawing" xmlns:c14="http://schemas.microsoft.com/office/drawing/2007/8/2/chart" xmlns:dgm="http://schemas.openxmlformats.org/drawingml/2006/diagram" xmlns:pic="http://schemas.openxmlformats.org/drawingml/2006/picture" xmlns:xdr="http://schemas.openxmlformats.org/drawingml/2006/spreadsheetDrawing" xmlns:dsp="http://schemas.microsoft.com/office/drawing/2008/diagram" xmlns:o="urn:schemas-microsoft-com:office:office" xmlns:v="urn:schemas-microsoft-com:vml" xmlns:w10="urn:schemas-microsoft-com:office:word" xmlns:xvml="urn:schemas-microsoft-com:office:excel" xmlns:pvml="urn:schemas-microsoft-com:office:powerpoint" xmlns:cppr="http://schemas.microsoft.com/office/2006/coverPageProps" xmlns:odx="http://opendope.org/xpaths" xmlns:odc="http://opendope.org/conditions" xmlns:odq="http://opendope.org/questions" xmlns:oda="http://opendope.org/answers" xmlns:odi="http://opendope.org/components" xmlns:odgm="http://opendope.org/SmartArt/DataHierarchy" xmlns:b="http://schemas.openxmlformats.org/officeDocument/2006/bibliography" xmlns:msink="http://schemas.microsoft.com/ink/2010/main" xmlns:cdr14="http://schemas.microsoft.com/office/drawing/2010/chartDrawing" xmlns:c15="http://schemas.microsoft.com/office/drawing/2012/chart" xmlns:cs="http://schemas.microsoft.com/office/drawing/2012/chartStyle" xmlns:ns43="http://www.w3.org/1998/Math/MathML" xmlns:ns44="http://www.w3.org/2003/InkML" xmlns:a13cmd="http://schemas.microsoft.com/office/drawing/2013/main/command" xmlns:cx="http://schemas.microsoft.com/office/drawing/2014/chartex" xmlns:c16="http://schemas.microsoft.com/office/drawing/2014/chart" xmlns:dgm1611="http://schemas.microsoft.com/office/drawing/2016/11/diagram" xmlns:c16r3="http://schemas.microsoft.com/office/drawing/2017/03/chart" xmlns:am3d="http://schemas.microsoft.com/office/drawing/2017/model3d" xmlns:an18="http://schemas.microsoft.com/office/drawing/2018/animation" xmlns:anam3d="http://schemas.microsoft.com/office/drawing/2018/animation/model3d" xmlns:iact="http://schemas.microsoft.com/office/powerpoint/2014/inkAction" xmlns:thm15="http://schemas.microsoft.com/office/thememl/2012/main" xmlns:wps="http://schemas.microsoft.com/office/word/2010/wordprocessingShape" xmlns:wpc="http://schemas.microsoft.com/office/word/2010/wordprocessingCanvas" xmlns:wpg="http://schemas.microsoft.com/office/word/2010/wordprocessingGroup" xmlns:w16="http://schemas.microsoft.com/office/word/2018/wordml" xmlns:w16cex="http://schemas.microsoft.com/office/word/2018/wordml/cex" xmlns:cei="http://schemas.microsoft.com/office/word/2026/wordml/cei" xmlns:wetp="http://schemas.microsoft.com/office/webextensions/taskpanes/2010/11" xmlns:we="http://schemas.microsoft.com/office/webextensions/webextension/2010/11" xmlns:comp="http://schemas.openxmlformats.org/drawingml/2006/compatibility" xmlns:lc="http://schemas.openxmlformats.org/drawingml/2006/lockedCanvas" xmlns:dgm14="http://schemas.microsoft.com/office/drawing/2010/diagram" xmlns:a15="http://schemas.microsoft.com/office/drawing/2012/main" xmlns:pic14="http://schemas.microsoft.com/office/drawing/2010/picture" xmlns:c16ac="http://schemas.microsoft.com/office/drawing/2014/chart/ac" xmlns:a16="http://schemas.microsoft.com/office/drawing/2014/main" xmlns:a1611="http://schemas.microsoft.com/office/drawing/2016/11/main" xmlns:dgm1612="http://schemas.microsoft.com/office/drawing/2016/12/diagram" xmlns:a16svg="http://schemas.microsoft.com/office/drawing/2016/SVG/main" xmlns:adec="http://schemas.microsoft.com/office/drawing/2017/decorative" xmlns:a18hc="http://schemas.microsoft.com/office/drawing/2018/hyperlinkcolor" xmlns:wp15="http://schemas.microsoft.com/office/word/2012/wordprocessingDrawing" SelectedStyle="\APA.XSL" StyleName="APA"/>
+<b:Sources xmlns:w="http://schemas.openxmlformats.org/wordprocessingml/2006/main" xmlns:w14="http://schemas.microsoft.com/office/word/2010/wordml" xmlns:w16du="http://schemas.microsoft.com/office/word/2023/wordml/word16du" xmlns:w16se="http://schemas.microsoft.com/office/word/2015/wordml/symex" xmlns:r="http://schemas.openxmlformats.org/officeDocument/2006/relationships" xmlns:w16sdtdh="http://schemas.microsoft.com/office/word/2020/wordml/sdtdatahash" xmlns:w15="http://schemas.microsoft.com/office/word/2012/wordml" xmlns:w16sdtfl="http://schemas.microsoft.com/office/word/2024/wordml/sdtformatlock" xmlns:m="http://schemas.openxmlformats.org/officeDocument/2006/math" xmlns:a="http://schemas.openxmlformats.org/drawingml/2006/main" xmlns:wp="http://schemas.openxmlformats.org/drawingml/2006/wordprocessingDrawing" xmlns:wp14="http://schemas.microsoft.com/office/word/2010/wordprocessingDrawing" xmlns:mc="http://schemas.openxmlformats.org/markup-compatibility/2006" xmlns:a14="http://schemas.microsoft.com/office/drawing/2010/main" xmlns:w16cid="http://schemas.microsoft.com/office/word/2016/wordml/cid" xmlns:sl="http://schemas.openxmlformats.org/schemaLibrary/2006/main" xmlns:wne="http://schemas.microsoft.com/office/word/2006/wordml" xmlns:c="http://schemas.openxmlformats.org/drawingml/2006/chart" xmlns:cdr="http://schemas.openxmlformats.org/drawingml/2006/chartDrawing" xmlns:c14="http://schemas.microsoft.com/office/drawing/2007/8/2/chart" xmlns:dgm="http://schemas.openxmlformats.org/drawingml/2006/diagram" xmlns:pic="http://schemas.openxmlformats.org/drawingml/2006/picture" xmlns:xdr="http://schemas.openxmlformats.org/drawingml/2006/spreadsheetDrawing" xmlns:dsp="http://schemas.microsoft.com/office/drawing/2008/diagram" xmlns:o="urn:schemas-microsoft-com:office:office" xmlns:v="urn:schemas-microsoft-com:vml" xmlns:w10="urn:schemas-microsoft-com:office:word" xmlns:xvml="urn:schemas-microsoft-com:office:excel" xmlns:pvml="urn:schemas-microsoft-com:office:powerpoint" xmlns:cppr="http://schemas.microsoft.com/office/2006/coverPageProps" xmlns:odx="http://opendope.org/xpaths" xmlns:odc="http://opendope.org/conditions" xmlns:odq="http://opendope.org/questions" xmlns:oda="http://opendope.org/answers" xmlns:odi="http://opendope.org/components" xmlns:odgm="http://opendope.org/SmartArt/DataHierarchy" xmlns:b="http://schemas.openxmlformats.org/officeDocument/2006/bibliography" xmlns:msink="http://schemas.microsoft.com/ink/2010/main" xmlns:cdr14="http://schemas.microsoft.com/office/drawing/2010/chartDrawing" xmlns:c15="http://schemas.microsoft.com/office/drawing/2012/chart" xmlns:cs="http://schemas.microsoft.com/office/drawing/2012/chartStyle" xmlns:ns43="http://www.w3.org/1998/Math/MathML" xmlns:ns44="http://www.w3.org/2003/InkML" xmlns:a13cmd="http://schemas.microsoft.com/office/drawing/2013/main/command" xmlns:cx="http://schemas.microsoft.com/office/drawing/2014/chartex" xmlns:c16="http://schemas.microsoft.com/office/drawing/2014/chart" xmlns:dgm1611="http://schemas.microsoft.com/office/drawing/2016/11/diagram" xmlns:c16r3="http://schemas.microsoft.com/office/drawing/2017/03/chart" xmlns:am3d="http://schemas.microsoft.com/office/drawing/2017/model3d" xmlns:an18="http://schemas.microsoft.com/office/drawing/2018/animation" xmlns:anam3d="http://schemas.microsoft.com/office/drawing/2018/animation/model3d" xmlns:iact="http://schemas.microsoft.com/office/powerpoint/2014/inkAction" xmlns:thm15="http://schemas.microsoft.com/office/thememl/2012/main" xmlns:wps="http://schemas.microsoft.com/office/word/2010/wordprocessingShape" xmlns:wpc="http://schemas.microsoft.com/office/word/2010/wordprocessingCanvas" xmlns:wpg="http://schemas.microsoft.com/office/word/2010/wordprocessingGroup" xmlns:w16="http://schemas.microsoft.com/office/word/2018/wordml" xmlns:w16cex="http://schemas.microsoft.com/office/word/2018/wordml/cex" xmlns:cei="http://schemas.microsoft.com/office/word/2026/wordml/cei" xmlns:wetp="http://schemas.microsoft.com/office/webextensions/taskpanes/2010/11" xmlns:we="http://schemas.microsoft.com/office/webextensions/webextension/2010/11" xmlns:comp="http://schemas.openxmlformats.org/drawingml/2006/compatibility" xmlns:lc="http://schemas.openxmlformats.org/drawingml/2006/lockedCanvas" xmlns:dgm14="http://schemas.microsoft.com/office/drawing/2010/diagram" xmlns:a15="http://schemas.microsoft.com/office/drawing/2012/main" xmlns:pic14="http://schemas.microsoft.com/office/drawing/2010/picture" xmlns:c16ac="http://schemas.microsoft.com/office/drawing/2014/chart/ac" xmlns:a16="http://schemas.microsoft.com/office/drawing/2014/main" xmlns:a1611="http://schemas.microsoft.com/office/drawing/2016/11/main" xmlns:dgm1612="http://schemas.microsoft.com/office/drawing/2016/12/diagram" xmlns:a16svg="http://schemas.microsoft.com/office/drawing/2016/SVG/main" xmlns:adec="http://schemas.microsoft.com/office/drawing/2017/decorative" xmlns:a18hc="http://schemas.microsoft.com/office/drawing/2018/hyperlinkcolor" xmlns:wp15="http://schemas.microsoft.com/office/word/2012/wordprocessingDrawing" SelectedStyle="\APA.XSL" StyleName="APA"/>
 </file>
 
 <file path=customXml/item3.xml><?xml version="1.0" encoding="utf-8"?>
@@ -51755,7 +52165,7 @@
 </file>
 
 <file path=customXml/item4.xml><?xml version="1.0" encoding="utf-8"?>
-<b:Sources xmlns:w="http://schemas.openxmlformats.org/wordprocessingml/2006/main" xmlns:w14="http://schemas.microsoft.com/office/word/2010/wordml" xmlns:w16du="http://schemas.microsoft.com/office/word/2023/wordml/word16du" xmlns:w16sdtdh="http://schemas.microsoft.com/office/word/2020/wordml/sdtdatahash" xmlns:w15="http://schemas.microsoft.com/office/word/2012/wordml" xmlns:w16sdtfl="http://schemas.microsoft.com/office/word/2024/wordml/sdtformatlock" xmlns:r="http://schemas.openxmlformats.org/officeDocument/2006/relationships" xmlns:w16se="http://schemas.microsoft.com/office/word/2015/wordml/symex" xmlns:m="http://schemas.openxmlformats.org/officeDocument/2006/math" xmlns:a="http://schemas.openxmlformats.org/drawingml/2006/main" xmlns:wp="http://schemas.openxmlformats.org/drawingml/2006/wordprocessingDrawing" xmlns:wp14="http://schemas.microsoft.com/office/word/2010/wordprocessingDrawing" xmlns:mc="http://schemas.openxmlformats.org/markup-compatibility/2006" xmlns:a14="http://schemas.microsoft.com/office/drawing/2010/main" xmlns:w16cid="http://schemas.microsoft.com/office/word/2016/wordml/cid" xmlns:sl="http://schemas.openxmlformats.org/schemaLibrary/2006/main" xmlns:wne="http://schemas.microsoft.com/office/word/2006/wordml" xmlns:c="http://schemas.openxmlformats.org/drawingml/2006/chart" xmlns:cdr="http://schemas.openxmlformats.org/drawingml/2006/chartDrawing" xmlns:c14="http://schemas.microsoft.com/office/drawing/2007/8/2/chart" xmlns:dgm="http://schemas.openxmlformats.org/drawingml/2006/diagram" xmlns:pic="http://schemas.openxmlformats.org/drawingml/2006/picture" xmlns:xdr="http://schemas.openxmlformats.org/drawingml/2006/spreadsheetDrawing" xmlns:dsp="http://schemas.microsoft.com/office/drawing/2008/diagram" xmlns:o="urn:schemas-microsoft-com:office:office" xmlns:v="urn:schemas-microsoft-com:vml" xmlns:w10="urn:schemas-microsoft-com:office:word" xmlns:xvml="urn:schemas-microsoft-com:office:excel" xmlns:pvml="urn:schemas-microsoft-com:office:powerpoint" xmlns:cppr="http://schemas.microsoft.com/office/2006/coverPageProps" xmlns:odx="http://opendope.org/xpaths" xmlns:odc="http://opendope.org/conditions" xmlns:odq="http://opendope.org/questions" xmlns:oda="http://opendope.org/answers" xmlns:odi="http://opendope.org/components" xmlns:odgm="http://opendope.org/SmartArt/DataHierarchy" xmlns:b="http://schemas.openxmlformats.org/officeDocument/2006/bibliography" xmlns:msink="http://schemas.microsoft.com/ink/2010/main" xmlns:cdr14="http://schemas.microsoft.com/office/drawing/2010/chartDrawing" xmlns:c15="http://schemas.microsoft.com/office/drawing/2012/chart" xmlns:cs="http://schemas.microsoft.com/office/drawing/2012/chartStyle" xmlns:ns43="http://www.w3.org/1998/Math/MathML" xmlns:ns44="http://www.w3.org/2003/InkML" xmlns:a13cmd="http://schemas.microsoft.com/office/drawing/2013/main/command" xmlns:cx="http://schemas.microsoft.com/office/drawing/2014/chartex" xmlns:c16="http://schemas.microsoft.com/office/drawing/2014/chart" xmlns:dgm1611="http://schemas.microsoft.com/office/drawing/2016/11/diagram" xmlns:c16r3="http://schemas.microsoft.com/office/drawing/2017/03/chart" xmlns:am3d="http://schemas.microsoft.com/office/drawing/2017/model3d" xmlns:an18="http://schemas.microsoft.com/office/drawing/2018/animation" xmlns:anam3d="http://schemas.microsoft.com/office/drawing/2018/animation/model3d" xmlns:iact="http://schemas.microsoft.com/office/powerpoint/2014/inkAction" xmlns:thm15="http://schemas.microsoft.com/office/thememl/2012/main" xmlns:wps="http://schemas.microsoft.com/office/word/2010/wordprocessingShape" xmlns:wpc="http://schemas.microsoft.com/office/word/2010/wordprocessingCanvas" xmlns:wpg="http://schemas.microsoft.com/office/word/2010/wordprocessingGroup" xmlns:w16="http://schemas.microsoft.com/office/word/2018/wordml" xmlns:w16cex="http://schemas.microsoft.com/office/word/2018/wordml/cex" xmlns:cei="http://schemas.microsoft.com/office/word/2026/wordml/cei" xmlns:wetp="http://schemas.microsoft.com/office/webextensions/taskpanes/2010/11" xmlns:we="http://schemas.microsoft.com/office/webextensions/webextension/2010/11" xmlns:comp="http://schemas.openxmlformats.org/drawingml/2006/compatibility" xmlns:lc="http://schemas.openxmlformats.org/drawingml/2006/lockedCanvas" xmlns:dgm14="http://schemas.microsoft.com/office/drawing/2010/diagram" xmlns:a15="http://schemas.microsoft.com/office/drawing/2012/main" xmlns:pic14="http://schemas.microsoft.com/office/drawing/2010/picture" xmlns:c16ac="http://schemas.microsoft.com/office/drawing/2014/chart/ac" xmlns:a16="http://schemas.microsoft.com/office/drawing/2014/main" xmlns:a1611="http://schemas.microsoft.com/office/drawing/2016/11/main" xmlns:dgm1612="http://schemas.microsoft.com/office/drawing/2016/12/diagram" xmlns:a16svg="http://schemas.microsoft.com/office/drawing/2016/SVG/main" xmlns:adec="http://schemas.microsoft.com/office/drawing/2017/decorative" xmlns:a18hc="http://schemas.microsoft.com/office/drawing/2018/hyperlinkcolor" xmlns:wp15="http://schemas.microsoft.com/office/word/2012/wordprocessingDrawing" SelectedStyle="\APA.XSL" StyleName="APA"/>
+<b:Sources xmlns:w="http://schemas.openxmlformats.org/wordprocessingml/2006/main" xmlns:w14="http://schemas.microsoft.com/office/word/2010/wordml" xmlns:w16du="http://schemas.microsoft.com/office/word/2023/wordml/word16du" xmlns:w16se="http://schemas.microsoft.com/office/word/2015/wordml/symex" xmlns:r="http://schemas.openxmlformats.org/officeDocument/2006/relationships" xmlns:w16sdtdh="http://schemas.microsoft.com/office/word/2020/wordml/sdtdatahash" xmlns:w15="http://schemas.microsoft.com/office/word/2012/wordml" xmlns:w16sdtfl="http://schemas.microsoft.com/office/word/2024/wordml/sdtformatlock" xmlns:m="http://schemas.openxmlformats.org/officeDocument/2006/math" xmlns:a="http://schemas.openxmlformats.org/drawingml/2006/main" xmlns:wp="http://schemas.openxmlformats.org/drawingml/2006/wordprocessingDrawing" xmlns:wp14="http://schemas.microsoft.com/office/word/2010/wordprocessingDrawing" xmlns:mc="http://schemas.openxmlformats.org/markup-compatibility/2006" xmlns:a14="http://schemas.microsoft.com/office/drawing/2010/main" xmlns:w16cid="http://schemas.microsoft.com/office/word/2016/wordml/cid" xmlns:sl="http://schemas.openxmlformats.org/schemaLibrary/2006/main" xmlns:wne="http://schemas.microsoft.com/office/word/2006/wordml" xmlns:c="http://schemas.openxmlformats.org/drawingml/2006/chart" xmlns:cdr="http://schemas.openxmlformats.org/drawingml/2006/chartDrawing" xmlns:c14="http://schemas.microsoft.com/office/drawing/2007/8/2/chart" xmlns:dgm="http://schemas.openxmlformats.org/drawingml/2006/diagram" xmlns:pic="http://schemas.openxmlformats.org/drawingml/2006/picture" xmlns:xdr="http://schemas.openxmlformats.org/drawingml/2006/spreadsheetDrawing" xmlns:dsp="http://schemas.microsoft.com/office/drawing/2008/diagram" xmlns:o="urn:schemas-microsoft-com:office:office" xmlns:v="urn:schemas-microsoft-com:vml" xmlns:w10="urn:schemas-microsoft-com:office:word" xmlns:xvml="urn:schemas-microsoft-com:office:excel" xmlns:pvml="urn:schemas-microsoft-com:office:powerpoint" xmlns:cppr="http://schemas.microsoft.com/office/2006/coverPageProps" xmlns:odx="http://opendope.org/xpaths" xmlns:odc="http://opendope.org/conditions" xmlns:odq="http://opendope.org/questions" xmlns:oda="http://opendope.org/answers" xmlns:odi="http://opendope.org/components" xmlns:odgm="http://opendope.org/SmartArt/DataHierarchy" xmlns:b="http://schemas.openxmlformats.org/officeDocument/2006/bibliography" xmlns:msink="http://schemas.microsoft.com/ink/2010/main" xmlns:cdr14="http://schemas.microsoft.com/office/drawing/2010/chartDrawing" xmlns:c15="http://schemas.microsoft.com/office/drawing/2012/chart" xmlns:cs="http://schemas.microsoft.com/office/drawing/2012/chartStyle" xmlns:ns43="http://www.w3.org/1998/Math/MathML" xmlns:ns44="http://www.w3.org/2003/InkML" xmlns:a13cmd="http://schemas.microsoft.com/office/drawing/2013/main/command" xmlns:cx="http://schemas.microsoft.com/office/drawing/2014/chartex" xmlns:c16="http://schemas.microsoft.com/office/drawing/2014/chart" xmlns:dgm1611="http://schemas.microsoft.com/office/drawing/2016/11/diagram" xmlns:c16r3="http://schemas.microsoft.com/office/drawing/2017/03/chart" xmlns:am3d="http://schemas.microsoft.com/office/drawing/2017/model3d" xmlns:an18="http://schemas.microsoft.com/office/drawing/2018/animation" xmlns:anam3d="http://schemas.microsoft.com/office/drawing/2018/animation/model3d" xmlns:iact="http://schemas.microsoft.com/office/powerpoint/2014/inkAction" xmlns:thm15="http://schemas.microsoft.com/office/thememl/2012/main" xmlns:wps="http://schemas.microsoft.com/office/word/2010/wordprocessingShape" xmlns:wpc="http://schemas.microsoft.com/office/word/2010/wordprocessingCanvas" xmlns:wpg="http://schemas.microsoft.com/office/word/2010/wordprocessingGroup" xmlns:w16="http://schemas.microsoft.com/office/word/2018/wordml" xmlns:w16cex="http://schemas.microsoft.com/office/word/2018/wordml/cex" xmlns:cei="http://schemas.microsoft.com/office/word/2026/wordml/cei" xmlns:wetp="http://schemas.microsoft.com/office/webextensions/taskpanes/2010/11" xmlns:we="http://schemas.microsoft.com/office/webextensions/webextension/2010/11" xmlns:comp="http://schemas.openxmlformats.org/drawingml/2006/compatibility" xmlns:lc="http://schemas.openxmlformats.org/drawingml/2006/lockedCanvas" xmlns:dgm14="http://schemas.microsoft.com/office/drawing/2010/diagram" xmlns:a15="http://schemas.microsoft.com/office/drawing/2012/main" xmlns:pic14="http://schemas.microsoft.com/office/drawing/2010/picture" xmlns:c16ac="http://schemas.microsoft.com/office/drawing/2014/chart/ac" xmlns:a16="http://schemas.microsoft.com/office/drawing/2014/main" xmlns:a1611="http://schemas.microsoft.com/office/drawing/2016/11/main" xmlns:dgm1612="http://schemas.microsoft.com/office/drawing/2016/12/diagram" xmlns:a16svg="http://schemas.microsoft.com/office/drawing/2016/SVG/main" xmlns:adec="http://schemas.microsoft.com/office/drawing/2017/decorative" xmlns:a18hc="http://schemas.microsoft.com/office/drawing/2018/hyperlinkcolor" xmlns:wp15="http://schemas.microsoft.com/office/word/2012/wordprocessingDrawing" SelectedStyle="\APA.XSL" StyleName="APA"/>
 </file>
 
 <file path=customXml/item5.xml><?xml version="1.0" encoding="utf-8"?>

</xml_diff>

<commit_message>
docx4j-bundle carries docx4j-diffx too
The base bundle gains docx4j-diffx (pso-diffx and pso-xmlwriter, Apache-2.0,
about 380 KB), the one thing the retired zip's optional/diffx gave that the
bundles did not; the 2026-10-21 decision had not considered it. The extras
pom lists it provided beside digsig and markdown, so it is never shaded
there. Rebuilt and checked: 257 diffx and pageseeder entries in the base jar,
none in the extras, no class entry in both; the CompareDocuments sample runs
on the base jar alone.

Design rationale, CHANGELOG and Getting Started (the bundles paragraph, and
diffx out of the not-in-a-bundle list; docx and md) say so.

Co-Authored-By: Claude Fable 5.1 <noreply@anthropic.com>
Claude-Session: docx4j-25
</commit_message>
<xml_diff>
--- a/docs/Docx4j_GettingStarted.docx
+++ b/docs/Docx4j_GettingStarted.docx
@@ -8024,7 +8024,7 @@
         <w:t>docx4j-bundle</w:t>
       </w:r>
       <w:r>
-        <w:t xml:space="preserve"> holds docx4j-core, the JAXB reference implementation runtime, docx4j-digsig and docx4j-markdown, with all their dependencies.  Its published pom declares no dependencies at all, so Maven resolves nothing else.  The slf4j API is inside; a logging provider is not (see slf4j, below).  With it alone you can load, create, edit and save docx, pptx and xlsx, bind data, extract text, export Markdown and HTML, sign documents, and create and edit charts.</w:t>
+        <w:t xml:space="preserve"> holds docx4j-core, the JAXB reference implementation runtime, docx4j-digsig, docx4j-markdown and docx4j-diffx, with all their dependencies.  Its published pom declares no dependencies at all, so Maven resolves nothing else.  The slf4j API is inside; a logging provider is not (see slf4j, below).  With it alone you can load, create, edit and save docx, pptx and xlsx, bind data, extract text, export Markdown and HTML, sign documents, compare two documents, and create and edit charts.</w:t>
       </w:r>
     </w:p>
     <w:p>
@@ -8213,7 +8213,7 @@
         <w:t>mvn dependency:copy-dependencies -DoutputDirectory=libs</w:t>
       </w:r>
       <w:r>
-        <w:t>, or jar by jar from Central's directory listing (every artifact is a URL under https://repo1.maven.org/maven2/org/docx4j/).  The same gets you anything not in a bundle: docx4j-diffx, docx4j-ImportXHTML, the documents4j and Microsoft Graph converters.</w:t>
+        <w:t>, or jar by jar from Central's directory listing (every artifact is a URL under https://repo1.maven.org/maven2/org/docx4j/).  The same gets you anything not in a bundle: docx4j-ImportXHTML, the documents4j and Microsoft Graph converters.</w:t>
       </w:r>
     </w:p>
     <w:p>

</xml_diff>

<commit_message>
CR-056 phase 3: altChunk links kept for the inspector; Getting Started
HtmlChunkImport asks docx4j-ImportXHTML (its CR-005, which checks link
schemes by default) to keep a chunk's links as written, reflectively beside
setDisplayNoneAsHidden, so a javascript: target in an HTML chunk becomes a
w:hyperlink with that target, as Word keeps it, and the inspector reports it
as relationship.external; the outputs refuse it where it would run
(LinkTargets). An ImportXHTML without the method behaves as before.

Getting Started, "docx to (X)HTML": a paragraph on the schemes written, the
refusal and why, docx4j.convert.out.linkSchemes, and the CSS escaping; in
the canonical docx and the md.

docx4j-tika's part is on the docx4j-tika branch (rebased onto this branch).
CHANGELOG; CR-056 §12 record; D11 recorded.

Co-Authored-By: Claude Fable 5.1 <noreply@anthropic.com>
Claude-Session: docx4j-25
</commit_message>
<xml_diff>
--- a/docs/Docx4j_GettingStarted.docx
+++ b/docs/Docx4j_GettingStarted.docx
@@ -26845,6 +26845,41 @@
           <w:t>src/samples/docx4j/org/docx4j/samples/ConvertOutHtml.java</w:t>
         </w:r>
       </w:hyperlink>
+    </w:p>
+    <w:p>
+      <w:pPr>
+        <w:spacing w:before="100" w:beforeAutospacing="true" w:after="100" w:afterAutospacing="true" w:line="240" w:lineRule="auto"/>
+      </w:pPr>
+      <w:r>
+        <w:t xml:space="preserve">From 17.3.5, a hyperlink is written as a link only if its target has no scheme (a relative path or a bookmark), is a drive path, or uses http, https, ftp, mailto, file, news or tel.  Any other target, a </w:t>
+      </w:r>
+      <w:r>
+        <w:rPr>
+          <w:rFonts w:ascii="Consolas" w:hAnsi="Consolas"/>
+        </w:rPr>
+        <w:t xml:space="preserve">javascript:</w:t>
+      </w:r>
+      <w:r>
+        <w:t xml:space="preserve"> one above all, is written as its text with no link, since it would otherwise run in the page serving the HTML; the PDF and Markdown output do the same.  To allow other schemes, list them in docx4j.properties, for example </w:t>
+      </w:r>
+      <w:r>
+        <w:rPr>
+          <w:rFonts w:ascii="Consolas" w:hAnsi="Consolas"/>
+        </w:rPr>
+        <w:t xml:space="preserve">docx4j.convert.out.linkSchemes=onenote,ms-word</w:t>
+      </w:r>
+      <w:r>
+        <w:t xml:space="preserve">.  A style ID is CSS-escaped in the stylesheet, so it cannot end the </w:t>
+      </w:r>
+      <w:r>
+        <w:rPr>
+          <w:rFonts w:ascii="Consolas" w:hAnsi="Consolas"/>
+        </w:rPr>
+        <w:t xml:space="preserve">&lt;style&gt;</w:t>
+      </w:r>
+      <w:r>
+        <w:t xml:space="preserve"> element; the class attributes are unchanged.</w:t>
+      </w:r>
     </w:p>
     <w:p>
       <w:pPr>

</xml_diff>

<commit_message>
Getting Started: the fields parts rewritten for the current feature set (a Fields chapter: the one evaluator, FieldUpdater, FieldContext and the package's zone and source name, fields in text extraction and in PDF and HTML output, the index generator; the Mailmerge chapter; a feature bullet), as tracked changes in the docx for review, the md as the accepted text
Co-Authored-By: Claude Fable 5.1 <noreply@anthropic.com>
</commit_message>
<xml_diff>
--- a/docs/Docx4j_GettingStarted.docx
+++ b/docs/Docx4j_GettingStarted.docx
@@ -2,7 +2,7 @@
 <file path=word/document.xml><?xml version="1.0" encoding="utf-8"?>
 <w:document xmlns:w="http://schemas.openxmlformats.org/wordprocessingml/2006/main" xmlns:w16du="http://schemas.microsoft.com/office/word/2023/wordml/word16du" xmlns:w14="http://schemas.microsoft.com/office/word/2010/wordml" xmlns:w16sdtdh="http://schemas.microsoft.com/office/word/2020/wordml/sdtdatahash" xmlns:w15="http://schemas.microsoft.com/office/word/2012/wordml" xmlns:w16sdtfl="http://schemas.microsoft.com/office/word/2024/wordml/sdtformatlock" xmlns:w16se="http://schemas.microsoft.com/office/word/2015/wordml/symex" xmlns:r="http://schemas.openxmlformats.org/officeDocument/2006/relationships" xmlns:m="http://schemas.openxmlformats.org/officeDocument/2006/math" xmlns:a="http://schemas.openxmlformats.org/drawingml/2006/main" xmlns:wp="http://schemas.openxmlformats.org/drawingml/2006/wordprocessingDrawing" xmlns:wp14="http://schemas.microsoft.com/office/word/2010/wordprocessingDrawing" xmlns:mc="http://schemas.openxmlformats.org/markup-compatibility/2006" xmlns:a14="http://schemas.microsoft.com/office/drawing/2010/main" xmlns:w16cid="http://schemas.microsoft.com/office/word/2016/wordml/cid" xmlns:sl="http://schemas.openxmlformats.org/schemaLibrary/2006/main" xmlns:wne="http://schemas.microsoft.com/office/word/2006/wordml" xmlns:c="http://schemas.openxmlformats.org/drawingml/2006/chart" xmlns:cdr="http://schemas.openxmlformats.org/drawingml/2006/chartDrawing" xmlns:c14="http://schemas.microsoft.com/office/drawing/2007/8/2/chart" xmlns:dgm="http://schemas.openxmlformats.org/drawingml/2006/diagram" xmlns:pic="http://schemas.openxmlformats.org/drawingml/2006/picture" xmlns:xdr="http://schemas.openxmlformats.org/drawingml/2006/spreadsheetDrawing" xmlns:dsp="http://schemas.microsoft.com/office/drawing/2008/diagram" xmlns:o="urn:schemas-microsoft-com:office:office" xmlns:v="urn:schemas-microsoft-com:vml" xmlns:w10="urn:schemas-microsoft-com:office:word" xmlns:xvml="urn:schemas-microsoft-com:office:excel" xmlns:pvml="urn:schemas-microsoft-com:office:powerpoint" xmlns:cppr="http://schemas.microsoft.com/office/2006/coverPageProps" xmlns:odx="http://opendope.org/xpaths" xmlns:odc="http://opendope.org/conditions" xmlns:odq="http://opendope.org/questions" xmlns:oda="http://opendope.org/answers" xmlns:odi="http://opendope.org/components" xmlns:odgm="http://opendope.org/SmartArt/DataHierarchy" xmlns:b="http://schemas.openxmlformats.org/officeDocument/2006/bibliography" xmlns:msink="http://schemas.microsoft.com/ink/2010/main" xmlns:cdr14="http://schemas.microsoft.com/office/drawing/2010/chartDrawing" xmlns:c15="http://schemas.microsoft.com/office/drawing/2012/chart" xmlns:cs="http://schemas.microsoft.com/office/drawing/2012/chartStyle" xmlns:ns43="http://www.w3.org/1998/Math/MathML" xmlns:ns44="http://www.w3.org/2003/InkML" xmlns:a13cmd="http://schemas.microsoft.com/office/drawing/2013/main/command" xmlns:cx="http://schemas.microsoft.com/office/drawing/2014/chartex" xmlns:c16="http://schemas.microsoft.com/office/drawing/2014/chart" xmlns:dgm1611="http://schemas.microsoft.com/office/drawing/2016/11/diagram" xmlns:c16r3="http://schemas.microsoft.com/office/drawing/2017/03/chart" xmlns:am3d="http://schemas.microsoft.com/office/drawing/2017/model3d" xmlns:an18="http://schemas.microsoft.com/office/drawing/2018/animation" xmlns:anam3d="http://schemas.microsoft.com/office/drawing/2018/animation/model3d" xmlns:iact="http://schemas.microsoft.com/office/powerpoint/2014/inkAction" xmlns:thm15="http://schemas.microsoft.com/office/thememl/2012/main" xmlns:wps="http://schemas.microsoft.com/office/word/2010/wordprocessingShape" xmlns:wpc="http://schemas.microsoft.com/office/word/2010/wordprocessingCanvas" xmlns:wpg="http://schemas.microsoft.com/office/word/2010/wordprocessingGroup" xmlns:w16="http://schemas.microsoft.com/office/word/2018/wordml" xmlns:w16cex="http://schemas.microsoft.com/office/word/2018/wordml/cex" xmlns:cei="http://schemas.microsoft.com/office/word/2026/wordml/cei" xmlns:wetp="http://schemas.microsoft.com/office/webextensions/taskpanes/2010/11" xmlns:we="http://schemas.microsoft.com/office/webextensions/webextension/2010/11" xmlns:comp="http://schemas.openxmlformats.org/drawingml/2006/compatibility" xmlns:lc="http://schemas.openxmlformats.org/drawingml/2006/lockedCanvas" xmlns:dgm14="http://schemas.microsoft.com/office/drawing/2010/diagram" xmlns:a15="http://schemas.microsoft.com/office/drawing/2012/main" xmlns:pic14="http://schemas.microsoft.com/office/drawing/2010/picture" xmlns:c16ac="http://schemas.microsoft.com/office/drawing/2014/chart/ac" xmlns:a16="http://schemas.microsoft.com/office/drawing/2014/main" xmlns:a1611="http://schemas.microsoft.com/office/drawing/2016/11/main" xmlns:dgm1612="http://schemas.microsoft.com/office/drawing/2016/12/diagram" xmlns:a16svg="http://schemas.microsoft.com/office/drawing/2016/SVG/main" xmlns:adec="http://schemas.microsoft.com/office/drawing/2017/decorative" xmlns:a18hc="http://schemas.microsoft.com/office/drawing/2018/hyperlinkcolor" xmlns:wp15="http://schemas.microsoft.com/office/word/2012/wordprocessingDrawing" mc:Ignorable="w14 w15 w16se w16cid w16 w16cex w16sdtdh w16sdtfl w16du wp14">
   <w:body>
-    <!-- Modified by docx4j 17.3.4 (Apache licensed) using REFERENCE JAXB in Arch Linux Java 21.0.12 on Linux -->
+    <!-- Modified by docx4j 17.3.5-SNAPSHOT (Apache licensed) using REFERENCE JAXB in Arch Linux Java 21.0.12 on Linux -->
     <w:p>
       <w:pPr>
         <w:pStyle w:val="Title"/>
@@ -6903,6 +6903,23 @@
           <w:ilvl w:val="0"/>
           <w:numId w:val="1"/>
         </w:numPr>
+        <w:rPr>
+          <w:ins w:author="Claude Fable 5.1" w:date="2026-10-29T06:19:50Z" w:id="9197"/>
+        </w:rPr>
+      </w:pPr>
+      <w:ins w:author="Claude Fable 5.1" w:date="2026-10-29T06:19:50Z" w:id="9195">
+        <w:r>
+          <w:t>Update fields as Word's F9 does: dates, document properties, REF and SEQ, formulas and IF, an INDEX from its XE marks</w:t>
+        </w:r>
+      </w:ins>
+    </w:p>
+    <w:p>
+      <w:pPr>
+        <w:pStyle w:val="ListParagraph"/>
+        <w:numPr>
+          <w:ilvl w:val="0"/>
+          <w:numId w:val="1"/>
+        </w:numPr>
       </w:pPr>
       <w:r>
         <w:t>Apply transforms, including common filters</w:t>
@@ -35030,6 +35047,999 @@
       <w:pPr>
         <w:pStyle w:val="Heading1"/>
         <w:rPr>
+          <w:ins w:author="Claude Fable 5.1" w:date="2026-10-29T06:19:50Z" w:id="9001"/>
+        </w:rPr>
+      </w:pPr>
+      <w:ins w:author="Claude Fable 5.1" w:date="2026-10-29T06:19:50Z" w:id="9000">
+        <w:r>
+          <w:t>Fields</w:t>
+        </w:r>
+      </w:ins>
+    </w:p>
+    <w:p>
+      <w:pPr>
+        <w:rPr>
+          <w:ins w:author="Claude Fable 5.1" w:date="2026-10-29T06:19:50Z" w:id="9011"/>
+        </w:rPr>
+      </w:pPr>
+      <w:ins w:author="Claude Fable 5.1" w:date="2026-10-29T06:19:50Z" w:id="9002">
+        <w:r>
+          <w:t xml:space="preserve">A Word field is an instruction and a cached result: </w:t>
+        </w:r>
+      </w:ins>
+      <w:ins w:author="Claude Fable 5.1" w:date="2026-10-29T06:19:50Z" w:id="9003">
+        <w:r>
+          <w:rPr>
+            <w:rFonts w:ascii="Consolas" w:hAnsi="Consolas"/>
+          </w:rPr>
+          <w:t>DATE \@ "d MMMM yyyy"</w:t>
+        </w:r>
+      </w:ins>
+      <w:ins w:author="Claude Fable 5.1" w:date="2026-10-29T06:19:50Z" w:id="9004">
+        <w:r>
+          <w:t xml:space="preserve"> and the text Word last computed for it.  Word stores most fields in the complex form (a run holding a </w:t>
+        </w:r>
+      </w:ins>
+      <w:ins w:author="Claude Fable 5.1" w:date="2026-10-29T06:19:50Z" w:id="9005">
+        <w:r>
+          <w:rPr>
+            <w:rFonts w:ascii="Consolas" w:hAnsi="Consolas"/>
+          </w:rPr>
+          <w:t>w:fldChar</w:t>
+        </w:r>
+      </w:ins>
+      <w:ins w:author="Claude Fable 5.1" w:date="2026-10-29T06:19:50Z" w:id="9006">
+        <w:r>
+          <w:t xml:space="preserve"> begin, the instruction in </w:t>
+        </w:r>
+      </w:ins>
+      <w:ins w:author="Claude Fable 5.1" w:date="2026-10-29T06:19:50Z" w:id="9007">
+        <w:r>
+          <w:rPr>
+            <w:rFonts w:ascii="Consolas" w:hAnsi="Consolas"/>
+          </w:rPr>
+          <w:t>w:instrText</w:t>
+        </w:r>
+      </w:ins>
+      <w:ins w:author="Claude Fable 5.1" w:date="2026-10-29T06:19:50Z" w:id="9008">
+        <w:r>
+          <w:t xml:space="preserve"> runs, a separate, the result runs, and an end) and a few in the simple form (a </w:t>
+        </w:r>
+      </w:ins>
+      <w:ins w:author="Claude Fable 5.1" w:date="2026-10-29T06:19:50Z" w:id="9009">
+        <w:r>
+          <w:rPr>
+            <w:rFonts w:ascii="Consolas" w:hAnsi="Consolas"/>
+          </w:rPr>
+          <w:t>w:fldSimple</w:t>
+        </w:r>
+      </w:ins>
+      <w:ins w:author="Claude Fable 5.1" w:date="2026-10-29T06:19:50Z" w:id="9010">
+        <w:r>
+          <w:t xml:space="preserve"> element holding the result).  Word shows the cached result until something updates the field: F9, printing, or, for a few fields such as PAGE and LISTNUM, every time it lays the document out.</w:t>
+        </w:r>
+      </w:ins>
+    </w:p>
+    <w:p>
+      <w:pPr>
+        <w:rPr>
+          <w:ins w:author="Claude Fable 5.1" w:date="2026-10-29T06:19:50Z" w:id="9023"/>
+        </w:rPr>
+      </w:pPr>
+      <w:ins w:author="Claude Fable 5.1" w:date="2026-10-29T06:19:50Z" w:id="9012">
+        <w:r>
+          <w:t xml:space="preserve">docx4j evaluates fields in one place, </w:t>
+        </w:r>
+      </w:ins>
+      <w:ins w:author="Claude Fable 5.1" w:date="2026-10-29T06:19:50Z" w:id="9013">
+        <w:r>
+          <w:rPr>
+            <w:rFonts w:ascii="Consolas" w:hAnsi="Consolas"/>
+          </w:rPr>
+          <w:t>org.docx4j.model.fields.FieldEvaluators</w:t>
+        </w:r>
+      </w:ins>
+      <w:ins w:author="Claude Fable 5.1" w:date="2026-10-29T06:19:50Z" w:id="9014">
+        <w:r>
+          <w:t xml:space="preserve">, a registry by field name over </w:t>
+        </w:r>
+      </w:ins>
+      <w:ins w:author="Claude Fable 5.1" w:date="2026-10-29T06:19:50Z" w:id="9015">
+        <w:r>
+          <w:rPr>
+            <w:rFonts w:ascii="Consolas" w:hAnsi="Consolas"/>
+          </w:rPr>
+          <w:t>FieldInstruction</w:t>
+        </w:r>
+      </w:ins>
+      <w:ins w:author="Claude Fable 5.1" w:date="2026-10-29T06:19:50Z" w:id="9016">
+        <w:r>
+          <w:t xml:space="preserve"> (the parsed instruction) and </w:t>
+        </w:r>
+      </w:ins>
+      <w:ins w:author="Claude Fable 5.1" w:date="2026-10-29T06:19:50Z" w:id="9017">
+        <w:r>
+          <w:rPr>
+            <w:rFonts w:ascii="Consolas" w:hAnsi="Consolas"/>
+          </w:rPr>
+          <w:t>FieldContext</w:t>
+        </w:r>
+      </w:ins>
+      <w:ins w:author="Claude Fable 5.1" w:date="2026-10-29T06:19:50Z" w:id="9018">
+        <w:r>
+          <w:t xml:space="preserve"> (what an evaluator may ask about).  Three consumers share it: </w:t>
+        </w:r>
+      </w:ins>
+      <w:ins w:author="Claude Fable 5.1" w:date="2026-10-29T06:19:50Z" w:id="9019">
+        <w:r>
+          <w:rPr>
+            <w:rFonts w:ascii="Consolas" w:hAnsi="Consolas"/>
+          </w:rPr>
+          <w:t>FieldUpdater</w:t>
+        </w:r>
+      </w:ins>
+      <w:ins w:author="Claude Fable 5.1" w:date="2026-10-29T06:19:50Z" w:id="9020">
+        <w:r>
+          <w:t xml:space="preserve">, which writes results into the document as Word's update does; the text extraction under </w:t>
+        </w:r>
+      </w:ins>
+      <w:ins w:author="Claude Fable 5.1" w:date="2026-10-29T06:19:50Z" w:id="9021">
+        <w:r>
+          <w:rPr>
+            <w:rFonts w:ascii="Consolas" w:hAnsi="Consolas"/>
+          </w:rPr>
+          <w:t>fields: update</w:t>
+        </w:r>
+      </w:ins>
+      <w:ins w:author="Claude Fable 5.1" w:date="2026-10-29T06:19:50Z" w:id="9022">
+        <w:r>
+          <w:t>; and the PDF and HTML writers.  Each field's behaviour was measured against Word 365 before it was built (CR-067 in docs/developer/change-requests), so a result matches what F9 writes, down to the default formats and the error texts.</w:t>
+        </w:r>
+      </w:ins>
+    </w:p>
+    <w:p>
+      <w:pPr>
+        <w:pStyle w:val="Heading2"/>
+        <w:rPr>
+          <w:ins w:author="Claude Fable 5.1" w:date="2026-10-29T06:19:50Z" w:id="9025"/>
+        </w:rPr>
+      </w:pPr>
+      <w:ins w:author="Claude Fable 5.1" w:date="2026-10-29T06:19:50Z" w:id="9024">
+        <w:r>
+          <w:t>Updating fields: FieldUpdater</w:t>
+        </w:r>
+      </w:ins>
+    </w:p>
+    <w:p>
+      <w:pPr>
+        <w:rPr>
+          <w:ins w:author="Claude Fable 5.1" w:date="2026-10-29T06:19:50Z" w:id="9028"/>
+          <w:rFonts w:ascii="Consolas" w:hAnsi="Consolas"/>
+          <w:sz w:val="16"/>
+          <w:szCs w:val="16"/>
+        </w:rPr>
+      </w:pPr>
+      <w:ins w:author="Claude Fable 5.1" w:date="2026-10-29T06:19:50Z" w:id="9026">
+        <w:r>
+          <w:rPr>
+            <w:rFonts w:ascii="Consolas" w:hAnsi="Consolas"/>
+            <w:sz w:val="16"/>
+            <w:szCs w:val="16"/>
+          </w:rPr>
+          <w:tab/>
+        </w:r>
+      </w:ins>
+      <w:ins w:author="Claude Fable 5.1" w:date="2026-10-29T06:19:50Z" w:id="9027">
+        <w:r>
+          <w:rPr>
+            <w:rFonts w:ascii="Consolas" w:hAnsi="Consolas"/>
+            <w:sz w:val="16"/>
+            <w:szCs w:val="16"/>
+          </w:rPr>
+          <w:t>	FieldUpdater updater = new FieldUpdater(wordMLPackage);</w:t>
+        </w:r>
+      </w:ins>
+    </w:p>
+    <w:p>
+      <w:pPr>
+        <w:rPr>
+          <w:ins w:author="Claude Fable 5.1" w:date="2026-10-29T06:19:50Z" w:id="9031"/>
+          <w:rFonts w:ascii="Consolas" w:hAnsi="Consolas"/>
+          <w:sz w:val="16"/>
+          <w:szCs w:val="16"/>
+        </w:rPr>
+      </w:pPr>
+      <w:ins w:author="Claude Fable 5.1" w:date="2026-10-29T06:19:50Z" w:id="9029">
+        <w:r>
+          <w:rPr>
+            <w:rFonts w:ascii="Consolas" w:hAnsi="Consolas"/>
+            <w:sz w:val="16"/>
+            <w:szCs w:val="16"/>
+          </w:rPr>
+          <w:tab/>
+        </w:r>
+      </w:ins>
+      <w:ins w:author="Claude Fable 5.1" w:date="2026-10-29T06:19:50Z" w:id="9030">
+        <w:r>
+          <w:rPr>
+            <w:rFonts w:ascii="Consolas" w:hAnsi="Consolas"/>
+            <w:sz w:val="16"/>
+            <w:szCs w:val="16"/>
+          </w:rPr>
+          <w:t>	updater.update(true); // headers and footers too</w:t>
+        </w:r>
+      </w:ins>
+    </w:p>
+    <w:p>
+      <w:pPr>
+        <w:rPr>
+          <w:ins w:author="Claude Fable 5.1" w:date="2026-10-29T06:19:50Z" w:id="9037"/>
+        </w:rPr>
+      </w:pPr>
+      <w:ins w:author="Claude Fable 5.1" w:date="2026-10-29T06:19:50Z" w:id="9032">
+        <w:r>
+          <w:t>updates every field the registry knows, in every part, as Word's update-all (Ctrl+A, F9) does.  A locked field (</w:t>
+        </w:r>
+      </w:ins>
+      <w:ins w:author="Claude Fable 5.1" w:date="2026-10-29T06:19:50Z" w:id="9033">
+        <w:r>
+          <w:rPr>
+            <w:rFonts w:ascii="Consolas" w:hAnsi="Consolas"/>
+          </w:rPr>
+          <w:t>w:fldLock</w:t>
+        </w:r>
+      </w:ins>
+      <w:ins w:author="Claude Fable 5.1" w:date="2026-10-29T06:19:50Z" w:id="9034">
+        <w:r>
+          <w:t xml:space="preserve">) is left alone, and a field whose input docx4j does not have (a FILENAME with no name supplied) keeps its cached result rather than being given a wrong one.  </w:t>
+        </w:r>
+      </w:ins>
+      <w:ins w:author="Claude Fable 5.1" w:date="2026-10-29T06:19:50Z" w:id="9035">
+        <w:r>
+          <w:rPr>
+            <w:rFonts w:ascii="Consolas" w:hAnsi="Consolas"/>
+          </w:rPr>
+          <w:t>updater.only(Set.of("DATE", "DOCPROPERTY"))</w:t>
+        </w:r>
+      </w:ins>
+      <w:ins w:author="Claude Fable 5.1" w:date="2026-10-29T06:19:50Z" w:id="9036">
+        <w:r>
+          <w:t xml:space="preserve"> narrows the set.</w:t>
+        </w:r>
+      </w:ins>
+    </w:p>
+    <w:p>
+      <w:pPr>
+        <w:rPr>
+          <w:ins w:author="Claude Fable 5.1" w:date="2026-10-29T06:19:50Z" w:id="9039"/>
+        </w:rPr>
+      </w:pPr>
+      <w:ins w:author="Claude Fable 5.1" w:date="2026-10-29T06:19:50Z" w:id="9038">
+        <w:r>
+          <w:t>The fields updated:</w:t>
+        </w:r>
+      </w:ins>
+    </w:p>
+    <w:p>
+      <w:pPr>
+        <w:pStyle w:val="ListParagraph"/>
+        <w:numPr>
+          <w:ilvl w:val="0"/>
+          <w:numId w:val="50"/>
+        </w:numPr>
+        <w:contextualSpacing w:val="true"/>
+        <w:rPr>
+          <w:ins w:author="Claude Fable 5.1" w:date="2026-10-29T06:19:50Z" w:id="9043"/>
+        </w:rPr>
+      </w:pPr>
+      <w:ins w:author="Claude Fable 5.1" w:date="2026-10-29T06:19:50Z" w:id="9040">
+        <w:r>
+          <w:t xml:space="preserve">Dates: DATE and TIME (the clock), CREATEDATE, SAVEDATE and PRINTDATE (the core properties), with Word's </w:t>
+        </w:r>
+      </w:ins>
+      <w:ins w:author="Claude Fable 5.1" w:date="2026-10-29T06:19:50Z" w:id="9041">
+        <w:r>
+          <w:rPr>
+            <w:rFonts w:ascii="Consolas" w:hAnsi="Consolas"/>
+          </w:rPr>
+          <w:t>\@</w:t>
+        </w:r>
+      </w:ins>
+      <w:ins w:author="Claude Fable 5.1" w:date="2026-10-29T06:19:50Z" w:id="9042">
+        <w:r>
+          <w:t xml:space="preserve"> formats and its default format for the document's language.</w:t>
+        </w:r>
+      </w:ins>
+    </w:p>
+    <w:p>
+      <w:pPr>
+        <w:pStyle w:val="ListParagraph"/>
+        <w:numPr>
+          <w:ilvl w:val="0"/>
+          <w:numId w:val="50"/>
+        </w:numPr>
+        <w:contextualSpacing w:val="true"/>
+        <w:rPr>
+          <w:ins w:author="Claude Fable 5.1" w:date="2026-10-29T06:19:50Z" w:id="9045"/>
+        </w:rPr>
+      </w:pPr>
+      <w:ins w:author="Claude Fable 5.1" w:date="2026-10-29T06:19:50Z" w:id="9044">
+        <w:r>
+          <w:t>Document information: DOCPROPERTY, DOCVARIABLE, AUTHOR, TITLE, SUBJECT, COMMENTS, KEYWORDS, LASTSAVEDBY, INFO, TEMPLATE, REVNUM, NUMWORDS, NUMCHARS, FILENAME and FILESIZE.</w:t>
+        </w:r>
+      </w:ins>
+    </w:p>
+    <w:p>
+      <w:pPr>
+        <w:pStyle w:val="ListParagraph"/>
+        <w:numPr>
+          <w:ilvl w:val="0"/>
+          <w:numId w:val="50"/>
+        </w:numPr>
+        <w:contextualSpacing w:val="true"/>
+        <w:rPr>
+          <w:ins w:author="Claude Fable 5.1" w:date="2026-10-29T06:19:50Z" w:id="9047"/>
+        </w:rPr>
+      </w:pPr>
+      <w:ins w:author="Claude Fable 5.1" w:date="2026-10-29T06:19:50Z" w:id="9046">
+        <w:r>
+          <w:t>References: REF (a bookmark's text, with its formatting), NOTEREF, QUOTE, SEQ, SECTION, and SET (which defines its bookmark).</w:t>
+        </w:r>
+      </w:ins>
+    </w:p>
+    <w:p>
+      <w:pPr>
+        <w:pStyle w:val="ListParagraph"/>
+        <w:numPr>
+          <w:ilvl w:val="0"/>
+          <w:numId w:val="50"/>
+        </w:numPr>
+        <w:contextualSpacing w:val="true"/>
+        <w:rPr>
+          <w:ins w:author="Claude Fable 5.1" w:date="2026-10-29T06:19:50Z" w:id="9049"/>
+        </w:rPr>
+      </w:pPr>
+      <w:ins w:author="Claude Fable 5.1" w:date="2026-10-29T06:19:50Z" w:id="9048">
+        <w:r>
+          <w:t>The user: USERNAME, USERINITIALS and USERADDRESS.</w:t>
+        </w:r>
+      </w:ins>
+    </w:p>
+    <w:p>
+      <w:pPr>
+        <w:pStyle w:val="ListParagraph"/>
+        <w:numPr>
+          <w:ilvl w:val="0"/>
+          <w:numId w:val="50"/>
+        </w:numPr>
+        <w:contextualSpacing w:val="true"/>
+        <w:rPr>
+          <w:ins w:author="Claude Fable 5.1" w:date="2026-10-29T06:19:50Z" w:id="9055"/>
+        </w:rPr>
+      </w:pPr>
+      <w:ins w:author="Claude Fable 5.1" w:date="2026-10-29T06:19:50Z" w:id="9050">
+        <w:r>
+          <w:t xml:space="preserve">Expressions: </w:t>
+        </w:r>
+      </w:ins>
+      <w:ins w:author="Claude Fable 5.1" w:date="2026-10-29T06:19:50Z" w:id="9051">
+        <w:r>
+          <w:rPr>
+            <w:rFonts w:ascii="Consolas" w:hAnsi="Consolas"/>
+          </w:rPr>
+          <w:t>=</w:t>
+        </w:r>
+      </w:ins>
+      <w:ins w:author="Claude Fable 5.1" w:date="2026-10-29T06:19:50Z" w:id="9052">
+        <w:r>
+          <w:t xml:space="preserve"> formulas (the operators; SUM, AVERAGE, MIN, MAX, COUNT, ABS, INT, MOD, ROUND, PRODUCT, AND, OR, NOT, DEFINED, TRUE and FALSE; table cell and bookmark references; </w:t>
+        </w:r>
+      </w:ins>
+      <w:ins w:author="Claude Fable 5.1" w:date="2026-10-29T06:19:50Z" w:id="9053">
+        <w:r>
+          <w:rPr>
+            <w:rFonts w:ascii="Consolas" w:hAnsi="Consolas"/>
+          </w:rPr>
+          <w:t>\#</w:t>
+        </w:r>
+      </w:ins>
+      <w:ins w:author="Claude Fable 5.1" w:date="2026-10-29T06:19:50Z" w:id="9054">
+        <w:r>
+          <w:t xml:space="preserve"> formats; Word's error texts), IF and COMPARE (with wildcards), and fields nested in them, evaluated inside out.</w:t>
+        </w:r>
+      </w:ins>
+    </w:p>
+    <w:p>
+      <w:pPr>
+        <w:pStyle w:val="ListParagraph"/>
+        <w:numPr>
+          <w:ilvl w:val="0"/>
+          <w:numId w:val="50"/>
+        </w:numPr>
+        <w:contextualSpacing w:val="true"/>
+        <w:rPr>
+          <w:ins w:author="Claude Fable 5.1" w:date="2026-10-29T06:19:50Z" w:id="9057"/>
+        </w:rPr>
+      </w:pPr>
+      <w:ins w:author="Claude Fable 5.1" w:date="2026-10-29T06:19:50Z" w:id="9056">
+        <w:r>
+          <w:t>Numbering and symbols: LISTNUM, AUTONUM, AUTONUMLGL and AUTONUMOUT (the numbers Word paints and never stores) and SYMBOL.</w:t>
+        </w:r>
+      </w:ins>
+    </w:p>
+    <w:p>
+      <w:pPr>
+        <w:pStyle w:val="ListParagraph"/>
+        <w:numPr>
+          <w:ilvl w:val="0"/>
+          <w:numId w:val="50"/>
+        </w:numPr>
+        <w:contextualSpacing w:val="true"/>
+        <w:rPr>
+          <w:ins w:author="Claude Fable 5.1" w:date="2026-10-29T06:19:50Z" w:id="9059"/>
+        </w:rPr>
+      </w:pPr>
+      <w:ins w:author="Claude Fable 5.1" w:date="2026-10-29T06:19:50Z" w:id="9058">
+        <w:r>
+          <w:t>INDEX, regenerated from the document's XE marks (below).</w:t>
+        </w:r>
+      </w:ins>
+    </w:p>
+    <w:p>
+      <w:pPr>
+        <w:pStyle w:val="ListParagraph"/>
+        <w:numPr>
+          <w:ilvl w:val="0"/>
+          <w:numId w:val="50"/>
+        </w:numPr>
+        <w:contextualSpacing w:val="true"/>
+        <w:rPr>
+          <w:ins w:author="Claude Fable 5.1" w:date="2026-10-29T06:19:50Z" w:id="9061"/>
+        </w:rPr>
+      </w:pPr>
+      <w:ins w:author="Claude Fable 5.1" w:date="2026-10-29T06:19:50Z" w:id="9060">
+        <w:r>
+          <w:t>The mail merge fields, in the mergers (the Mailmerge chapter).</w:t>
+        </w:r>
+      </w:ins>
+    </w:p>
+    <w:p>
+      <w:pPr>
+        <w:rPr>
+          <w:ins w:author="Claude Fable 5.1" w:date="2026-10-29T06:19:50Z" w:id="9065"/>
+        </w:rPr>
+      </w:pPr>
+      <w:ins w:author="Claude Fable 5.1" w:date="2026-10-29T06:19:50Z" w:id="9062">
+        <w:r>
+          <w:t>Not evaluated, so the cached result is kept: the layout fields PAGE, NUMPAGES, SECTIONPAGES, PAGEREF and STYLEREF (the PDF and HTML writers compute those as they lay the pages out, and TocGenerator updates a TOC's page numbers); the fields that fetch content, INCLUDETEXT, INCLUDEPICTURE, LINK and DATABASE, unless you supply a resolver (</w:t>
+        </w:r>
+      </w:ins>
+      <w:ins w:author="Claude Fable 5.1" w:date="2026-10-29T06:19:50Z" w:id="9063">
+        <w:r>
+          <w:rPr>
+            <w:rFonts w:ascii="Consolas" w:hAnsi="Consolas"/>
+          </w:rPr>
+          <w:t>FieldContext.external</w:t>
+        </w:r>
+      </w:ins>
+      <w:ins w:author="Claude Fable 5.1" w:date="2026-10-29T06:19:50Z" w:id="9064">
+        <w:r>
+          <w:t>); EDITTIME, AUTOTEXT, BIBLIOGRAPHY and CITATION; and a form field's value.</w:t>
+        </w:r>
+      </w:ins>
+    </w:p>
+    <w:p>
+      <w:pPr>
+        <w:pStyle w:val="Heading2"/>
+        <w:rPr>
+          <w:ins w:author="Claude Fable 5.1" w:date="2026-10-29T06:19:50Z" w:id="9067"/>
+        </w:rPr>
+      </w:pPr>
+      <w:ins w:author="Claude Fable 5.1" w:date="2026-10-29T06:19:50Z" w:id="9066">
+        <w:r>
+          <w:t>What the evaluator reads: FieldContext</w:t>
+        </w:r>
+      </w:ins>
+    </w:p>
+    <w:p>
+      <w:pPr>
+        <w:rPr>
+          <w:ins w:author="Claude Fable 5.1" w:date="2026-10-29T06:19:50Z" w:id="9070"/>
+        </w:rPr>
+      </w:pPr>
+      <w:ins w:author="Claude Fable 5.1" w:date="2026-10-29T06:19:50Z" w:id="9068">
+        <w:r>
+          <w:rPr>
+            <w:rFonts w:ascii="Consolas" w:hAnsi="Consolas"/>
+          </w:rPr>
+          <w:t>updater.getContext()</w:t>
+        </w:r>
+      </w:ins>
+      <w:ins w:author="Claude Fable 5.1" w:date="2026-10-29T06:19:50Z" w:id="9069">
+        <w:r>
+          <w:t xml:space="preserve"> is the context.  What the package itself gives (its properties, bookmarks, language, notes) is the default; the rest you supply:</w:t>
+        </w:r>
+      </w:ins>
+    </w:p>
+    <w:p>
+      <w:pPr>
+        <w:rPr>
+          <w:ins w:author="Claude Fable 5.1" w:date="2026-10-29T06:19:50Z" w:id="9073"/>
+          <w:rFonts w:ascii="Consolas" w:hAnsi="Consolas"/>
+          <w:sz w:val="16"/>
+          <w:szCs w:val="16"/>
+        </w:rPr>
+      </w:pPr>
+      <w:ins w:author="Claude Fable 5.1" w:date="2026-10-29T06:19:50Z" w:id="9071">
+        <w:r>
+          <w:rPr>
+            <w:rFonts w:ascii="Consolas" w:hAnsi="Consolas"/>
+            <w:sz w:val="16"/>
+            <w:szCs w:val="16"/>
+          </w:rPr>
+          <w:tab/>
+        </w:r>
+      </w:ins>
+      <w:ins w:author="Claude Fable 5.1" w:date="2026-10-29T06:19:50Z" w:id="9072">
+        <w:r>
+          <w:rPr>
+            <w:rFonts w:ascii="Consolas" w:hAnsi="Consolas"/>
+            <w:sz w:val="16"/>
+            <w:szCs w:val="16"/>
+          </w:rPr>
+          <w:t>	updater.getContext()</w:t>
+        </w:r>
+      </w:ins>
+    </w:p>
+    <w:p>
+      <w:pPr>
+        <w:rPr>
+          <w:ins w:author="Claude Fable 5.1" w:date="2026-10-29T06:19:50Z" w:id="9076"/>
+          <w:rFonts w:ascii="Consolas" w:hAnsi="Consolas"/>
+          <w:sz w:val="16"/>
+          <w:szCs w:val="16"/>
+        </w:rPr>
+      </w:pPr>
+      <w:ins w:author="Claude Fable 5.1" w:date="2026-10-29T06:19:50Z" w:id="9074">
+        <w:r>
+          <w:rPr>
+            <w:rFonts w:ascii="Consolas" w:hAnsi="Consolas"/>
+            <w:sz w:val="16"/>
+            <w:szCs w:val="16"/>
+          </w:rPr>
+          <w:tab/>
+        </w:r>
+      </w:ins>
+      <w:ins w:author="Claude Fable 5.1" w:date="2026-10-29T06:19:50Z" w:id="9075">
+        <w:r>
+          <w:rPr>
+            <w:rFonts w:ascii="Consolas" w:hAnsi="Consolas"/>
+            <w:sz w:val="16"/>
+            <w:szCs w:val="16"/>
+          </w:rPr>
+          <w:t>		.clock(() -&gt; new Date())                  // DATE, TIME</w:t>
+        </w:r>
+      </w:ins>
+    </w:p>
+    <w:p>
+      <w:pPr>
+        <w:rPr>
+          <w:ins w:author="Claude Fable 5.1" w:date="2026-10-29T06:19:50Z" w:id="9079"/>
+          <w:rFonts w:ascii="Consolas" w:hAnsi="Consolas"/>
+          <w:sz w:val="16"/>
+          <w:szCs w:val="16"/>
+        </w:rPr>
+      </w:pPr>
+      <w:ins w:author="Claude Fable 5.1" w:date="2026-10-29T06:19:50Z" w:id="9077">
+        <w:r>
+          <w:rPr>
+            <w:rFonts w:ascii="Consolas" w:hAnsi="Consolas"/>
+            <w:sz w:val="16"/>
+            <w:szCs w:val="16"/>
+          </w:rPr>
+          <w:tab/>
+        </w:r>
+      </w:ins>
+      <w:ins w:author="Claude Fable 5.1" w:date="2026-10-29T06:19:50Z" w:id="9078">
+        <w:r>
+          <w:rPr>
+            <w:rFonts w:ascii="Consolas" w:hAnsi="Consolas"/>
+            <w:sz w:val="16"/>
+            <w:szCs w:val="16"/>
+          </w:rPr>
+          <w:t>		.zone(ZoneId.of("Australia/Sydney"))      // the zone dates are shown in</w:t>
+        </w:r>
+      </w:ins>
+    </w:p>
+    <w:p>
+      <w:pPr>
+        <w:rPr>
+          <w:ins w:author="Claude Fable 5.1" w:date="2026-10-29T06:19:50Z" w:id="9082"/>
+          <w:rFonts w:ascii="Consolas" w:hAnsi="Consolas"/>
+          <w:sz w:val="16"/>
+          <w:szCs w:val="16"/>
+        </w:rPr>
+      </w:pPr>
+      <w:ins w:author="Claude Fable 5.1" w:date="2026-10-29T06:19:50Z" w:id="9080">
+        <w:r>
+          <w:rPr>
+            <w:rFonts w:ascii="Consolas" w:hAnsi="Consolas"/>
+            <w:sz w:val="16"/>
+            <w:szCs w:val="16"/>
+          </w:rPr>
+          <w:tab/>
+        </w:r>
+      </w:ins>
+      <w:ins w:author="Claude Fable 5.1" w:date="2026-10-29T06:19:50Z" w:id="9081">
+        <w:r>
+          <w:rPr>
+            <w:rFonts w:ascii="Consolas" w:hAnsi="Consolas"/>
+            <w:sz w:val="16"/>
+            <w:szCs w:val="16"/>
+          </w:rPr>
+          <w:t>		.user("Jane Citizen", "JC", "1 Main St")  // USERNAME, USERINITIALS, USERADDRESS</w:t>
+        </w:r>
+      </w:ins>
+    </w:p>
+    <w:p>
+      <w:pPr>
+        <w:rPr>
+          <w:ins w:author="Claude Fable 5.1" w:date="2026-10-29T06:19:50Z" w:id="9085"/>
+          <w:rFonts w:ascii="Consolas" w:hAnsi="Consolas"/>
+          <w:sz w:val="16"/>
+          <w:szCs w:val="16"/>
+        </w:rPr>
+      </w:pPr>
+      <w:ins w:author="Claude Fable 5.1" w:date="2026-10-29T06:19:50Z" w:id="9083">
+        <w:r>
+          <w:rPr>
+            <w:rFonts w:ascii="Consolas" w:hAnsi="Consolas"/>
+            <w:sz w:val="16"/>
+            <w:szCs w:val="16"/>
+          </w:rPr>
+          <w:tab/>
+        </w:r>
+      </w:ins>
+      <w:ins w:author="Claude Fable 5.1" w:date="2026-10-29T06:19:50Z" w:id="9084">
+        <w:r>
+          <w:rPr>
+            <w:rFonts w:ascii="Consolas" w:hAnsi="Consolas"/>
+            <w:sz w:val="16"/>
+            <w:szCs w:val="16"/>
+          </w:rPr>
+          <w:t>		.fileName("C:\\docs\\report.docx")        // FILENAME (\p gives the path)</w:t>
+        </w:r>
+      </w:ins>
+    </w:p>
+    <w:p>
+      <w:pPr>
+        <w:rPr>
+          <w:ins w:author="Claude Fable 5.1" w:date="2026-10-29T06:19:50Z" w:id="9088"/>
+          <w:rFonts w:ascii="Consolas" w:hAnsi="Consolas"/>
+          <w:sz w:val="16"/>
+          <w:szCs w:val="16"/>
+        </w:rPr>
+      </w:pPr>
+      <w:ins w:author="Claude Fable 5.1" w:date="2026-10-29T06:19:50Z" w:id="9086">
+        <w:r>
+          <w:rPr>
+            <w:rFonts w:ascii="Consolas" w:hAnsi="Consolas"/>
+            <w:sz w:val="16"/>
+            <w:szCs w:val="16"/>
+          </w:rPr>
+          <w:tab/>
+        </w:r>
+      </w:ins>
+      <w:ins w:author="Claude Fable 5.1" w:date="2026-10-29T06:19:50Z" w:id="9087">
+        <w:r>
+          <w:rPr>
+            <w:rFonts w:ascii="Consolas" w:hAnsi="Consolas"/>
+            <w:sz w:val="16"/>
+            <w:szCs w:val="16"/>
+          </w:rPr>
+          <w:t>		.fileSize(16820L);                        // FILESIZE</w:t>
+        </w:r>
+      </w:ins>
+    </w:p>
+    <w:p>
+      <w:pPr>
+        <w:rPr>
+          <w:ins w:author="Claude Fable 5.1" w:date="2026-10-29T06:19:50Z" w:id="9096"/>
+        </w:rPr>
+      </w:pPr>
+      <w:ins w:author="Claude Fable 5.1" w:date="2026-10-29T06:19:50Z" w:id="9089">
+        <w:r>
+          <w:t xml:space="preserve">Two of these can be set once on the package, and are then seen by every consumer, the text extraction and the writers included: </w:t>
+        </w:r>
+      </w:ins>
+      <w:ins w:author="Claude Fable 5.1" w:date="2026-10-29T06:19:50Z" w:id="9090">
+        <w:r>
+          <w:rPr>
+            <w:rFonts w:ascii="Consolas" w:hAnsi="Consolas"/>
+          </w:rPr>
+          <w:t>wordMLPackage.setDateTimeZone(zone)</w:t>
+        </w:r>
+      </w:ins>
+      <w:ins w:author="Claude Fable 5.1" w:date="2026-10-29T06:19:50Z" w:id="9091">
+        <w:r>
+          <w:t xml:space="preserve">, the client's zone, in which every date the package holds is shown; and </w:t>
+        </w:r>
+      </w:ins>
+      <w:ins w:author="Claude Fable 5.1" w:date="2026-10-29T06:19:50Z" w:id="9092">
+        <w:r>
+          <w:rPr>
+            <w:rFonts w:ascii="Consolas" w:hAnsi="Consolas"/>
+          </w:rPr>
+          <w:t>setSourceName</w:t>
+        </w:r>
+      </w:ins>
+      <w:ins w:author="Claude Fable 5.1" w:date="2026-10-29T06:19:50Z" w:id="9093">
+        <w:r>
+          <w:t xml:space="preserve"> and </w:t>
+        </w:r>
+      </w:ins>
+      <w:ins w:author="Claude Fable 5.1" w:date="2026-10-29T06:19:50Z" w:id="9094">
+        <w:r>
+          <w:rPr>
+            <w:rFonts w:ascii="Consolas" w:hAnsi="Consolas"/>
+          </w:rPr>
+          <w:t>setSourceSize</w:t>
+        </w:r>
+      </w:ins>
+      <w:ins w:author="Claude Fable 5.1" w:date="2026-10-29T06:19:50Z" w:id="9095">
+        <w:r>
+          <w:t>, the file the package came from.  They are request attributes: nothing of them is saved, and a server reusing a loaded package sets them per request.</w:t>
+        </w:r>
+      </w:ins>
+    </w:p>
+    <w:p>
+      <w:pPr>
+        <w:pStyle w:val="Heading2"/>
+        <w:rPr>
+          <w:ins w:author="Claude Fable 5.1" w:date="2026-10-29T06:19:50Z" w:id="9098"/>
+        </w:rPr>
+      </w:pPr>
+      <w:ins w:author="Claude Fable 5.1" w:date="2026-10-29T06:19:50Z" w:id="9097">
+        <w:r>
+          <w:t>Fields in text extraction and in PDF and HTML output</w:t>
+        </w:r>
+      </w:ins>
+    </w:p>
+    <w:p>
+      <w:pPr>
+        <w:rPr>
+          <w:ins w:author="Claude Fable 5.1" w:date="2026-10-29T06:19:50Z" w:id="9102"/>
+        </w:rPr>
+      </w:pPr>
+      <w:ins w:author="Claude Fable 5.1" w:date="2026-10-29T06:19:50Z" w:id="9099">
+        <w:r>
+          <w:t xml:space="preserve">The text extraction (the Text extraction and inspection chapter) reads a field's cached result by default; with </w:t>
+        </w:r>
+      </w:ins>
+      <w:ins w:author="Claude Fable 5.1" w:date="2026-10-29T06:19:50Z" w:id="9100">
+        <w:r>
+          <w:rPr>
+            <w:rFonts w:ascii="Consolas" w:hAnsi="Consolas"/>
+          </w:rPr>
+          <w:t>new TextOptions().fields(TextOptions.Fields.UPDATE)</w:t>
+        </w:r>
+      </w:ins>
+      <w:ins w:author="Claude Fable 5.1" w:date="2026-10-29T06:19:50Z" w:id="9101">
+        <w:r>
+          <w:t xml:space="preserve"> it computes the same fields the updater does, without touching the package.</w:t>
+        </w:r>
+      </w:ins>
+    </w:p>
+    <w:p>
+      <w:pPr>
+        <w:rPr>
+          <w:ins w:author="Claude Fable 5.1" w:date="2026-10-29T06:19:50Z" w:id="9108"/>
+        </w:rPr>
+      </w:pPr>
+      <w:ins w:author="Claude Fable 5.1" w:date="2026-10-29T06:19:50Z" w:id="9103">
+        <w:r>
+          <w:t>The PDF and HTML writers paint what Word paints: the layout fields from the layout; DATE, TIME and PRINTDATE from the clock (</w:t>
+        </w:r>
+      </w:ins>
+      <w:ins w:author="Claude Fable 5.1" w:date="2026-10-29T06:19:50Z" w:id="9104">
+        <w:r>
+          <w:rPr>
+            <w:rFonts w:ascii="Consolas" w:hAnsi="Consolas"/>
+          </w:rPr>
+          <w:t>docx4j.convert.out.fields.dateCachedResult=true</w:t>
+        </w:r>
+      </w:ins>
+      <w:ins w:author="Claude Fable 5.1" w:date="2026-10-29T06:19:50Z" w:id="9105">
+        <w:r>
+          <w:t xml:space="preserve"> paints the stored date instead, which makes a conversion reproducible); DOCPROPERTY as stored, since Word does not update it when it opens a document (</w:t>
+        </w:r>
+      </w:ins>
+      <w:ins w:author="Claude Fable 5.1" w:date="2026-10-29T06:19:50Z" w:id="9106">
+        <w:r>
+          <w:rPr>
+            <w:rFonts w:ascii="Consolas" w:hAnsi="Consolas"/>
+          </w:rPr>
+          <w:t>docx4j.convert.out.fields.docPropertyCachedResult=false</w:t>
+        </w:r>
+      </w:ins>
+      <w:ins w:author="Claude Fable 5.1" w:date="2026-10-29T06:19:50Z" w:id="9107">
+        <w:r>
+          <w:t xml:space="preserve"> evaluates it); LISTNUM, AUTONUM and SYMBOL evaluated, since Word stores nothing for them; and every other field as stored where it has a result, evaluated where it has none.</w:t>
+        </w:r>
+      </w:ins>
+    </w:p>
+    <w:p>
+      <w:pPr>
+        <w:pStyle w:val="Heading2"/>
+        <w:rPr>
+          <w:ins w:author="Claude Fable 5.1" w:date="2026-10-29T06:19:50Z" w:id="9110"/>
+        </w:rPr>
+      </w:pPr>
+      <w:ins w:author="Claude Fable 5.1" w:date="2026-10-29T06:19:50Z" w:id="9109">
+        <w:r>
+          <w:t>Generating an index</w:t>
+        </w:r>
+      </w:ins>
+    </w:p>
+    <w:p>
+      <w:pPr>
+        <w:rPr>
+          <w:ins w:author="Claude Fable 5.1" w:date="2026-10-29T06:19:50Z" w:id="9134"/>
+        </w:rPr>
+      </w:pPr>
+      <w:ins w:author="Claude Fable 5.1" w:date="2026-10-29T06:19:50Z" w:id="9111">
+        <w:r>
+          <w:t>FieldUpdater regenerates each INDEX field in the body from the document's XE marks (</w:t>
+        </w:r>
+      </w:ins>
+      <w:ins w:author="Claude Fable 5.1" w:date="2026-10-29T06:19:50Z" w:id="9112">
+        <w:r>
+          <w:rPr>
+            <w:rFonts w:ascii="Consolas" w:hAnsi="Consolas"/>
+          </w:rPr>
+          <w:t>org.docx4j.model.fields.index.IndexGenerator</w:t>
+        </w:r>
+      </w:ins>
+      <w:ins w:author="Claude Fable 5.1" w:date="2026-10-29T06:19:50Z" w:id="9113">
+        <w:r>
+          <w:t xml:space="preserve">), as Word does: the entries collated in Word's order, sub-entries, cross-references, page ranges from bookmarks, bold and italic page numbers, the </w:t>
+        </w:r>
+      </w:ins>
+      <w:ins w:author="Claude Fable 5.1" w:date="2026-10-29T06:19:50Z" w:id="9114">
+        <w:r>
+          <w:rPr>
+            <w:rFonts w:ascii="Consolas" w:hAnsi="Consolas"/>
+          </w:rPr>
+          <w:t>\e</w:t>
+        </w:r>
+      </w:ins>
+      <w:ins w:author="Claude Fable 5.1" w:date="2026-10-29T06:19:50Z" w:id="9115">
+        <w:r>
+          <w:t xml:space="preserve">, </w:t>
+        </w:r>
+      </w:ins>
+      <w:ins w:author="Claude Fable 5.1" w:date="2026-10-29T06:19:50Z" w:id="9116">
+        <w:r>
+          <w:rPr>
+            <w:rFonts w:ascii="Consolas" w:hAnsi="Consolas"/>
+          </w:rPr>
+          <w:t>\l</w:t>
+        </w:r>
+      </w:ins>
+      <w:ins w:author="Claude Fable 5.1" w:date="2026-10-29T06:19:50Z" w:id="9117">
+        <w:r>
+          <w:t xml:space="preserve">, </w:t>
+        </w:r>
+      </w:ins>
+      <w:ins w:author="Claude Fable 5.1" w:date="2026-10-29T06:19:50Z" w:id="9118">
+        <w:r>
+          <w:rPr>
+            <w:rFonts w:ascii="Consolas" w:hAnsi="Consolas"/>
+          </w:rPr>
+          <w:t>\g</w:t>
+        </w:r>
+      </w:ins>
+      <w:ins w:author="Claude Fable 5.1" w:date="2026-10-29T06:19:50Z" w:id="9119">
+        <w:r>
+          <w:t xml:space="preserve">, </w:t>
+        </w:r>
+      </w:ins>
+      <w:ins w:author="Claude Fable 5.1" w:date="2026-10-29T06:19:50Z" w:id="9120">
+        <w:r>
+          <w:rPr>
+            <w:rFonts w:ascii="Consolas" w:hAnsi="Consolas"/>
+          </w:rPr>
+          <w:t>\k</w:t>
+        </w:r>
+      </w:ins>
+      <w:ins w:author="Claude Fable 5.1" w:date="2026-10-29T06:19:50Z" w:id="9121">
+        <w:r>
+          <w:t xml:space="preserve">, </w:t>
+        </w:r>
+      </w:ins>
+      <w:ins w:author="Claude Fable 5.1" w:date="2026-10-29T06:19:50Z" w:id="9122">
+        <w:r>
+          <w:rPr>
+            <w:rFonts w:ascii="Consolas" w:hAnsi="Consolas"/>
+          </w:rPr>
+          <w:t>\h</w:t>
+        </w:r>
+      </w:ins>
+      <w:ins w:author="Claude Fable 5.1" w:date="2026-10-29T06:19:50Z" w:id="9123">
+        <w:r>
+          <w:t xml:space="preserve">, </w:t>
+        </w:r>
+      </w:ins>
+      <w:ins w:author="Claude Fable 5.1" w:date="2026-10-29T06:19:50Z" w:id="9124">
+        <w:r>
+          <w:rPr>
+            <w:rFonts w:ascii="Consolas" w:hAnsi="Consolas"/>
+          </w:rPr>
+          <w:t>\r</w:t>
+        </w:r>
+      </w:ins>
+      <w:ins w:author="Claude Fable 5.1" w:date="2026-10-29T06:19:50Z" w:id="9125">
+        <w:r>
+          <w:t xml:space="preserve">, </w:t>
+        </w:r>
+      </w:ins>
+      <w:ins w:author="Claude Fable 5.1" w:date="2026-10-29T06:19:50Z" w:id="9126">
+        <w:r>
+          <w:rPr>
+            <w:rFonts w:ascii="Consolas" w:hAnsi="Consolas"/>
+          </w:rPr>
+          <w:t>\p</w:t>
+        </w:r>
+      </w:ins>
+      <w:ins w:author="Claude Fable 5.1" w:date="2026-10-29T06:19:50Z" w:id="9127">
+        <w:r>
+          <w:t xml:space="preserve">, </w:t>
+        </w:r>
+      </w:ins>
+      <w:ins w:author="Claude Fable 5.1" w:date="2026-10-29T06:19:50Z" w:id="9128">
+        <w:r>
+          <w:rPr>
+            <w:rFonts w:ascii="Consolas" w:hAnsi="Consolas"/>
+          </w:rPr>
+          <w:t>\f</w:t>
+        </w:r>
+      </w:ins>
+      <w:ins w:author="Claude Fable 5.1" w:date="2026-10-29T06:19:50Z" w:id="9129">
+        <w:r>
+          <w:t xml:space="preserve"> and </w:t>
+        </w:r>
+      </w:ins>
+      <w:ins w:author="Claude Fable 5.1" w:date="2026-10-29T06:19:50Z" w:id="9130">
+        <w:r>
+          <w:rPr>
+            <w:rFonts w:ascii="Consolas" w:hAnsi="Consolas"/>
+          </w:rPr>
+          <w:t>\c</w:t>
+        </w:r>
+      </w:ins>
+      <w:ins w:author="Claude Fable 5.1" w:date="2026-10-29T06:19:50Z" w:id="9131">
+        <w:r>
+          <w:t xml:space="preserve"> switches, in the Index 1 to Index 3 and Index Heading styles (added to the document where missing).  The page numbers come from docx4j-export-fo laying the document out, as a TOC's do; with no docx4j-export-fo on the classpath, give the updater a pager (</w:t>
+        </w:r>
+      </w:ins>
+      <w:ins w:author="Claude Fable 5.1" w:date="2026-10-29T06:19:50Z" w:id="9132">
+        <w:r>
+          <w:rPr>
+            <w:rFonts w:ascii="Consolas" w:hAnsi="Consolas"/>
+          </w:rPr>
+          <w:t>updater.indexPager(...)</w:t>
+        </w:r>
+      </w:ins>
+      <w:ins w:author="Claude Fable 5.1" w:date="2026-10-29T06:19:50Z" w:id="9133">
+        <w:r>
+          <w:t>), or the INDEX is left as it is.</w:t>
+        </w:r>
+      </w:ins>
+    </w:p>
+    <w:p>
+      <w:pPr>
+        <w:pStyle w:val="Heading1"/>
+        <w:rPr>
           <w:rFonts w:eastAsia="Times New Roman"/>
         </w:rPr>
       </w:pPr>
@@ -35294,9 +36304,16 @@
       </w:r>
     </w:p>
     <w:p>
-      <w:r>
-        <w:t>A table of contents field is just one type of field, amongst many:</w:t>
-      </w:r>
+      <w:del w:author="Claude Fable 5.1" w:date="2026-10-29T06:19:50Z" w:id="9198">
+        <w:r>
+          <w:delText>A table of contents field is just one type of field, amongst many:</w:delText>
+        </w:r>
+      </w:del>
+      <w:ins w:author="Claude Fable 5.1" w:date="2026-10-29T06:19:50Z" w:id="9199">
+        <w:r>
+          <w:t>A table of contents field is just one type of field, amongst many (the Fields chapter above says what docx4j does with each):</w:t>
+        </w:r>
+      </w:ins>
     </w:p>
     <w:p>
       <w:pPr>
@@ -42313,9 +43330,423 @@
       <w:bookmarkEnd w:id="733"/>
     </w:p>
     <w:p>
-      <w:r>
-        <w:t>docx4j has quite good support for processing fields of type MERGEFIELD (ie the equivalent of doing a mailmerge operation from within Microsoft Word).</w:t>
-      </w:r>
+      <w:pPr>
+        <w:rPr>
+          <w:del w:author="Claude Fable 5.1" w:date="2026-10-29T06:19:50Z" w:id="9136"/>
+        </w:rPr>
+      </w:pPr>
+      <w:del w:author="Claude Fable 5.1" w:date="2026-10-29T06:19:50Z" w:id="9135">
+        <w:r>
+          <w:delText>docx4j has quite good support for processing fields of type MERGEFIELD (ie the equivalent of doing a mailmerge operation from within Microsoft Word).</w:delText>
+        </w:r>
+      </w:del>
+    </w:p>
+    <w:p>
+      <w:pPr>
+        <w:rPr>
+          <w:ins w:author="Claude Fable 5.1" w:date="2026-10-29T06:19:50Z" w:id="9150"/>
+        </w:rPr>
+      </w:pPr>
+      <w:ins w:author="Claude Fable 5.1" w:date="2026-10-29T06:19:50Z" w:id="9139">
+        <w:r>
+          <w:t xml:space="preserve">docx4j merges a document over records as Word's mail merge does.  </w:t>
+        </w:r>
+      </w:ins>
+      <w:ins w:author="Claude Fable 5.1" w:date="2026-10-29T06:19:50Z" w:id="9140">
+        <w:r>
+          <w:rPr>
+            <w:rFonts w:ascii="Consolas" w:hAnsi="Consolas"/>
+          </w:rPr>
+          <w:t>org.docx4j.model.fields.merge.MailMerger</w:t>
+        </w:r>
+      </w:ins>
+      <w:ins w:author="Claude Fable 5.1" w:date="2026-10-29T06:19:50Z" w:id="9141">
+        <w:r>
+          <w:t xml:space="preserve"> produces one copy of the document per record, as separate packages (</w:t>
+        </w:r>
+      </w:ins>
+      <w:ins w:author="Claude Fable 5.1" w:date="2026-10-29T06:19:50Z" w:id="9142">
+        <w:r>
+          <w:rPr>
+            <w:rFonts w:ascii="Consolas" w:hAnsi="Consolas"/>
+          </w:rPr>
+          <w:t>performMerge</w:t>
+        </w:r>
+      </w:ins>
+      <w:ins w:author="Claude Fable 5.1" w:date="2026-10-29T06:19:50Z" w:id="9143">
+        <w:r>
+          <w:t>) or concatenated into one (</w:t>
+        </w:r>
+      </w:ins>
+      <w:ins w:author="Claude Fable 5.1" w:date="2026-10-29T06:19:50Z" w:id="9144">
+        <w:r>
+          <w:rPr>
+            <w:rFonts w:ascii="Consolas" w:hAnsi="Consolas"/>
+          </w:rPr>
+          <w:t>getConsolidatedResultCrude</w:t>
+        </w:r>
+      </w:ins>
+      <w:ins w:author="Claude Fable 5.1" w:date="2026-10-29T06:19:50Z" w:id="9145">
+        <w:r>
+          <w:t xml:space="preserve">); </w:t>
+        </w:r>
+      </w:ins>
+      <w:ins w:author="Claude Fable 5.1" w:date="2026-10-29T06:19:50Z" w:id="9146">
+        <w:r>
+          <w:rPr>
+            <w:rFonts w:ascii="Consolas" w:hAnsi="Consolas"/>
+          </w:rPr>
+          <w:t>MailMergerWithNext</w:t>
+        </w:r>
+      </w:ins>
+      <w:ins w:author="Claude Fable 5.1" w:date="2026-10-29T06:19:50Z" w:id="9147">
+        <w:r>
+          <w:t xml:space="preserve"> is for labels, where NEXT fields put several records on one page.  A record is a </w:t>
+        </w:r>
+      </w:ins>
+      <w:ins w:author="Claude Fable 5.1" w:date="2026-10-29T06:19:50Z" w:id="9148">
+        <w:r>
+          <w:rPr>
+            <w:rFonts w:ascii="Consolas" w:hAnsi="Consolas"/>
+          </w:rPr>
+          <w:t>Map&lt;DataFieldName, String&gt;</w:t>
+        </w:r>
+      </w:ins>
+      <w:ins w:author="Claude Fable 5.1" w:date="2026-10-29T06:19:50Z" w:id="9149">
+        <w:r>
+          <w:t>, column name to value.</w:t>
+        </w:r>
+      </w:ins>
+    </w:p>
+    <w:p>
+      <w:pPr>
+        <w:rPr>
+          <w:ins w:author="Claude Fable 5.1" w:date="2026-10-29T06:19:50Z" w:id="9153"/>
+          <w:rFonts w:ascii="Consolas" w:hAnsi="Consolas"/>
+          <w:sz w:val="16"/>
+          <w:szCs w:val="16"/>
+        </w:rPr>
+      </w:pPr>
+      <w:ins w:author="Claude Fable 5.1" w:date="2026-10-29T06:19:50Z" w:id="9151">
+        <w:r>
+          <w:rPr>
+            <w:rFonts w:ascii="Consolas" w:hAnsi="Consolas"/>
+            <w:sz w:val="16"/>
+            <w:szCs w:val="16"/>
+          </w:rPr>
+          <w:tab/>
+        </w:r>
+      </w:ins>
+      <w:ins w:author="Claude Fable 5.1" w:date="2026-10-29T06:19:50Z" w:id="9152">
+        <w:r>
+          <w:rPr>
+            <w:rFonts w:ascii="Consolas" w:hAnsi="Consolas"/>
+            <w:sz w:val="16"/>
+            <w:szCs w:val="16"/>
+          </w:rPr>
+          <w:t>	List&lt;Map&lt;DataFieldName, String&gt;&gt; data = ...;</w:t>
+        </w:r>
+      </w:ins>
+    </w:p>
+    <w:p>
+      <w:pPr>
+        <w:rPr>
+          <w:ins w:author="Claude Fable 5.1" w:date="2026-10-29T06:19:50Z" w:id="9156"/>
+          <w:rFonts w:ascii="Consolas" w:hAnsi="Consolas"/>
+          <w:sz w:val="16"/>
+          <w:szCs w:val="16"/>
+        </w:rPr>
+      </w:pPr>
+      <w:ins w:author="Claude Fable 5.1" w:date="2026-10-29T06:19:50Z" w:id="9154">
+        <w:r>
+          <w:rPr>
+            <w:rFonts w:ascii="Consolas" w:hAnsi="Consolas"/>
+            <w:sz w:val="16"/>
+            <w:szCs w:val="16"/>
+          </w:rPr>
+          <w:tab/>
+        </w:r>
+      </w:ins>
+      <w:ins w:author="Claude Fable 5.1" w:date="2026-10-29T06:19:50Z" w:id="9155">
+        <w:r>
+          <w:rPr>
+            <w:rFonts w:ascii="Consolas" w:hAnsi="Consolas"/>
+            <w:sz w:val="16"/>
+            <w:szCs w:val="16"/>
+          </w:rPr>
+          <w:t>	WordprocessingMLPackage merged = new MailMerger(wordMLPackage).getConsolidatedResultCrude(data, false);</w:t>
+        </w:r>
+      </w:ins>
+    </w:p>
+    <w:p>
+      <w:pPr>
+        <w:rPr>
+          <w:ins w:author="Claude Fable 5.1" w:date="2026-10-29T06:19:50Z" w:id="9158"/>
+        </w:rPr>
+      </w:pPr>
+      <w:ins w:author="Claude Fable 5.1" w:date="2026-10-29T06:19:50Z" w:id="9157">
+        <w:r>
+          <w:t>What a merge evaluates, measured against Word 365's own merge:</w:t>
+        </w:r>
+      </w:ins>
+    </w:p>
+    <w:p>
+      <w:pPr>
+        <w:pStyle w:val="ListParagraph"/>
+        <w:numPr>
+          <w:ilvl w:val="0"/>
+          <w:numId w:val="51"/>
+        </w:numPr>
+        <w:contextualSpacing w:val="true"/>
+        <w:rPr>
+          <w:ins w:author="Claude Fable 5.1" w:date="2026-10-29T06:19:50Z" w:id="9166"/>
+        </w:rPr>
+      </w:pPr>
+      <w:ins w:author="Claude Fable 5.1" w:date="2026-10-29T06:19:50Z" w:id="9159">
+        <w:r>
+          <w:t xml:space="preserve">MERGEFIELD, with </w:t>
+        </w:r>
+      </w:ins>
+      <w:ins w:author="Claude Fable 5.1" w:date="2026-10-29T06:19:50Z" w:id="9160">
+        <w:r>
+          <w:rPr>
+            <w:rFonts w:ascii="Consolas" w:hAnsi="Consolas"/>
+          </w:rPr>
+          <w:t>\b</w:t>
+        </w:r>
+      </w:ins>
+      <w:ins w:author="Claude Fable 5.1" w:date="2026-10-29T06:19:50Z" w:id="9161">
+        <w:r>
+          <w:t xml:space="preserve"> and </w:t>
+        </w:r>
+      </w:ins>
+      <w:ins w:author="Claude Fable 5.1" w:date="2026-10-29T06:19:50Z" w:id="9162">
+        <w:r>
+          <w:rPr>
+            <w:rFonts w:ascii="Consolas" w:hAnsi="Consolas"/>
+          </w:rPr>
+          <w:t>\f</w:t>
+        </w:r>
+      </w:ins>
+      <w:ins w:author="Claude Fable 5.1" w:date="2026-10-29T06:19:50Z" w:id="9163">
+        <w:r>
+          <w:t xml:space="preserve"> (the text before and after a value) and the </w:t>
+        </w:r>
+      </w:ins>
+      <w:ins w:author="Claude Fable 5.1" w:date="2026-10-29T06:19:50Z" w:id="9164">
+        <w:r>
+          <w:rPr>
+            <w:rFonts w:ascii="Consolas" w:hAnsi="Consolas"/>
+          </w:rPr>
+          <w:t>\*</w:t>
+        </w:r>
+      </w:ins>
+      <w:ins w:author="Claude Fable 5.1" w:date="2026-10-29T06:19:50Z" w:id="9165">
+        <w:r>
+          <w:t xml:space="preserve"> formats; a field naming no column merges as nothing.</w:t>
+        </w:r>
+      </w:ins>
+    </w:p>
+    <w:p>
+      <w:pPr>
+        <w:pStyle w:val="ListParagraph"/>
+        <w:numPr>
+          <w:ilvl w:val="0"/>
+          <w:numId w:val="51"/>
+        </w:numPr>
+        <w:contextualSpacing w:val="true"/>
+        <w:rPr>
+          <w:ins w:author="Claude Fable 5.1" w:date="2026-10-29T06:19:50Z" w:id="9168"/>
+        </w:rPr>
+      </w:pPr>
+      <w:ins w:author="Claude Fable 5.1" w:date="2026-10-29T06:19:50Z" w:id="9167">
+        <w:r>
+          <w:t>NEXT and NEXTIF pull the next record into the same letter; SKIPIF skips a record; MERGEREC and MERGESEQ count as Word counts (a skipped or pulled record is not a letter).</w:t>
+        </w:r>
+      </w:ins>
+    </w:p>
+    <w:p>
+      <w:pPr>
+        <w:pStyle w:val="ListParagraph"/>
+        <w:numPr>
+          <w:ilvl w:val="0"/>
+          <w:numId w:val="51"/>
+        </w:numPr>
+        <w:contextualSpacing w:val="true"/>
+        <w:rPr>
+          <w:ins w:author="Claude Fable 5.1" w:date="2026-10-29T06:19:50Z" w:id="9174"/>
+        </w:rPr>
+      </w:pPr>
+      <w:ins w:author="Claude Fable 5.1" w:date="2026-10-29T06:19:50Z" w:id="9169">
+        <w:r>
+          <w:t>SET, ASK and FILLIN: an ASK or FILLIN takes the answer you put in the context (</w:t>
+        </w:r>
+      </w:ins>
+      <w:ins w:author="Claude Fable 5.1" w:date="2026-10-29T06:19:50Z" w:id="9170">
+        <w:r>
+          <w:rPr>
+            <w:rFonts w:ascii="Consolas" w:hAnsi="Consolas"/>
+          </w:rPr>
+          <w:t>merger.getFieldContext().answers()</w:t>
+        </w:r>
+      </w:ins>
+      <w:ins w:author="Claude Fable 5.1" w:date="2026-10-29T06:19:50Z" w:id="9171">
+        <w:r>
+          <w:t xml:space="preserve">), else its </w:t>
+        </w:r>
+      </w:ins>
+      <w:ins w:author="Claude Fable 5.1" w:date="2026-10-29T06:19:50Z" w:id="9172">
+        <w:r>
+          <w:rPr>
+            <w:rFonts w:ascii="Consolas" w:hAnsi="Consolas"/>
+          </w:rPr>
+          <w:t>\d</w:t>
+        </w:r>
+      </w:ins>
+      <w:ins w:author="Claude Fable 5.1" w:date="2026-10-29T06:19:50Z" w:id="9173">
+        <w:r>
+          <w:t xml:space="preserve"> default; SET and ASK define their bookmarks for the REF and IF fields that follow.</w:t>
+        </w:r>
+      </w:ins>
+    </w:p>
+    <w:p>
+      <w:pPr>
+        <w:pStyle w:val="ListParagraph"/>
+        <w:numPr>
+          <w:ilvl w:val="0"/>
+          <w:numId w:val="51"/>
+        </w:numPr>
+        <w:contextualSpacing w:val="true"/>
+        <w:rPr>
+          <w:ins w:author="Claude Fable 5.1" w:date="2026-10-29T06:19:50Z" w:id="9178"/>
+        </w:rPr>
+      </w:pPr>
+      <w:ins w:author="Claude Fable 5.1" w:date="2026-10-29T06:19:50Z" w:id="9175">
+        <w:r>
+          <w:t xml:space="preserve">IF, COMPARE, REF and </w:t>
+        </w:r>
+      </w:ins>
+      <w:ins w:author="Claude Fable 5.1" w:date="2026-10-29T06:19:50Z" w:id="9176">
+        <w:r>
+          <w:rPr>
+            <w:rFonts w:ascii="Consolas" w:hAnsi="Consolas"/>
+          </w:rPr>
+          <w:t>=</w:t>
+        </w:r>
+      </w:ins>
+      <w:ins w:author="Claude Fable 5.1" w:date="2026-10-29T06:19:50Z" w:id="9177">
+        <w:r>
+          <w:t xml:space="preserve"> over merge fields.</w:t>
+        </w:r>
+      </w:ins>
+    </w:p>
+    <w:p>
+      <w:pPr>
+        <w:pStyle w:val="ListParagraph"/>
+        <w:numPr>
+          <w:ilvl w:val="0"/>
+          <w:numId w:val="51"/>
+        </w:numPr>
+        <w:contextualSpacing w:val="true"/>
+        <w:rPr>
+          <w:ins w:author="Claude Fable 5.1" w:date="2026-10-29T06:19:50Z" w:id="9188"/>
+        </w:rPr>
+      </w:pPr>
+      <w:ins w:author="Claude Fable 5.1" w:date="2026-10-29T06:19:50Z" w:id="9179">
+        <w:r>
+          <w:t xml:space="preserve">ADDRESSBLOCK and GREETINGLINE, composed from their </w:t>
+        </w:r>
+      </w:ins>
+      <w:ins w:author="Claude Fable 5.1" w:date="2026-10-29T06:19:50Z" w:id="9180">
+        <w:r>
+          <w:rPr>
+            <w:rFonts w:ascii="Consolas" w:hAnsi="Consolas"/>
+          </w:rPr>
+          <w:t>\f</w:t>
+        </w:r>
+      </w:ins>
+      <w:ins w:author="Claude Fable 5.1" w:date="2026-10-29T06:19:50Z" w:id="9181">
+        <w:r>
+          <w:t xml:space="preserve"> formats as Word composes them (a token prints only where its field has a value; Word's greeting fallbacks), the columns found by Word's address-field names and their usual spellings (First Name, First_Name) or by the document's own </w:t>
+        </w:r>
+      </w:ins>
+      <w:ins w:author="Claude Fable 5.1" w:date="2026-10-29T06:19:50Z" w:id="9182">
+        <w:r>
+          <w:rPr>
+            <w:rFonts w:ascii="Consolas" w:hAnsi="Consolas"/>
+          </w:rPr>
+          <w:t>w:odso</w:t>
+        </w:r>
+      </w:ins>
+      <w:ins w:author="Claude Fable 5.1" w:date="2026-10-29T06:19:50Z" w:id="9183">
+        <w:r>
+          <w:t xml:space="preserve"> mapping; </w:t>
+        </w:r>
+      </w:ins>
+      <w:ins w:author="Claude Fable 5.1" w:date="2026-10-29T06:19:50Z" w:id="9184">
+        <w:r>
+          <w:rPr>
+            <w:rFonts w:ascii="Consolas" w:hAnsi="Consolas"/>
+          </w:rPr>
+          <w:t>\c</w:t>
+        </w:r>
+      </w:ins>
+      <w:ins w:author="Claude Fable 5.1" w:date="2026-10-29T06:19:50Z" w:id="9185">
+        <w:r>
+          <w:t xml:space="preserve"> and </w:t>
+        </w:r>
+      </w:ins>
+      <w:ins w:author="Claude Fable 5.1" w:date="2026-10-29T06:19:50Z" w:id="9186">
+        <w:r>
+          <w:rPr>
+            <w:rFonts w:ascii="Consolas" w:hAnsi="Consolas"/>
+          </w:rPr>
+          <w:t>\e</w:t>
+        </w:r>
+      </w:ins>
+      <w:ins w:author="Claude Fable 5.1" w:date="2026-10-29T06:19:50Z" w:id="9187">
+        <w:r>
+          <w:t xml:space="preserve"> decide whether the country prints.</w:t>
+        </w:r>
+      </w:ins>
+    </w:p>
+    <w:p>
+      <w:pPr>
+        <w:rPr>
+          <w:ins w:author="Claude Fable 5.1" w:date="2026-10-29T06:19:50Z" w:id="9194"/>
+        </w:rPr>
+      </w:pPr>
+      <w:ins w:author="Claude Fable 5.1" w:date="2026-10-29T06:19:50Z" w:id="9189">
+        <w:r>
+          <w:t xml:space="preserve">Word's merge unlinks the fields to their text, and docx4j does the same by default.  </w:t>
+        </w:r>
+      </w:ins>
+      <w:ins w:author="Claude Fable 5.1" w:date="2026-10-29T06:19:50Z" w:id="9190">
+        <w:r>
+          <w:rPr>
+            <w:rFonts w:ascii="Consolas" w:hAnsi="Consolas"/>
+          </w:rPr>
+          <w:t>MailMerger.setMERGEFIELDInOutput(OutputField.KEEP_MERGEFIELD)</w:t>
+        </w:r>
+      </w:ins>
+      <w:ins w:author="Claude Fable 5.1" w:date="2026-10-29T06:19:50Z" w:id="9191">
+        <w:r>
+          <w:t xml:space="preserve"> keeps the merge fields, so the output can be merged again; </w:t>
+        </w:r>
+      </w:ins>
+      <w:ins w:author="Claude Fable 5.1" w:date="2026-10-29T06:19:50Z" w:id="9192">
+        <w:r>
+          <w:rPr>
+            <w:rFonts w:ascii="Consolas" w:hAnsi="Consolas"/>
+          </w:rPr>
+          <w:t>AS_FORMTEXT_REGULAR</w:t>
+        </w:r>
+      </w:ins>
+      <w:ins w:author="Claude Fable 5.1" w:date="2026-10-29T06:19:50Z" w:id="9193">
+        <w:r>
+          <w:t xml:space="preserve"> turns each MERGEFIELD into a FORMTEXT form field.</w:t>
+        </w:r>
+      </w:ins>
     </w:p>
     <w:p>
       <w:pPr>
@@ -54635,6 +56066,339 @@
       </w:pPr>
       <w:rPr>
         <w:rFonts w:hint="default" w:ascii="Wingdings" w:hAnsi="Wingdings"/>
+      </w:rPr>
+    </w:lvl>
+  </w:abstractNum>
+  <w:abstractNum w:abstractNumId="50">
+    <w:multiLevelType w:val="hybridMultilevel"/>
+    <w:lvl w:ilvl="0">
+      <w:start w:val="1"/>
+      <w:numFmt w:val="bullet"/>
+      <w:lvlText w:val=""/>
+      <w:lvlJc w:val="left"/>
+      <w:pPr>
+        <w:ind w:left="720" w:hanging="360"/>
+      </w:pPr>
+      <w:rPr>
+        <w:rFonts w:ascii="Symbol" w:hAnsi="Symbol"/>
+      </w:rPr>
+    </w:lvl>
+    <w:lvl w:ilvl="1">
+      <w:start w:val="1"/>
+      <w:numFmt w:val="bullet"/>
+      <w:lvlText w:val="o"/>
+      <w:lvlJc w:val="left"/>
+      <w:pPr>
+        <w:ind w:left="1440" w:hanging="360"/>
+      </w:pPr>
+      <w:rPr>
+        <w:rFonts w:ascii="Courier New" w:hAnsi="Courier New"/>
+      </w:rPr>
+    </w:lvl>
+    <w:lvl w:ilvl="2">
+      <w:start w:val="1"/>
+      <w:numFmt w:val="bullet"/>
+      <w:lvlText w:val=""/>
+      <w:lvlJc w:val="left"/>
+      <w:pPr>
+        <w:ind w:left="2160" w:hanging="360"/>
+      </w:pPr>
+      <w:rPr>
+        <w:rFonts w:ascii="Wingdings" w:hAnsi="Wingdings"/>
+      </w:rPr>
+    </w:lvl>
+    <w:lvl w:ilvl="3">
+      <w:start w:val="1"/>
+      <w:numFmt w:val="bullet"/>
+      <w:lvlText w:val=""/>
+      <w:lvlJc w:val="left"/>
+      <w:pPr>
+        <w:ind w:left="2880" w:hanging="360"/>
+      </w:pPr>
+      <w:rPr>
+        <w:rFonts w:ascii="Symbol" w:hAnsi="Symbol"/>
+      </w:rPr>
+    </w:lvl>
+    <w:lvl w:ilvl="4">
+      <w:start w:val="1"/>
+      <w:numFmt w:val="bullet"/>
+      <w:lvlText w:val="o"/>
+      <w:lvlJc w:val="left"/>
+      <w:pPr>
+        <w:ind w:left="3600" w:hanging="360"/>
+      </w:pPr>
+      <w:rPr>
+        <w:rFonts w:ascii="Courier New" w:hAnsi="Courier New"/>
+      </w:rPr>
+    </w:lvl>
+    <w:lvl w:ilvl="5">
+      <w:start w:val="1"/>
+      <w:numFmt w:val="bullet"/>
+      <w:lvlText w:val=""/>
+      <w:lvlJc w:val="left"/>
+      <w:pPr>
+        <w:ind w:left="4320" w:hanging="360"/>
+      </w:pPr>
+      <w:rPr>
+        <w:rFonts w:ascii="Wingdings" w:hAnsi="Wingdings"/>
+      </w:rPr>
+    </w:lvl>
+    <w:lvl w:ilvl="6">
+      <w:start w:val="1"/>
+      <w:numFmt w:val="bullet"/>
+      <w:lvlText w:val=""/>
+      <w:lvlJc w:val="left"/>
+      <w:pPr>
+        <w:ind w:left="5040" w:hanging="360"/>
+      </w:pPr>
+      <w:rPr>
+        <w:rFonts w:ascii="Symbol" w:hAnsi="Symbol"/>
+      </w:rPr>
+    </w:lvl>
+    <w:lvl w:ilvl="7">
+      <w:start w:val="1"/>
+      <w:numFmt w:val="bullet"/>
+      <w:lvlText w:val="o"/>
+      <w:lvlJc w:val="left"/>
+      <w:pPr>
+        <w:ind w:left="5760" w:hanging="360"/>
+      </w:pPr>
+      <w:rPr>
+        <w:rFonts w:ascii="Courier New" w:hAnsi="Courier New"/>
+      </w:rPr>
+    </w:lvl>
+    <w:lvl w:ilvl="8">
+      <w:start w:val="1"/>
+      <w:numFmt w:val="bullet"/>
+      <w:lvlText w:val=""/>
+      <w:lvlJc w:val="left"/>
+      <w:pPr>
+        <w:ind w:left="6480" w:hanging="360"/>
+      </w:pPr>
+      <w:rPr>
+        <w:rFonts w:ascii="Wingdings" w:hAnsi="Wingdings"/>
+      </w:rPr>
+    </w:lvl>
+  </w:abstractNum>
+  <w:abstractNum w:abstractNumId="51">
+    <w:multiLevelType w:val="hybridMultilevel"/>
+    <w:lvl w:ilvl="0">
+      <w:start w:val="1"/>
+      <w:numFmt w:val="bullet"/>
+      <w:lvlText w:val=""/>
+      <w:lvlJc w:val="left"/>
+      <w:pPr>
+        <w:ind w:left="720" w:hanging="360"/>
+      </w:pPr>
+      <w:rPr>
+        <w:rFonts w:ascii="Symbol" w:hAnsi="Symbol"/>
+      </w:rPr>
+    </w:lvl>
+    <w:lvl w:ilvl="1">
+      <w:start w:val="1"/>
+      <w:numFmt w:val="bullet"/>
+      <w:lvlText w:val="o"/>
+      <w:lvlJc w:val="left"/>
+      <w:pPr>
+        <w:ind w:left="1440" w:hanging="360"/>
+      </w:pPr>
+      <w:rPr>
+        <w:rFonts w:ascii="Courier New" w:hAnsi="Courier New"/>
+      </w:rPr>
+    </w:lvl>
+    <w:lvl w:ilvl="2">
+      <w:start w:val="1"/>
+      <w:numFmt w:val="bullet"/>
+      <w:lvlText w:val=""/>
+      <w:lvlJc w:val="left"/>
+      <w:pPr>
+        <w:ind w:left="2160" w:hanging="360"/>
+      </w:pPr>
+      <w:rPr>
+        <w:rFonts w:ascii="Wingdings" w:hAnsi="Wingdings"/>
+      </w:rPr>
+    </w:lvl>
+    <w:lvl w:ilvl="3">
+      <w:start w:val="1"/>
+      <w:numFmt w:val="bullet"/>
+      <w:lvlText w:val=""/>
+      <w:lvlJc w:val="left"/>
+      <w:pPr>
+        <w:ind w:left="2880" w:hanging="360"/>
+      </w:pPr>
+      <w:rPr>
+        <w:rFonts w:ascii="Symbol" w:hAnsi="Symbol"/>
+      </w:rPr>
+    </w:lvl>
+    <w:lvl w:ilvl="4">
+      <w:start w:val="1"/>
+      <w:numFmt w:val="bullet"/>
+      <w:lvlText w:val="o"/>
+      <w:lvlJc w:val="left"/>
+      <w:pPr>
+        <w:ind w:left="3600" w:hanging="360"/>
+      </w:pPr>
+      <w:rPr>
+        <w:rFonts w:ascii="Courier New" w:hAnsi="Courier New"/>
+      </w:rPr>
+    </w:lvl>
+    <w:lvl w:ilvl="5">
+      <w:start w:val="1"/>
+      <w:numFmt w:val="bullet"/>
+      <w:lvlText w:val=""/>
+      <w:lvlJc w:val="left"/>
+      <w:pPr>
+        <w:ind w:left="4320" w:hanging="360"/>
+      </w:pPr>
+      <w:rPr>
+        <w:rFonts w:ascii="Wingdings" w:hAnsi="Wingdings"/>
+      </w:rPr>
+    </w:lvl>
+    <w:lvl w:ilvl="6">
+      <w:start w:val="1"/>
+      <w:numFmt w:val="bullet"/>
+      <w:lvlText w:val=""/>
+      <w:lvlJc w:val="left"/>
+      <w:pPr>
+        <w:ind w:left="5040" w:hanging="360"/>
+      </w:pPr>
+      <w:rPr>
+        <w:rFonts w:ascii="Symbol" w:hAnsi="Symbol"/>
+      </w:rPr>
+    </w:lvl>
+    <w:lvl w:ilvl="7">
+      <w:start w:val="1"/>
+      <w:numFmt w:val="bullet"/>
+      <w:lvlText w:val="o"/>
+      <w:lvlJc w:val="left"/>
+      <w:pPr>
+        <w:ind w:left="5760" w:hanging="360"/>
+      </w:pPr>
+      <w:rPr>
+        <w:rFonts w:ascii="Courier New" w:hAnsi="Courier New"/>
+      </w:rPr>
+    </w:lvl>
+    <w:lvl w:ilvl="8">
+      <w:start w:val="1"/>
+      <w:numFmt w:val="bullet"/>
+      <w:lvlText w:val=""/>
+      <w:lvlJc w:val="left"/>
+      <w:pPr>
+        <w:ind w:left="6480" w:hanging="360"/>
+      </w:pPr>
+      <w:rPr>
+        <w:rFonts w:ascii="Wingdings" w:hAnsi="Wingdings"/>
+      </w:rPr>
+    </w:lvl>
+  </w:abstractNum>
+  <w:abstractNum w:abstractNumId="52">
+    <w:multiLevelType w:val="hybridMultilevel"/>
+    <w:lvl w:ilvl="0">
+      <w:start w:val="1"/>
+      <w:numFmt w:val="bullet"/>
+      <w:lvlText w:val=""/>
+      <w:lvlJc w:val="left"/>
+      <w:pPr>
+        <w:ind w:left="720" w:hanging="360"/>
+      </w:pPr>
+      <w:rPr>
+        <w:rFonts w:ascii="Symbol" w:hAnsi="Symbol"/>
+      </w:rPr>
+    </w:lvl>
+    <w:lvl w:ilvl="1">
+      <w:start w:val="1"/>
+      <w:numFmt w:val="bullet"/>
+      <w:lvlText w:val="o"/>
+      <w:lvlJc w:val="left"/>
+      <w:pPr>
+        <w:ind w:left="1440" w:hanging="360"/>
+      </w:pPr>
+      <w:rPr>
+        <w:rFonts w:ascii="Courier New" w:hAnsi="Courier New"/>
+      </w:rPr>
+    </w:lvl>
+    <w:lvl w:ilvl="2">
+      <w:start w:val="1"/>
+      <w:numFmt w:val="bullet"/>
+      <w:lvlText w:val=""/>
+      <w:lvlJc w:val="left"/>
+      <w:pPr>
+        <w:ind w:left="2160" w:hanging="360"/>
+      </w:pPr>
+      <w:rPr>
+        <w:rFonts w:ascii="Wingdings" w:hAnsi="Wingdings"/>
+      </w:rPr>
+    </w:lvl>
+    <w:lvl w:ilvl="3">
+      <w:start w:val="1"/>
+      <w:numFmt w:val="bullet"/>
+      <w:lvlText w:val=""/>
+      <w:lvlJc w:val="left"/>
+      <w:pPr>
+        <w:ind w:left="2880" w:hanging="360"/>
+      </w:pPr>
+      <w:rPr>
+        <w:rFonts w:ascii="Symbol" w:hAnsi="Symbol"/>
+      </w:rPr>
+    </w:lvl>
+    <w:lvl w:ilvl="4">
+      <w:start w:val="1"/>
+      <w:numFmt w:val="bullet"/>
+      <w:lvlText w:val="o"/>
+      <w:lvlJc w:val="left"/>
+      <w:pPr>
+        <w:ind w:left="3600" w:hanging="360"/>
+      </w:pPr>
+      <w:rPr>
+        <w:rFonts w:ascii="Courier New" w:hAnsi="Courier New"/>
+      </w:rPr>
+    </w:lvl>
+    <w:lvl w:ilvl="5">
+      <w:start w:val="1"/>
+      <w:numFmt w:val="bullet"/>
+      <w:lvlText w:val=""/>
+      <w:lvlJc w:val="left"/>
+      <w:pPr>
+        <w:ind w:left="4320" w:hanging="360"/>
+      </w:pPr>
+      <w:rPr>
+        <w:rFonts w:ascii="Wingdings" w:hAnsi="Wingdings"/>
+      </w:rPr>
+    </w:lvl>
+    <w:lvl w:ilvl="6">
+      <w:start w:val="1"/>
+      <w:numFmt w:val="bullet"/>
+      <w:lvlText w:val=""/>
+      <w:lvlJc w:val="left"/>
+      <w:pPr>
+        <w:ind w:left="5040" w:hanging="360"/>
+      </w:pPr>
+      <w:rPr>
+        <w:rFonts w:ascii="Symbol" w:hAnsi="Symbol"/>
+      </w:rPr>
+    </w:lvl>
+    <w:lvl w:ilvl="7">
+      <w:start w:val="1"/>
+      <w:numFmt w:val="bullet"/>
+      <w:lvlText w:val="o"/>
+      <w:lvlJc w:val="left"/>
+      <w:pPr>
+        <w:ind w:left="5760" w:hanging="360"/>
+      </w:pPr>
+      <w:rPr>
+        <w:rFonts w:ascii="Courier New" w:hAnsi="Courier New"/>
+      </w:rPr>
+    </w:lvl>
+    <w:lvl w:ilvl="8">
+      <w:start w:val="1"/>
+      <w:numFmt w:val="bullet"/>
+      <w:lvlText w:val=""/>
+      <w:lvlJc w:val="left"/>
+      <w:pPr>
+        <w:ind w:left="6480" w:hanging="360"/>
+      </w:pPr>
+      <w:rPr>
+        <w:rFonts w:ascii="Wingdings" w:hAnsi="Wingdings"/>
       </w:rPr>
     </w:lvl>
   </w:abstractNum>
@@ -54784,6 +56548,15 @@
   </w:num>
   <w:num w:numId="49">
     <w:abstractNumId w:val="49"/>
+  </w:num>
+  <w:num w:numId="50">
+    <w:abstractNumId w:val="50"/>
+  </w:num>
+  <w:num w:numId="51">
+    <w:abstractNumId w:val="51"/>
+  </w:num>
+  <w:num w:numId="52">
+    <w:abstractNumId w:val="52"/>
   </w:num>
   <w:numIdMacAtCleanup w:val="26"/>
 </w:numbering>

</xml_diff>